<commit_message>
docs: update README with complete institutional metadata and structure
</commit_message>
<xml_diff>
--- a/docs/FJ1656_MañanáSantana_U01.LAB02.docx
+++ b/docs/FJ1656_MañanáSantana_U01.LAB02.docx
@@ -124,6 +124,7 @@
             <w:dataBinding w:prefixMappings="xmlns:ns0='http://purl.org/dc/elements/1.1/' xmlns:ns1='http://schemas.openxmlformats.org/package/2006/metadata/core-properties' " w:xpath="/ns1:coreProperties[1]/ns0:title[1]" w:storeItemID="{6C3C8BC8-F283-45AE-878A-BAB7291924A1}"/>
             <w:text/>
           </w:sdtPr>
+          <w:sdtEndPr/>
           <w:sdtContent>
             <w:p>
               <w:pPr>
@@ -185,6 +186,7 @@
             <w:dataBinding w:prefixMappings="xmlns:ns0='http://purl.org/dc/elements/1.1/' xmlns:ns1='http://schemas.openxmlformats.org/package/2006/metadata/core-properties' " w:xpath="/ns1:coreProperties[1]/ns0:subject[1]" w:storeItemID="{6C3C8BC8-F283-45AE-878A-BAB7291924A1}"/>
             <w:text/>
           </w:sdtPr>
+          <w:sdtEndPr/>
           <w:sdtContent>
             <w:p>
               <w:pPr>
@@ -322,6 +324,7 @@
                                     <w:calendar w:val="gregorian"/>
                                   </w:date>
                                 </w:sdtPr>
+                                <w:sdtEndPr/>
                                 <w:sdtContent>
                                   <w:p>
                                     <w:pPr>
@@ -370,6 +373,7 @@
                                     <w:dataBinding w:prefixMappings="xmlns:ns0='http://schemas.openxmlformats.org/officeDocument/2006/extended-properties' " w:xpath="/ns0:Properties[1]/ns0:Company[1]" w:storeItemID="{6668398D-A668-4E3E-A5EB-62B293D839F1}"/>
                                     <w:text/>
                                   </w:sdtPr>
+                                  <w:sdtEndPr/>
                                   <w:sdtContent>
                                     <w:r>
                                       <w:rPr>
@@ -2899,6 +2903,41 @@
         </w:rPr>
         <w:t xml:space="preserve">Enlace Repositorio </w:t>
       </w:r>
+      <w:r>
+        <w:rPr>
+          <w:rFonts w:ascii="Times New Roman" w:hAnsi="Times New Roman" w:cs="Times New Roman"/>
+          <w:b/>
+          <w:bCs/>
+          <w:lang w:val="es-DO"/>
+        </w:rPr>
+        <w:t xml:space="preserve">: </w:t>
+      </w:r>
+      <w:hyperlink r:id="rId18" w:history="1">
+        <w:r>
+          <w:rPr>
+            <w:rStyle w:val="Hipervnculo"/>
+            <w:rFonts w:ascii="Times New Roman" w:hAnsi="Times New Roman" w:cs="Times New Roman"/>
+            <w:b/>
+            <w:bCs/>
+            <w:lang w:val="es-DO"/>
+          </w:rPr>
+          <w:t>https://github.com/Rickymjms/INFO8239_U01_FJ1656.git</w:t>
+        </w:r>
+      </w:hyperlink>
+    </w:p>
+    <w:p>
+      <w:pPr>
+        <w:tabs>
+          <w:tab w:val="left" w:pos="5364"/>
+        </w:tabs>
+        <w:jc w:val="both"/>
+        <w:rPr>
+          <w:rFonts w:ascii="Times New Roman" w:hAnsi="Times New Roman" w:cs="Times New Roman"/>
+          <w:b/>
+          <w:bCs/>
+          <w:lang w:val="es-DO"/>
+        </w:rPr>
+      </w:pPr>
     </w:p>
     <w:p>
       <w:pPr>
@@ -2952,7 +2991,7 @@
                     <pic:cNvPicPr/>
                   </pic:nvPicPr>
                   <pic:blipFill>
-                    <a:blip r:embed="rId18"/>
+                    <a:blip r:embed="rId19"/>
                     <a:stretch>
                       <a:fillRect/>
                     </a:stretch>
@@ -3010,7 +3049,7 @@
                     <pic:cNvPicPr/>
                   </pic:nvPicPr>
                   <pic:blipFill>
-                    <a:blip r:embed="rId19"/>
+                    <a:blip r:embed="rId20"/>
                     <a:stretch>
                       <a:fillRect/>
                     </a:stretch>
@@ -3083,7 +3122,7 @@
                     <pic:cNvPicPr/>
                   </pic:nvPicPr>
                   <pic:blipFill>
-                    <a:blip r:embed="rId20"/>
+                    <a:blip r:embed="rId21"/>
                     <a:stretch>
                       <a:fillRect/>
                     </a:stretch>
@@ -3155,7 +3194,7 @@
                     <pic:cNvPicPr/>
                   </pic:nvPicPr>
                   <pic:blipFill>
-                    <a:blip r:embed="rId21"/>
+                    <a:blip r:embed="rId22"/>
                     <a:stretch>
                       <a:fillRect/>
                     </a:stretch>
@@ -3214,7 +3253,7 @@
                     <pic:cNvPicPr/>
                   </pic:nvPicPr>
                   <pic:blipFill>
-                    <a:blip r:embed="rId22"/>
+                    <a:blip r:embed="rId23"/>
                     <a:stretch>
                       <a:fillRect/>
                     </a:stretch>
@@ -3272,7 +3311,7 @@
                     <pic:cNvPicPr/>
                   </pic:nvPicPr>
                   <pic:blipFill>
-                    <a:blip r:embed="rId23"/>
+                    <a:blip r:embed="rId24"/>
                     <a:stretch>
                       <a:fillRect/>
                     </a:stretch>
@@ -3331,7 +3370,7 @@
                     <pic:cNvPicPr/>
                   </pic:nvPicPr>
                   <pic:blipFill>
-                    <a:blip r:embed="rId24"/>
+                    <a:blip r:embed="rId25"/>
                     <a:stretch>
                       <a:fillRect/>
                     </a:stretch>
@@ -3370,6 +3409,7 @@
           <w:rFonts w:ascii="Times New Roman" w:hAnsi="Times New Roman" w:cs="Times New Roman"/>
           <w:b/>
           <w:bCs/>
+          <w:noProof/>
           <w:lang w:val="es-DO"/>
         </w:rPr>
         <w:drawing>
@@ -3388,7 +3428,7 @@
                     <pic:cNvPicPr/>
                   </pic:nvPicPr>
                   <pic:blipFill>
-                    <a:blip r:embed="rId25"/>
+                    <a:blip r:embed="rId26"/>
                     <a:stretch>
                       <a:fillRect/>
                     </a:stretch>
@@ -3453,6 +3493,7 @@
       <w:r>
         <w:rPr>
           <w:rFonts w:ascii="Times New Roman" w:hAnsi="Times New Roman" w:cs="Times New Roman"/>
+          <w:noProof/>
           <w:lang w:val="es-DO"/>
         </w:rPr>
         <w:lastRenderedPageBreak/>
@@ -3472,7 +3513,7 @@
                     <pic:cNvPicPr/>
                   </pic:nvPicPr>
                   <pic:blipFill>
-                    <a:blip r:embed="rId26"/>
+                    <a:blip r:embed="rId27"/>
                     <a:stretch>
                       <a:fillRect/>
                     </a:stretch>
@@ -3513,6 +3554,7 @@
       <w:r>
         <w:rPr>
           <w:rFonts w:ascii="Times New Roman" w:hAnsi="Times New Roman" w:cs="Times New Roman"/>
+          <w:noProof/>
           <w:lang w:val="es-DO"/>
         </w:rPr>
         <w:drawing>
@@ -3531,7 +3573,7 @@
                     <pic:cNvPicPr/>
                   </pic:nvPicPr>
                   <pic:blipFill>
-                    <a:blip r:embed="rId27"/>
+                    <a:blip r:embed="rId28"/>
                     <a:stretch>
                       <a:fillRect/>
                     </a:stretch>
@@ -3562,7 +3604,7 @@
       </w:pPr>
     </w:p>
     <w:sectPr>
-      <w:headerReference w:type="first" r:id="rId28"/>
+      <w:headerReference w:type="first" r:id="rId29"/>
       <w:pgSz w:w="12240" w:h="15840" w:code="1"/>
       <w:pgMar w:top="1440" w:right="1440" w:bottom="1440" w:left="1440" w:header="709" w:footer="709" w:gutter="0"/>
       <w:pgNumType w:start="0"/>
@@ -5608,6 +5650,7 @@
     <w:rsid w:val="00572D9D"/>
     <w:rsid w:val="00597A15"/>
     <w:rsid w:val="00601CC6"/>
+    <w:rsid w:val="006031EA"/>
     <w:rsid w:val="00630EA3"/>
     <w:rsid w:val="00653EC9"/>
     <w:rsid w:val="00680FFF"/>
@@ -5617,6 +5660,7 @@
     <w:rsid w:val="0081713B"/>
     <w:rsid w:val="008205E4"/>
     <w:rsid w:val="00890D61"/>
+    <w:rsid w:val="008A0724"/>
     <w:rsid w:val="008A2466"/>
     <w:rsid w:val="008F56F7"/>
     <w:rsid w:val="00900240"/>
@@ -6623,6 +6667,26 @@
 </file>
 
 <file path=customXml/item3.xml><?xml version="1.0" encoding="utf-8"?>
+<p:properties xmlns:p="http://schemas.microsoft.com/office/2006/metadata/properties" xmlns:xsi="http://www.w3.org/2001/XMLSchema-instance" xmlns:pc="http://schemas.microsoft.com/office/infopath/2007/PartnerControls">
+  <documentManagement>
+    <TaxCatchAll xmlns="6bb79d28-80c9-4192-b874-25d85d9db259" xsi:nil="true"/>
+    <lcf76f155ced4ddcb4097134ff3c332f xmlns="5d10a710-9273-40be-99b8-c91e98a6b38c">
+      <Terms xmlns="http://schemas.microsoft.com/office/infopath/2007/PartnerControls"/>
+    </lcf76f155ced4ddcb4097134ff3c332f>
+  </documentManagement>
+</p:properties>
+</file>
+
+<file path=customXml/item4.xml><?xml version="1.0" encoding="utf-8"?>
+<?mso-contentType ?>
+<FormTemplates xmlns="http://schemas.microsoft.com/sharepoint/v3/contenttype/forms">
+  <Display>DocumentLibraryForm</Display>
+  <Edit>DocumentLibraryForm</Edit>
+  <New>DocumentLibraryForm</New>
+</FormTemplates>
+</file>
+
+<file path=customXml/item5.xml><?xml version="1.0" encoding="utf-8"?>
 <b:Sources xmlns:b="http://schemas.openxmlformats.org/officeDocument/2006/bibliography" xmlns="http://schemas.openxmlformats.org/officeDocument/2006/bibliography" SelectedStyle="\APASixthEditionOfficeOnline.xsl" StyleName="APA" Version="6">
   <b:Source>
     <b:Tag>Gar11</b:Tag>
@@ -6646,26 +6710,6 @@
     <b:RefOrder>1</b:RefOrder>
   </b:Source>
 </b:Sources>
-</file>
-
-<file path=customXml/item4.xml><?xml version="1.0" encoding="utf-8"?>
-<?mso-contentType ?>
-<FormTemplates xmlns="http://schemas.microsoft.com/sharepoint/v3/contenttype/forms">
-  <Display>DocumentLibraryForm</Display>
-  <Edit>DocumentLibraryForm</Edit>
-  <New>DocumentLibraryForm</New>
-</FormTemplates>
-</file>
-
-<file path=customXml/item5.xml><?xml version="1.0" encoding="utf-8"?>
-<p:properties xmlns:p="http://schemas.microsoft.com/office/2006/metadata/properties" xmlns:xsi="http://www.w3.org/2001/XMLSchema-instance" xmlns:pc="http://schemas.microsoft.com/office/infopath/2007/PartnerControls">
-  <documentManagement>
-    <TaxCatchAll xmlns="6bb79d28-80c9-4192-b874-25d85d9db259" xsi:nil="true"/>
-    <lcf76f155ced4ddcb4097134ff3c332f xmlns="5d10a710-9273-40be-99b8-c91e98a6b38c">
-      <Terms xmlns="http://schemas.microsoft.com/office/infopath/2007/PartnerControls"/>
-    </lcf76f155ced4ddcb4097134ff3c332f>
-  </documentManagement>
-</p:properties>
 </file>
 
 <file path=customXml/itemProps1.xml><?xml version="1.0" encoding="utf-8"?>
@@ -6696,9 +6740,12 @@
 </file>
 
 <file path=customXml/itemProps3.xml><?xml version="1.0" encoding="utf-8"?>
-<ds:datastoreItem xmlns:ds="http://schemas.openxmlformats.org/officeDocument/2006/customXml" ds:itemID="{FDA3A5A7-2A64-4348-81DC-C2276460CCE6}">
+<ds:datastoreItem xmlns:ds="http://schemas.openxmlformats.org/officeDocument/2006/customXml" ds:itemID="{AB8F5AAA-29E2-4D7C-B8A0-61ECB9B4C4C2}">
   <ds:schemaRefs>
-    <ds:schemaRef ds:uri="http://schemas.openxmlformats.org/officeDocument/2006/bibliography"/>
+    <ds:schemaRef ds:uri="http://schemas.microsoft.com/office/2006/metadata/properties"/>
+    <ds:schemaRef ds:uri="http://schemas.microsoft.com/office/infopath/2007/PartnerControls"/>
+    <ds:schemaRef ds:uri="6bb79d28-80c9-4192-b874-25d85d9db259"/>
+    <ds:schemaRef ds:uri="5d10a710-9273-40be-99b8-c91e98a6b38c"/>
   </ds:schemaRefs>
 </ds:datastoreItem>
 </file>
@@ -6712,12 +6759,9 @@
 </file>
 
 <file path=customXml/itemProps5.xml><?xml version="1.0" encoding="utf-8"?>
-<ds:datastoreItem xmlns:ds="http://schemas.openxmlformats.org/officeDocument/2006/customXml" ds:itemID="{AB8F5AAA-29E2-4D7C-B8A0-61ECB9B4C4C2}">
+<ds:datastoreItem xmlns:ds="http://schemas.openxmlformats.org/officeDocument/2006/customXml" ds:itemID="{FDA3A5A7-2A64-4348-81DC-C2276460CCE6}">
   <ds:schemaRefs>
-    <ds:schemaRef ds:uri="http://schemas.microsoft.com/office/2006/metadata/properties"/>
-    <ds:schemaRef ds:uri="http://schemas.microsoft.com/office/infopath/2007/PartnerControls"/>
-    <ds:schemaRef ds:uri="6bb79d28-80c9-4192-b874-25d85d9db259"/>
-    <ds:schemaRef ds:uri="5d10a710-9273-40be-99b8-c91e98a6b38c"/>
+    <ds:schemaRef ds:uri="http://schemas.openxmlformats.org/officeDocument/2006/bibliography"/>
   </ds:schemaRefs>
 </ds:datastoreItem>
 </file>
</xml_diff>

<commit_message>
feat: compare ensembles PCA and Green AI costs
</commit_message>
<xml_diff>
--- a/docs/FJ1656_MañanáSantana_U01.LAB02.docx
+++ b/docs/FJ1656_MañanáSantana_U01.LAB02.docx
@@ -476,6 +476,7 @@
                               <w:calendar w:val="gregorian"/>
                             </w:date>
                           </w:sdtPr>
+                          <w:sdtEndPr/>
                           <w:sdtContent>
                             <w:p>
                               <w:pPr>
@@ -524,6 +525,7 @@
                               <w:dataBinding w:prefixMappings="xmlns:ns0='http://schemas.openxmlformats.org/officeDocument/2006/extended-properties' " w:xpath="/ns0:Properties[1]/ns0:Company[1]" w:storeItemID="{6668398D-A668-4E3E-A5EB-62B293D839F1}"/>
                               <w:text/>
                             </w:sdtPr>
+                            <w:sdtEndPr/>
                             <w:sdtContent>
                               <w:r>
                                 <w:rPr>
@@ -680,9 +682,240 @@
         </w:p>
       </w:sdtContent>
     </w:sdt>
+    <w:p>
+      <w:pPr>
+        <w:tabs>
+          <w:tab w:val="left" w:pos="5364"/>
+        </w:tabs>
+        <w:jc w:val="both"/>
+        <w:rPr>
+          <w:rFonts w:ascii="Times New Roman" w:hAnsi="Times New Roman" w:cs="Times New Roman"/>
+          <w:b/>
+          <w:bCs/>
+          <w:lang w:val="es-DO"/>
+        </w:rPr>
+      </w:pPr>
+      <w:r>
+        <w:rPr>
+          <w:rFonts w:ascii="Times New Roman" w:hAnsi="Times New Roman" w:cs="Times New Roman"/>
+          <w:b/>
+          <w:bCs/>
+          <w:lang w:val="es-DO"/>
+        </w:rPr>
+        <w:lastRenderedPageBreak/>
+        <w:t>INFORME DE ENTREGA DE PROYECTO: CLASIFICACIÓN DE RIESGO CREDITICIO</w:t>
+      </w:r>
+    </w:p>
+    <w:p>
+      <w:pPr>
+        <w:tabs>
+          <w:tab w:val="left" w:pos="5364"/>
+        </w:tabs>
+        <w:jc w:val="both"/>
+        <w:rPr>
+          <w:rFonts w:ascii="Times New Roman" w:hAnsi="Times New Roman" w:cs="Times New Roman"/>
+          <w:b/>
+          <w:bCs/>
+          <w:lang w:val="es-DO"/>
+        </w:rPr>
+      </w:pPr>
+      <w:r>
+        <w:rPr>
+          <w:rFonts w:ascii="Times New Roman" w:hAnsi="Times New Roman" w:cs="Times New Roman"/>
+          <w:b/>
+          <w:bCs/>
+          <w:lang w:val="es-DO"/>
+        </w:rPr>
+        <w:t>1. Enlace al Repositorio del Proyecto</w:t>
+      </w:r>
+    </w:p>
+    <w:p>
+      <w:pPr>
+        <w:numPr>
+          <w:ilvl w:val="0"/>
+          <w:numId w:val="5"/>
+        </w:numPr>
+        <w:tabs>
+          <w:tab w:val="left" w:pos="5364"/>
+        </w:tabs>
+        <w:jc w:val="both"/>
+        <w:rPr>
+          <w:rFonts w:ascii="Times New Roman" w:hAnsi="Times New Roman" w:cs="Times New Roman"/>
+          <w:b/>
+          <w:bCs/>
+          <w:lang w:val="es-DO"/>
+        </w:rPr>
+      </w:pPr>
+      <w:r>
+        <w:rPr>
+          <w:rFonts w:ascii="Times New Roman" w:hAnsi="Times New Roman" w:cs="Times New Roman"/>
+          <w:b/>
+          <w:bCs/>
+          <w:lang w:val="es-DO"/>
+        </w:rPr>
+        <w:t xml:space="preserve">URL del Repositorio: </w:t>
+      </w:r>
+      <w:hyperlink r:id="rId14" w:history="1">
+        <w:r>
+          <w:rPr>
+            <w:rStyle w:val="Hipervnculo"/>
+            <w:rFonts w:ascii="Times New Roman" w:hAnsi="Times New Roman" w:cs="Times New Roman"/>
+            <w:b/>
+            <w:bCs/>
+            <w:lang w:val="es-DO"/>
+          </w:rPr>
+          <w:t>https://github.com/Rickymjms/INFO8239_U01_FJ1656.git</w:t>
+        </w:r>
+      </w:hyperlink>
+    </w:p>
+    <w:p>
+      <w:pPr>
+        <w:numPr>
+          <w:ilvl w:val="0"/>
+          <w:numId w:val="5"/>
+        </w:numPr>
+        <w:tabs>
+          <w:tab w:val="left" w:pos="5364"/>
+        </w:tabs>
+        <w:jc w:val="both"/>
+        <w:rPr>
+          <w:rFonts w:ascii="Times New Roman" w:hAnsi="Times New Roman" w:cs="Times New Roman"/>
+          <w:b/>
+          <w:bCs/>
+          <w:lang w:val="es-DO"/>
+        </w:rPr>
+      </w:pPr>
+      <w:r>
+        <w:rPr>
+          <w:rFonts w:ascii="Times New Roman" w:hAnsi="Times New Roman" w:cs="Times New Roman"/>
+          <w:b/>
+          <w:bCs/>
+          <w:lang w:val="es-DO"/>
+        </w:rPr>
+        <w:t xml:space="preserve">Rama Principal: </w:t>
+      </w:r>
+      <w:proofErr w:type="spellStart"/>
+      <w:r>
+        <w:rPr>
+          <w:rFonts w:ascii="Times New Roman" w:hAnsi="Times New Roman" w:cs="Times New Roman"/>
+          <w:b/>
+          <w:bCs/>
+          <w:lang w:val="es-DO"/>
+        </w:rPr>
+        <w:t>main</w:t>
+      </w:r>
+      <w:proofErr w:type="spellEnd"/>
+    </w:p>
+    <w:p>
+      <w:pPr>
+        <w:numPr>
+          <w:ilvl w:val="0"/>
+          <w:numId w:val="5"/>
+        </w:numPr>
+        <w:tabs>
+          <w:tab w:val="left" w:pos="5364"/>
+        </w:tabs>
+        <w:jc w:val="both"/>
+        <w:rPr>
+          <w:rFonts w:ascii="Times New Roman" w:hAnsi="Times New Roman" w:cs="Times New Roman"/>
+          <w:b/>
+          <w:bCs/>
+          <w:lang w:val="es-DO"/>
+        </w:rPr>
+      </w:pPr>
+      <w:r>
+        <w:rPr>
+          <w:rFonts w:ascii="Times New Roman" w:hAnsi="Times New Roman" w:cs="Times New Roman"/>
+          <w:b/>
+          <w:bCs/>
+          <w:lang w:val="es-DO"/>
+        </w:rPr>
+        <w:t xml:space="preserve">Visibilidad: Público </w:t>
+      </w:r>
+    </w:p>
+    <w:p>
+      <w:pPr>
+        <w:numPr>
+          <w:ilvl w:val="0"/>
+          <w:numId w:val="5"/>
+        </w:numPr>
+        <w:tabs>
+          <w:tab w:val="left" w:pos="5364"/>
+        </w:tabs>
+        <w:jc w:val="both"/>
+        <w:rPr>
+          <w:rFonts w:ascii="Times New Roman" w:hAnsi="Times New Roman" w:cs="Times New Roman"/>
+          <w:b/>
+          <w:bCs/>
+          <w:lang w:val="es-DO"/>
+        </w:rPr>
+      </w:pPr>
+      <w:r>
+        <w:rPr>
+          <w:rFonts w:ascii="Times New Roman" w:hAnsi="Times New Roman" w:cs="Times New Roman"/>
+          <w:b/>
+          <w:bCs/>
+          <w:lang w:val="es-DO"/>
+        </w:rPr>
+        <w:t xml:space="preserve">Artefacto guardado: </w:t>
+      </w:r>
+      <w:proofErr w:type="spellStart"/>
+      <w:r>
+        <w:rPr>
+          <w:rFonts w:ascii="Times New Roman" w:hAnsi="Times New Roman" w:cs="Times New Roman"/>
+          <w:b/>
+          <w:bCs/>
+          <w:lang w:val="es-DO"/>
+        </w:rPr>
+        <w:t>reports</w:t>
+      </w:r>
+      <w:proofErr w:type="spellEnd"/>
+      <w:r>
+        <w:rPr>
+          <w:rFonts w:ascii="Times New Roman" w:hAnsi="Times New Roman" w:cs="Times New Roman"/>
+          <w:b/>
+          <w:bCs/>
+          <w:lang w:val="es-DO"/>
+        </w:rPr>
+        <w:t>/</w:t>
+      </w:r>
+      <w:proofErr w:type="spellStart"/>
+      <w:r>
+        <w:rPr>
+          <w:rFonts w:ascii="Times New Roman" w:hAnsi="Times New Roman" w:cs="Times New Roman"/>
+          <w:b/>
+          <w:bCs/>
+          <w:lang w:val="es-DO"/>
+        </w:rPr>
+        <w:t>svm_best.joblib</w:t>
+      </w:r>
+      <w:proofErr w:type="spellEnd"/>
+    </w:p>
+    <w:p>
+      <w:pPr>
+        <w:tabs>
+          <w:tab w:val="left" w:pos="5364"/>
+        </w:tabs>
+        <w:jc w:val="both"/>
+        <w:rPr>
+          <w:rFonts w:ascii="Times New Roman" w:hAnsi="Times New Roman" w:cs="Times New Roman"/>
+          <w:b/>
+          <w:bCs/>
+          <w:lang w:val="es-DO"/>
+        </w:rPr>
+      </w:pPr>
+      <w:r>
+        <w:rPr>
+          <w:rFonts w:ascii="Times New Roman" w:hAnsi="Times New Roman" w:cs="Times New Roman"/>
+          <w:b/>
+          <w:bCs/>
+        </w:rPr>
+        <w:t>2. Identificación del Dataset</w:t>
+      </w:r>
+    </w:p>
     <w:tbl>
       <w:tblPr>
-        <w:tblW w:w="8529" w:type="dxa"/>
+        <w:tblW w:w="9351" w:type="dxa"/>
         <w:tblBorders>
           <w:top w:val="single" w:sz="4" w:space="0" w:color="auto"/>
           <w:left w:val="single" w:sz="4" w:space="0" w:color="auto"/>
@@ -698,8 +931,8 @@
         <w:tblLook w:val="04A0" w:firstRow="1" w:lastRow="0" w:firstColumn="1" w:lastColumn="0" w:noHBand="0" w:noVBand="1"/>
       </w:tblPr>
       <w:tblGrid>
-        <w:gridCol w:w="1980"/>
-        <w:gridCol w:w="6549"/>
+        <w:gridCol w:w="2320"/>
+        <w:gridCol w:w="7031"/>
       </w:tblGrid>
       <w:tr>
         <w:trPr>
@@ -707,10 +940,9 @@
         </w:trPr>
         <w:tc>
           <w:tcPr>
-            <w:tcW w:w="8529" w:type="dxa"/>
+            <w:tcW w:w="9351" w:type="dxa"/>
             <w:gridSpan w:val="2"/>
-            <w:noWrap/>
-            <w:vAlign w:val="bottom"/>
+            <w:vAlign w:val="center"/>
             <w:hideMark/>
           </w:tcPr>
           <w:p>
@@ -741,7 +973,6 @@
                 <w:lang w:val="es-DO" w:eastAsia="es-DO"/>
                 <w14:ligatures w14:val="none"/>
               </w:rPr>
-              <w:lastRenderedPageBreak/>
               <w:t>Ficha del Dataset (Formulación del Problema)</w:t>
             </w:r>
           </w:p>
@@ -753,8 +984,7 @@
         </w:trPr>
         <w:tc>
           <w:tcPr>
-            <w:tcW w:w="1980" w:type="dxa"/>
-            <w:noWrap/>
+            <w:tcW w:w="2320" w:type="dxa"/>
             <w:vAlign w:val="center"/>
             <w:hideMark/>
           </w:tcPr>
@@ -792,8 +1022,7 @@
         </w:tc>
         <w:tc>
           <w:tcPr>
-            <w:tcW w:w="6549" w:type="dxa"/>
-            <w:noWrap/>
+            <w:tcW w:w="7031" w:type="dxa"/>
             <w:vAlign w:val="center"/>
             <w:hideMark/>
           </w:tcPr>
@@ -801,10 +1030,11 @@
             <w:pPr>
               <w:spacing w:after="0" w:line="240" w:lineRule="auto"/>
               <w:rPr>
-                <w:rFonts w:ascii="Times New Roman" w:eastAsia="Times New Roman" w:hAnsi="Times New Roman" w:cs="Times New Roman"/>
-                <w:kern w:val="0"/>
-                <w:sz w:val="20"/>
-                <w:szCs w:val="20"/>
+                <w:rFonts w:ascii="Aptos Narrow" w:eastAsia="Times New Roman" w:hAnsi="Aptos Narrow" w:cs="Times New Roman"/>
+                <w:color w:val="000000"/>
+                <w:kern w:val="0"/>
+                <w:sz w:val="22"/>
+                <w:szCs w:val="22"/>
                 <w:lang w:val="es-DO" w:eastAsia="es-DO"/>
                 <w14:ligatures w14:val="none"/>
               </w:rPr>
@@ -830,8 +1060,7 @@
         </w:trPr>
         <w:tc>
           <w:tcPr>
-            <w:tcW w:w="1980" w:type="dxa"/>
-            <w:noWrap/>
+            <w:tcW w:w="2320" w:type="dxa"/>
             <w:vAlign w:val="center"/>
             <w:hideMark/>
           </w:tcPr>
@@ -868,8 +1097,7 @@
         </w:tc>
         <w:tc>
           <w:tcPr>
-            <w:tcW w:w="6549" w:type="dxa"/>
-            <w:noWrap/>
+            <w:tcW w:w="7031" w:type="dxa"/>
             <w:vAlign w:val="center"/>
             <w:hideMark/>
           </w:tcPr>
@@ -907,8 +1135,7 @@
         </w:trPr>
         <w:tc>
           <w:tcPr>
-            <w:tcW w:w="1980" w:type="dxa"/>
-            <w:noWrap/>
+            <w:tcW w:w="2320" w:type="dxa"/>
             <w:vAlign w:val="center"/>
             <w:hideMark/>
           </w:tcPr>
@@ -917,8 +1144,6 @@
               <w:spacing w:after="0" w:line="240" w:lineRule="auto"/>
               <w:rPr>
                 <w:rFonts w:ascii="Aptos Narrow" w:eastAsia="Times New Roman" w:hAnsi="Aptos Narrow" w:cs="Times New Roman"/>
-                <w:b/>
-                <w:bCs/>
                 <w:color w:val="000000"/>
                 <w:kern w:val="0"/>
                 <w:sz w:val="22"/>
@@ -930,8 +1155,6 @@
             <w:r>
               <w:rPr>
                 <w:rFonts w:ascii="Aptos Narrow" w:eastAsia="Times New Roman" w:hAnsi="Aptos Narrow" w:cs="Times New Roman"/>
-                <w:b/>
-                <w:bCs/>
                 <w:color w:val="000000"/>
                 <w:kern w:val="0"/>
                 <w:sz w:val="22"/>
@@ -945,8 +1168,7 @@
         </w:tc>
         <w:tc>
           <w:tcPr>
-            <w:tcW w:w="6549" w:type="dxa"/>
-            <w:noWrap/>
+            <w:tcW w:w="7031" w:type="dxa"/>
             <w:vAlign w:val="center"/>
             <w:hideMark/>
           </w:tcPr>
@@ -980,12 +1202,11 @@
       </w:tr>
       <w:tr>
         <w:trPr>
-          <w:trHeight w:val="288"/>
+          <w:trHeight w:val="576"/>
         </w:trPr>
         <w:tc>
           <w:tcPr>
-            <w:tcW w:w="1980" w:type="dxa"/>
-            <w:noWrap/>
+            <w:tcW w:w="2320" w:type="dxa"/>
             <w:vAlign w:val="center"/>
             <w:hideMark/>
           </w:tcPr>
@@ -994,8 +1215,6 @@
               <w:spacing w:after="0" w:line="240" w:lineRule="auto"/>
               <w:rPr>
                 <w:rFonts w:ascii="Aptos Narrow" w:eastAsia="Times New Roman" w:hAnsi="Aptos Narrow" w:cs="Times New Roman"/>
-                <w:b/>
-                <w:bCs/>
                 <w:color w:val="000000"/>
                 <w:kern w:val="0"/>
                 <w:sz w:val="22"/>
@@ -1007,8 +1226,6 @@
             <w:r>
               <w:rPr>
                 <w:rFonts w:ascii="Aptos Narrow" w:eastAsia="Times New Roman" w:hAnsi="Aptos Narrow" w:cs="Times New Roman"/>
-                <w:b/>
-                <w:bCs/>
                 <w:color w:val="000000"/>
                 <w:kern w:val="0"/>
                 <w:sz w:val="22"/>
@@ -1022,8 +1239,7 @@
         </w:tc>
         <w:tc>
           <w:tcPr>
-            <w:tcW w:w="6549" w:type="dxa"/>
-            <w:noWrap/>
+            <w:tcW w:w="7031" w:type="dxa"/>
             <w:vAlign w:val="center"/>
             <w:hideMark/>
           </w:tcPr>
@@ -1061,8 +1277,7 @@
         </w:trPr>
         <w:tc>
           <w:tcPr>
-            <w:tcW w:w="1980" w:type="dxa"/>
-            <w:noWrap/>
+            <w:tcW w:w="2320" w:type="dxa"/>
             <w:vAlign w:val="center"/>
             <w:hideMark/>
           </w:tcPr>
@@ -1071,8 +1286,6 @@
               <w:spacing w:after="0" w:line="240" w:lineRule="auto"/>
               <w:rPr>
                 <w:rFonts w:ascii="Aptos Narrow" w:eastAsia="Times New Roman" w:hAnsi="Aptos Narrow" w:cs="Times New Roman"/>
-                <w:b/>
-                <w:bCs/>
                 <w:color w:val="000000"/>
                 <w:kern w:val="0"/>
                 <w:sz w:val="22"/>
@@ -1084,23 +1297,20 @@
             <w:r>
               <w:rPr>
                 <w:rFonts w:ascii="Aptos Narrow" w:eastAsia="Times New Roman" w:hAnsi="Aptos Narrow" w:cs="Times New Roman"/>
-                <w:b/>
-                <w:bCs/>
-                <w:color w:val="000000"/>
-                <w:kern w:val="0"/>
-                <w:sz w:val="22"/>
-                <w:szCs w:val="22"/>
-                <w:lang w:val="es-DO" w:eastAsia="es-DO"/>
-                <w14:ligatures w14:val="none"/>
-              </w:rPr>
-              <w:t>Target tentativo</w:t>
+                <w:color w:val="000000"/>
+                <w:kern w:val="0"/>
+                <w:sz w:val="22"/>
+                <w:szCs w:val="22"/>
+                <w:lang w:val="es-DO" w:eastAsia="es-DO"/>
+                <w14:ligatures w14:val="none"/>
+              </w:rPr>
+              <w:t>Variable Objetivo</w:t>
             </w:r>
           </w:p>
         </w:tc>
         <w:tc>
           <w:tcPr>
-            <w:tcW w:w="6549" w:type="dxa"/>
-            <w:noWrap/>
+            <w:tcW w:w="7031" w:type="dxa"/>
             <w:vAlign w:val="center"/>
             <w:hideMark/>
           </w:tcPr>
@@ -1138,8 +1348,7 @@
         </w:trPr>
         <w:tc>
           <w:tcPr>
-            <w:tcW w:w="1980" w:type="dxa"/>
-            <w:noWrap/>
+            <w:tcW w:w="2320" w:type="dxa"/>
             <w:vAlign w:val="center"/>
             <w:hideMark/>
           </w:tcPr>
@@ -1148,8 +1357,6 @@
               <w:spacing w:after="0" w:line="240" w:lineRule="auto"/>
               <w:rPr>
                 <w:rFonts w:ascii="Aptos Narrow" w:eastAsia="Times New Roman" w:hAnsi="Aptos Narrow" w:cs="Times New Roman"/>
-                <w:b/>
-                <w:bCs/>
                 <w:color w:val="000000"/>
                 <w:kern w:val="0"/>
                 <w:sz w:val="22"/>
@@ -1161,8 +1368,6 @@
             <w:r>
               <w:rPr>
                 <w:rFonts w:ascii="Aptos Narrow" w:eastAsia="Times New Roman" w:hAnsi="Aptos Narrow" w:cs="Times New Roman"/>
-                <w:b/>
-                <w:bCs/>
                 <w:color w:val="000000"/>
                 <w:kern w:val="0"/>
                 <w:sz w:val="22"/>
@@ -1176,8 +1381,7 @@
         </w:tc>
         <w:tc>
           <w:tcPr>
-            <w:tcW w:w="6549" w:type="dxa"/>
-            <w:noWrap/>
+            <w:tcW w:w="7031" w:type="dxa"/>
             <w:vAlign w:val="center"/>
             <w:hideMark/>
           </w:tcPr>
@@ -1211,12 +1415,11 @@
       </w:tr>
       <w:tr>
         <w:trPr>
-          <w:trHeight w:val="288"/>
+          <w:trHeight w:val="576"/>
         </w:trPr>
         <w:tc>
           <w:tcPr>
-            <w:tcW w:w="1980" w:type="dxa"/>
-            <w:noWrap/>
+            <w:tcW w:w="2320" w:type="dxa"/>
             <w:vAlign w:val="center"/>
             <w:hideMark/>
           </w:tcPr>
@@ -1225,8 +1428,6 @@
               <w:spacing w:after="0" w:line="240" w:lineRule="auto"/>
               <w:rPr>
                 <w:rFonts w:ascii="Aptos Narrow" w:eastAsia="Times New Roman" w:hAnsi="Aptos Narrow" w:cs="Times New Roman"/>
-                <w:b/>
-                <w:bCs/>
                 <w:color w:val="000000"/>
                 <w:kern w:val="0"/>
                 <w:sz w:val="22"/>
@@ -1238,8 +1439,6 @@
             <w:r>
               <w:rPr>
                 <w:rFonts w:ascii="Aptos Narrow" w:eastAsia="Times New Roman" w:hAnsi="Aptos Narrow" w:cs="Times New Roman"/>
-                <w:b/>
-                <w:bCs/>
                 <w:color w:val="000000"/>
                 <w:kern w:val="0"/>
                 <w:sz w:val="22"/>
@@ -1253,8 +1452,7 @@
         </w:tc>
         <w:tc>
           <w:tcPr>
-            <w:tcW w:w="6549" w:type="dxa"/>
-            <w:noWrap/>
+            <w:tcW w:w="7031" w:type="dxa"/>
             <w:vAlign w:val="center"/>
             <w:hideMark/>
           </w:tcPr>
@@ -1292,8 +1490,7 @@
         </w:trPr>
         <w:tc>
           <w:tcPr>
-            <w:tcW w:w="1980" w:type="dxa"/>
-            <w:noWrap/>
+            <w:tcW w:w="2320" w:type="dxa"/>
             <w:vAlign w:val="center"/>
             <w:hideMark/>
           </w:tcPr>
@@ -1302,8 +1499,6 @@
               <w:spacing w:after="0" w:line="240" w:lineRule="auto"/>
               <w:rPr>
                 <w:rFonts w:ascii="Aptos Narrow" w:eastAsia="Times New Roman" w:hAnsi="Aptos Narrow" w:cs="Times New Roman"/>
-                <w:b/>
-                <w:bCs/>
                 <w:color w:val="000000"/>
                 <w:kern w:val="0"/>
                 <w:sz w:val="22"/>
@@ -1315,8 +1510,6 @@
             <w:r>
               <w:rPr>
                 <w:rFonts w:ascii="Aptos Narrow" w:eastAsia="Times New Roman" w:hAnsi="Aptos Narrow" w:cs="Times New Roman"/>
-                <w:b/>
-                <w:bCs/>
                 <w:color w:val="000000"/>
                 <w:kern w:val="0"/>
                 <w:sz w:val="22"/>
@@ -1330,8 +1523,7 @@
         </w:tc>
         <w:tc>
           <w:tcPr>
-            <w:tcW w:w="6549" w:type="dxa"/>
-            <w:noWrap/>
+            <w:tcW w:w="7031" w:type="dxa"/>
             <w:vAlign w:val="center"/>
             <w:hideMark/>
           </w:tcPr>
@@ -1363,6 +1555,224 @@
           </w:p>
         </w:tc>
       </w:tr>
+      <w:tr>
+        <w:trPr>
+          <w:trHeight w:val="288"/>
+        </w:trPr>
+        <w:tc>
+          <w:tcPr>
+            <w:tcW w:w="2320" w:type="dxa"/>
+            <w:vAlign w:val="center"/>
+          </w:tcPr>
+          <w:p>
+            <w:pPr>
+              <w:spacing w:after="0" w:line="240" w:lineRule="auto"/>
+              <w:rPr>
+                <w:rFonts w:ascii="Aptos Narrow" w:eastAsia="Times New Roman" w:hAnsi="Aptos Narrow" w:cs="Times New Roman"/>
+                <w:color w:val="000000"/>
+                <w:kern w:val="0"/>
+                <w:sz w:val="22"/>
+                <w:szCs w:val="22"/>
+                <w:lang w:val="es-DO" w:eastAsia="es-DO"/>
+                <w14:ligatures w14:val="none"/>
+              </w:rPr>
+            </w:pPr>
+            <w:r>
+              <w:rPr>
+                <w:rFonts w:ascii="Aptos Narrow" w:eastAsia="Times New Roman" w:hAnsi="Aptos Narrow" w:cs="Times New Roman"/>
+                <w:color w:val="000000"/>
+                <w:kern w:val="0"/>
+                <w:sz w:val="22"/>
+                <w:szCs w:val="22"/>
+                <w:lang w:val="es-DO" w:eastAsia="es-DO"/>
+                <w14:ligatures w14:val="none"/>
+              </w:rPr>
+              <w:t>URL</w:t>
+            </w:r>
+          </w:p>
+        </w:tc>
+        <w:tc>
+          <w:tcPr>
+            <w:tcW w:w="7031" w:type="dxa"/>
+            <w:vAlign w:val="center"/>
+          </w:tcPr>
+          <w:p>
+            <w:pPr>
+              <w:spacing w:after="0" w:line="240" w:lineRule="auto"/>
+              <w:rPr>
+                <w:rFonts w:ascii="Aptos Narrow" w:eastAsia="Times New Roman" w:hAnsi="Aptos Narrow" w:cs="Times New Roman"/>
+                <w:color w:val="000000"/>
+                <w:kern w:val="0"/>
+                <w:sz w:val="22"/>
+                <w:szCs w:val="22"/>
+                <w:lang w:eastAsia="es-DO"/>
+                <w14:ligatures w14:val="none"/>
+              </w:rPr>
+            </w:pPr>
+          </w:p>
+          <w:p>
+            <w:pPr>
+              <w:spacing w:after="0" w:line="240" w:lineRule="auto"/>
+              <w:rPr>
+                <w:rFonts w:ascii="Aptos Narrow" w:eastAsia="Times New Roman" w:hAnsi="Aptos Narrow" w:cs="Times New Roman"/>
+                <w:color w:val="000000"/>
+                <w:kern w:val="0"/>
+                <w:sz w:val="22"/>
+                <w:szCs w:val="22"/>
+                <w:lang w:eastAsia="es-DO"/>
+                <w14:ligatures w14:val="none"/>
+              </w:rPr>
+            </w:pPr>
+            <w:hyperlink r:id="rId15" w:history="1">
+              <w:r>
+                <w:rPr>
+                  <w:rStyle w:val="Hipervnculo"/>
+                  <w:rFonts w:ascii="Aptos Narrow" w:eastAsia="Times New Roman" w:hAnsi="Aptos Narrow" w:cs="Times New Roman"/>
+                  <w:kern w:val="0"/>
+                  <w:sz w:val="22"/>
+                  <w:szCs w:val="22"/>
+                  <w:lang w:eastAsia="es-DO"/>
+                  <w14:ligatures w14:val="none"/>
+                </w:rPr>
+                <w:t>https://archive.ics.uci.edu/dataset/144/statlog+german+credit+data</w:t>
+              </w:r>
+            </w:hyperlink>
+          </w:p>
+          <w:p>
+            <w:pPr>
+              <w:spacing w:after="0" w:line="240" w:lineRule="auto"/>
+              <w:rPr>
+                <w:rFonts w:ascii="Aptos Narrow" w:eastAsia="Times New Roman" w:hAnsi="Aptos Narrow" w:cs="Times New Roman"/>
+                <w:color w:val="000000"/>
+                <w:kern w:val="0"/>
+                <w:sz w:val="22"/>
+                <w:szCs w:val="22"/>
+                <w:lang w:val="es-DO" w:eastAsia="es-DO"/>
+                <w14:ligatures w14:val="none"/>
+              </w:rPr>
+            </w:pPr>
+            <w:r>
+              <w:rPr>
+                <w:rFonts w:ascii="Aptos Narrow" w:eastAsia="Times New Roman" w:hAnsi="Aptos Narrow" w:cs="Times New Roman"/>
+                <w:color w:val="000000"/>
+                <w:kern w:val="0"/>
+                <w:sz w:val="22"/>
+                <w:szCs w:val="22"/>
+                <w:lang w:eastAsia="es-DO"/>
+                <w14:ligatures w14:val="none"/>
+              </w:rPr>
+              <w:t xml:space="preserve"> </w:t>
+            </w:r>
+            <w:r>
+              <w:rPr>
+                <w:rFonts w:ascii="Aptos Narrow" w:eastAsia="Times New Roman" w:hAnsi="Aptos Narrow" w:cs="Times New Roman"/>
+                <w:color w:val="000000"/>
+                <w:kern w:val="0"/>
+                <w:sz w:val="22"/>
+                <w:szCs w:val="22"/>
+                <w:lang w:eastAsia="es-DO"/>
+                <w14:ligatures w14:val="none"/>
+              </w:rPr>
+              <w:t>(</w:t>
+            </w:r>
+            <w:hyperlink r:id="rId16" w:history="1">
+              <w:r>
+                <w:rPr>
+                  <w:rStyle w:val="Hipervnculo"/>
+                  <w:rFonts w:ascii="Aptos Narrow" w:eastAsia="Times New Roman" w:hAnsi="Aptos Narrow" w:cs="Times New Roman"/>
+                  <w:kern w:val="0"/>
+                  <w:sz w:val="22"/>
+                  <w:szCs w:val="22"/>
+                  <w:lang w:eastAsia="es-DO"/>
+                  <w14:ligatures w14:val="none"/>
+                </w:rPr>
+                <w:t>https://archive.ics.uci.edu/ml/machine-learning-databases/statlog/german/german.data</w:t>
+              </w:r>
+            </w:hyperlink>
+            <w:r>
+              <w:rPr>
+                <w:rFonts w:ascii="Aptos Narrow" w:eastAsia="Times New Roman" w:hAnsi="Aptos Narrow" w:cs="Times New Roman"/>
+                <w:color w:val="000000"/>
+                <w:kern w:val="0"/>
+                <w:sz w:val="22"/>
+                <w:szCs w:val="22"/>
+                <w:lang w:eastAsia="es-DO"/>
+                <w14:ligatures w14:val="none"/>
+              </w:rPr>
+              <w:t>)</w:t>
+            </w:r>
+          </w:p>
+        </w:tc>
+      </w:tr>
+      <w:tr>
+        <w:trPr>
+          <w:trHeight w:val="288"/>
+        </w:trPr>
+        <w:tc>
+          <w:tcPr>
+            <w:tcW w:w="2320" w:type="dxa"/>
+            <w:vAlign w:val="center"/>
+          </w:tcPr>
+          <w:p>
+            <w:pPr>
+              <w:spacing w:after="0" w:line="240" w:lineRule="auto"/>
+              <w:rPr>
+                <w:rFonts w:ascii="Aptos Narrow" w:eastAsia="Times New Roman" w:hAnsi="Aptos Narrow" w:cs="Times New Roman"/>
+                <w:color w:val="000000"/>
+                <w:kern w:val="0"/>
+                <w:sz w:val="22"/>
+                <w:szCs w:val="22"/>
+                <w:lang w:val="es-DO" w:eastAsia="es-DO"/>
+                <w14:ligatures w14:val="none"/>
+              </w:rPr>
+            </w:pPr>
+            <w:r>
+              <w:rPr>
+                <w:rFonts w:ascii="Aptos Narrow" w:eastAsia="Times New Roman" w:hAnsi="Aptos Narrow" w:cs="Times New Roman"/>
+                <w:color w:val="000000"/>
+                <w:kern w:val="0"/>
+                <w:sz w:val="22"/>
+                <w:szCs w:val="22"/>
+                <w:lang w:val="es-DO" w:eastAsia="es-DO"/>
+                <w14:ligatures w14:val="none"/>
+              </w:rPr>
+              <w:t xml:space="preserve">Partición de Datos: </w:t>
+            </w:r>
+          </w:p>
+        </w:tc>
+        <w:tc>
+          <w:tcPr>
+            <w:tcW w:w="7031" w:type="dxa"/>
+            <w:vAlign w:val="center"/>
+          </w:tcPr>
+          <w:p>
+            <w:pPr>
+              <w:spacing w:after="0" w:line="240" w:lineRule="auto"/>
+              <w:rPr>
+                <w:rFonts w:ascii="Aptos Narrow" w:eastAsia="Times New Roman" w:hAnsi="Aptos Narrow" w:cs="Times New Roman"/>
+                <w:color w:val="000000"/>
+                <w:kern w:val="0"/>
+                <w:sz w:val="22"/>
+                <w:szCs w:val="22"/>
+                <w:lang w:eastAsia="es-DO"/>
+                <w14:ligatures w14:val="none"/>
+              </w:rPr>
+            </w:pPr>
+            <w:r>
+              <w:rPr>
+                <w:rFonts w:ascii="Aptos Narrow" w:eastAsia="Times New Roman" w:hAnsi="Aptos Narrow" w:cs="Times New Roman"/>
+                <w:color w:val="000000"/>
+                <w:kern w:val="0"/>
+                <w:sz w:val="22"/>
+                <w:szCs w:val="22"/>
+                <w:lang w:eastAsia="es-DO"/>
+                <w14:ligatures w14:val="none"/>
+              </w:rPr>
+              <w:t>80% entrenamiento (800 instancias) y 20% prueba (200 instancias), particionada de forma estratificada sobre el target.</w:t>
+            </w:r>
+          </w:p>
+        </w:tc>
+      </w:tr>
     </w:tbl>
     <w:p>
       <w:pPr>
@@ -1380,7 +1790,7 @@
     </w:p>
     <w:tbl>
       <w:tblPr>
-        <w:tblW w:w="8494" w:type="dxa"/>
+        <w:tblW w:w="9350" w:type="dxa"/>
         <w:tblCellMar>
           <w:left w:w="70" w:type="dxa"/>
           <w:right w:w="70" w:type="dxa"/>
@@ -1398,7 +1808,7 @@
         </w:trPr>
         <w:tc>
           <w:tcPr>
-            <w:tcW w:w="8494" w:type="dxa"/>
+            <w:tcW w:w="9350" w:type="dxa"/>
             <w:gridSpan w:val="3"/>
             <w:tcBorders>
               <w:top w:val="single" w:sz="4" w:space="0" w:color="auto"/>
@@ -1438,7 +1848,7 @@
                 <w:lang w:val="es-DO" w:eastAsia="es-DO"/>
                 <w14:ligatures w14:val="none"/>
               </w:rPr>
-              <w:t>Tabla Comparativa de Candidatos (Paso 2 y 3 del LAB02)</w:t>
+              <w:t>Tabla Comparativa de Candidatos</w:t>
             </w:r>
           </w:p>
         </w:tc>
@@ -1449,7 +1859,7 @@
         </w:trPr>
         <w:tc>
           <w:tcPr>
-            <w:tcW w:w="1030" w:type="dxa"/>
+            <w:tcW w:w="1123" w:type="dxa"/>
             <w:tcBorders>
               <w:top w:val="nil"/>
               <w:left w:val="single" w:sz="4" w:space="0" w:color="auto"/>
@@ -1489,7 +1899,7 @@
         </w:tc>
         <w:tc>
           <w:tcPr>
-            <w:tcW w:w="4037" w:type="dxa"/>
+            <w:tcW w:w="4338" w:type="dxa"/>
             <w:tcBorders>
               <w:top w:val="nil"/>
               <w:left w:val="nil"/>
@@ -1529,7 +1939,7 @@
         </w:tc>
         <w:tc>
           <w:tcPr>
-            <w:tcW w:w="3427" w:type="dxa"/>
+            <w:tcW w:w="3889" w:type="dxa"/>
             <w:tcBorders>
               <w:top w:val="nil"/>
               <w:left w:val="nil"/>
@@ -1574,7 +1984,7 @@
         </w:trPr>
         <w:tc>
           <w:tcPr>
-            <w:tcW w:w="1030" w:type="dxa"/>
+            <w:tcW w:w="1123" w:type="dxa"/>
             <w:tcBorders>
               <w:top w:val="nil"/>
               <w:left w:val="single" w:sz="4" w:space="0" w:color="auto"/>
@@ -1614,7 +2024,7 @@
         </w:tc>
         <w:tc>
           <w:tcPr>
-            <w:tcW w:w="4037" w:type="dxa"/>
+            <w:tcW w:w="4338" w:type="dxa"/>
             <w:tcBorders>
               <w:top w:val="nil"/>
               <w:left w:val="nil"/>
@@ -1654,7 +2064,7 @@
         </w:tc>
         <w:tc>
           <w:tcPr>
-            <w:tcW w:w="3427" w:type="dxa"/>
+            <w:tcW w:w="3889" w:type="dxa"/>
             <w:tcBorders>
               <w:top w:val="nil"/>
               <w:left w:val="nil"/>
@@ -1699,7 +2109,7 @@
         </w:trPr>
         <w:tc>
           <w:tcPr>
-            <w:tcW w:w="1030" w:type="dxa"/>
+            <w:tcW w:w="1123" w:type="dxa"/>
             <w:tcBorders>
               <w:top w:val="nil"/>
               <w:left w:val="single" w:sz="4" w:space="0" w:color="auto"/>
@@ -1739,7 +2149,7 @@
         </w:tc>
         <w:tc>
           <w:tcPr>
-            <w:tcW w:w="4037" w:type="dxa"/>
+            <w:tcW w:w="4338" w:type="dxa"/>
             <w:tcBorders>
               <w:top w:val="nil"/>
               <w:left w:val="nil"/>
@@ -1763,7 +2173,7 @@
                 <w14:ligatures w14:val="none"/>
               </w:rPr>
             </w:pPr>
-            <w:hyperlink r:id="rId14" w:history="1">
+            <w:hyperlink r:id="rId17" w:history="1">
               <w:r>
                 <w:rPr>
                   <w:rStyle w:val="Hipervnculo"/>
@@ -1781,7 +2191,7 @@
         </w:tc>
         <w:tc>
           <w:tcPr>
-            <w:tcW w:w="3427" w:type="dxa"/>
+            <w:tcW w:w="3889" w:type="dxa"/>
             <w:tcBorders>
               <w:top w:val="nil"/>
               <w:left w:val="nil"/>
@@ -1805,7 +2215,7 @@
                 <w14:ligatures w14:val="none"/>
               </w:rPr>
             </w:pPr>
-            <w:hyperlink r:id="rId15" w:history="1">
+            <w:hyperlink r:id="rId18" w:history="1">
               <w:r>
                 <w:rPr>
                   <w:rStyle w:val="Hipervnculo"/>
@@ -1828,7 +2238,7 @@
         </w:trPr>
         <w:tc>
           <w:tcPr>
-            <w:tcW w:w="1030" w:type="dxa"/>
+            <w:tcW w:w="1123" w:type="dxa"/>
             <w:tcBorders>
               <w:top w:val="nil"/>
               <w:left w:val="single" w:sz="4" w:space="0" w:color="auto"/>
@@ -1868,7 +2278,7 @@
         </w:tc>
         <w:tc>
           <w:tcPr>
-            <w:tcW w:w="4037" w:type="dxa"/>
+            <w:tcW w:w="4338" w:type="dxa"/>
             <w:tcBorders>
               <w:top w:val="nil"/>
               <w:left w:val="nil"/>
@@ -1892,7 +2302,7 @@
                 <w14:ligatures w14:val="none"/>
               </w:rPr>
             </w:pPr>
-            <w:hyperlink r:id="rId16" w:history="1">
+            <w:hyperlink r:id="rId19" w:history="1">
               <w:r>
                 <w:rPr>
                   <w:rStyle w:val="Hipervnculo"/>
@@ -1910,7 +2320,7 @@
         </w:tc>
         <w:tc>
           <w:tcPr>
-            <w:tcW w:w="3427" w:type="dxa"/>
+            <w:tcW w:w="3889" w:type="dxa"/>
             <w:tcBorders>
               <w:top w:val="nil"/>
               <w:left w:val="nil"/>
@@ -1934,7 +2344,7 @@
                 <w14:ligatures w14:val="none"/>
               </w:rPr>
             </w:pPr>
-            <w:hyperlink r:id="rId17" w:history="1">
+            <w:hyperlink r:id="rId20" w:history="1">
               <w:r>
                 <w:rPr>
                   <w:rStyle w:val="Hipervnculo"/>
@@ -1957,7 +2367,7 @@
         </w:trPr>
         <w:tc>
           <w:tcPr>
-            <w:tcW w:w="1030" w:type="dxa"/>
+            <w:tcW w:w="1123" w:type="dxa"/>
             <w:tcBorders>
               <w:top w:val="nil"/>
               <w:left w:val="single" w:sz="4" w:space="0" w:color="auto"/>
@@ -1997,7 +2407,7 @@
         </w:tc>
         <w:tc>
           <w:tcPr>
-            <w:tcW w:w="4037" w:type="dxa"/>
+            <w:tcW w:w="4338" w:type="dxa"/>
             <w:tcBorders>
               <w:top w:val="nil"/>
               <w:left w:val="nil"/>
@@ -2037,7 +2447,7 @@
         </w:tc>
         <w:tc>
           <w:tcPr>
-            <w:tcW w:w="3427" w:type="dxa"/>
+            <w:tcW w:w="3889" w:type="dxa"/>
             <w:tcBorders>
               <w:top w:val="nil"/>
               <w:left w:val="nil"/>
@@ -2082,7 +2492,7 @@
         </w:trPr>
         <w:tc>
           <w:tcPr>
-            <w:tcW w:w="1030" w:type="dxa"/>
+            <w:tcW w:w="1123" w:type="dxa"/>
             <w:tcBorders>
               <w:top w:val="nil"/>
               <w:left w:val="single" w:sz="4" w:space="0" w:color="auto"/>
@@ -2116,13 +2526,14 @@
                 <w:lang w:val="es-DO" w:eastAsia="es-DO"/>
                 <w14:ligatures w14:val="none"/>
               </w:rPr>
+              <w:lastRenderedPageBreak/>
               <w:t>Filas / Columnas</w:t>
             </w:r>
           </w:p>
         </w:tc>
         <w:tc>
           <w:tcPr>
-            <w:tcW w:w="4037" w:type="dxa"/>
+            <w:tcW w:w="4338" w:type="dxa"/>
             <w:tcBorders>
               <w:top w:val="nil"/>
               <w:left w:val="nil"/>
@@ -2162,7 +2573,7 @@
         </w:tc>
         <w:tc>
           <w:tcPr>
-            <w:tcW w:w="3427" w:type="dxa"/>
+            <w:tcW w:w="3889" w:type="dxa"/>
             <w:tcBorders>
               <w:top w:val="nil"/>
               <w:left w:val="nil"/>
@@ -2207,7 +2618,7 @@
         </w:trPr>
         <w:tc>
           <w:tcPr>
-            <w:tcW w:w="1030" w:type="dxa"/>
+            <w:tcW w:w="1123" w:type="dxa"/>
             <w:tcBorders>
               <w:top w:val="nil"/>
               <w:left w:val="single" w:sz="4" w:space="0" w:color="auto"/>
@@ -2247,7 +2658,7 @@
         </w:tc>
         <w:tc>
           <w:tcPr>
-            <w:tcW w:w="4037" w:type="dxa"/>
+            <w:tcW w:w="4338" w:type="dxa"/>
             <w:tcBorders>
               <w:top w:val="nil"/>
               <w:left w:val="nil"/>
@@ -2301,7 +2712,7 @@
         </w:tc>
         <w:tc>
           <w:tcPr>
-            <w:tcW w:w="3427" w:type="dxa"/>
+            <w:tcW w:w="3889" w:type="dxa"/>
             <w:tcBorders>
               <w:top w:val="nil"/>
               <w:left w:val="nil"/>
@@ -2346,7 +2757,7 @@
         </w:trPr>
         <w:tc>
           <w:tcPr>
-            <w:tcW w:w="1030" w:type="dxa"/>
+            <w:tcW w:w="1123" w:type="dxa"/>
             <w:tcBorders>
               <w:top w:val="nil"/>
               <w:left w:val="single" w:sz="4" w:space="0" w:color="auto"/>
@@ -2386,7 +2797,7 @@
         </w:tc>
         <w:tc>
           <w:tcPr>
-            <w:tcW w:w="4037" w:type="dxa"/>
+            <w:tcW w:w="4338" w:type="dxa"/>
             <w:tcBorders>
               <w:top w:val="nil"/>
               <w:left w:val="nil"/>
@@ -2426,7 +2837,7 @@
         </w:tc>
         <w:tc>
           <w:tcPr>
-            <w:tcW w:w="3427" w:type="dxa"/>
+            <w:tcW w:w="3889" w:type="dxa"/>
             <w:tcBorders>
               <w:top w:val="nil"/>
               <w:left w:val="nil"/>
@@ -2497,7 +2908,7 @@
         </w:trPr>
         <w:tc>
           <w:tcPr>
-            <w:tcW w:w="1030" w:type="dxa"/>
+            <w:tcW w:w="1123" w:type="dxa"/>
             <w:tcBorders>
               <w:top w:val="nil"/>
               <w:left w:val="single" w:sz="4" w:space="0" w:color="auto"/>
@@ -2537,7 +2948,7 @@
         </w:tc>
         <w:tc>
           <w:tcPr>
-            <w:tcW w:w="4037" w:type="dxa"/>
+            <w:tcW w:w="4338" w:type="dxa"/>
             <w:tcBorders>
               <w:top w:val="nil"/>
               <w:left w:val="nil"/>
@@ -2577,7 +2988,7 @@
         </w:tc>
         <w:tc>
           <w:tcPr>
-            <w:tcW w:w="3427" w:type="dxa"/>
+            <w:tcW w:w="3889" w:type="dxa"/>
             <w:tcBorders>
               <w:top w:val="nil"/>
               <w:left w:val="nil"/>
@@ -2622,7 +3033,7 @@
         </w:trPr>
         <w:tc>
           <w:tcPr>
-            <w:tcW w:w="1030" w:type="dxa"/>
+            <w:tcW w:w="1123" w:type="dxa"/>
             <w:tcBorders>
               <w:top w:val="nil"/>
               <w:left w:val="single" w:sz="4" w:space="0" w:color="auto"/>
@@ -2662,7 +3073,7 @@
         </w:tc>
         <w:tc>
           <w:tcPr>
-            <w:tcW w:w="4037" w:type="dxa"/>
+            <w:tcW w:w="4338" w:type="dxa"/>
             <w:tcBorders>
               <w:top w:val="nil"/>
               <w:left w:val="nil"/>
@@ -2702,7 +3113,7 @@
         </w:tc>
         <w:tc>
           <w:tcPr>
-            <w:tcW w:w="3427" w:type="dxa"/>
+            <w:tcW w:w="3889" w:type="dxa"/>
             <w:tcBorders>
               <w:top w:val="nil"/>
               <w:left w:val="nil"/>
@@ -2747,7 +3158,7 @@
         </w:trPr>
         <w:tc>
           <w:tcPr>
-            <w:tcW w:w="1030" w:type="dxa"/>
+            <w:tcW w:w="1123" w:type="dxa"/>
             <w:tcBorders>
               <w:top w:val="nil"/>
               <w:left w:val="single" w:sz="4" w:space="0" w:color="auto"/>
@@ -2787,7 +3198,7 @@
         </w:tc>
         <w:tc>
           <w:tcPr>
-            <w:tcW w:w="4037" w:type="dxa"/>
+            <w:tcW w:w="4338" w:type="dxa"/>
             <w:tcBorders>
               <w:top w:val="nil"/>
               <w:left w:val="nil"/>
@@ -2827,7 +3238,7 @@
         </w:tc>
         <w:tc>
           <w:tcPr>
-            <w:tcW w:w="3427" w:type="dxa"/>
+            <w:tcW w:w="3889" w:type="dxa"/>
             <w:tcBorders>
               <w:top w:val="nil"/>
               <w:left w:val="nil"/>
@@ -2901,29 +3312,2510 @@
           <w:bCs/>
           <w:lang w:val="es-DO"/>
         </w:rPr>
-        <w:t xml:space="preserve">Enlace Repositorio </w:t>
-      </w:r>
-      <w:r>
+        <w:t>3. Tabla Principal de Resultados</w:t>
+      </w:r>
+    </w:p>
+    <w:p>
+      <w:pPr>
+        <w:tabs>
+          <w:tab w:val="left" w:pos="5364"/>
+        </w:tabs>
+        <w:jc w:val="both"/>
+        <w:rPr>
+          <w:rFonts w:ascii="Times New Roman" w:hAnsi="Times New Roman" w:cs="Times New Roman"/>
+          <w:lang w:val="es-DO"/>
+        </w:rPr>
+      </w:pPr>
+      <w:r>
+        <w:rPr>
+          <w:rFonts w:ascii="Times New Roman" w:hAnsi="Times New Roman" w:cs="Times New Roman"/>
+          <w:lang w:val="es-DO"/>
+        </w:rPr>
+        <w:t>La evaluación se realizó sobre el conjunto de prueba independiente (</w:t>
+      </w:r>
+      <w:proofErr w:type="spellStart"/>
+      <w:r>
+        <w:rPr>
+          <w:rFonts w:ascii="Times New Roman" w:hAnsi="Times New Roman" w:cs="Times New Roman"/>
+          <w:i/>
+          <w:iCs/>
+          <w:lang w:val="es-DO"/>
+        </w:rPr>
+        <w:t>hold</w:t>
+      </w:r>
+      <w:proofErr w:type="spellEnd"/>
+      <w:r>
+        <w:rPr>
+          <w:rFonts w:ascii="Times New Roman" w:hAnsi="Times New Roman" w:cs="Times New Roman"/>
+          <w:i/>
+          <w:iCs/>
+          <w:lang w:val="es-DO"/>
+        </w:rPr>
+        <w:t>-out</w:t>
+      </w:r>
+      <w:r>
+        <w:rPr>
+          <w:rFonts w:ascii="Times New Roman" w:hAnsi="Times New Roman" w:cs="Times New Roman"/>
+          <w:lang w:val="es-DO"/>
+        </w:rPr>
+        <w:t xml:space="preserve">, </w:t>
+      </w:r>
+      <m:oMath>
+        <m:r>
+          <w:rPr>
+            <w:rFonts w:ascii="Cambria Math" w:hAnsi="Cambria Math" w:cs="Times New Roman"/>
+            <w:lang w:val="es-DO"/>
+          </w:rPr>
+          <m:t>N=200</m:t>
+        </m:r>
+      </m:oMath>
+      <w:r>
+        <w:rPr>
+          <w:rFonts w:ascii="Times New Roman" w:hAnsi="Times New Roman" w:cs="Times New Roman"/>
+          <w:lang w:val="es-DO"/>
+        </w:rPr>
+        <w:t>) con preprocesamiento integrado en Pipeline libre de fuga de información (</w:t>
+      </w:r>
+      <w:r>
+        <w:rPr>
+          <w:rFonts w:ascii="Times New Roman" w:hAnsi="Times New Roman" w:cs="Times New Roman"/>
+          <w:i/>
+          <w:iCs/>
+          <w:lang w:val="es-DO"/>
+        </w:rPr>
+        <w:t xml:space="preserve">data </w:t>
+      </w:r>
+      <w:proofErr w:type="spellStart"/>
+      <w:r>
+        <w:rPr>
+          <w:rFonts w:ascii="Times New Roman" w:hAnsi="Times New Roman" w:cs="Times New Roman"/>
+          <w:i/>
+          <w:iCs/>
+          <w:lang w:val="es-DO"/>
+        </w:rPr>
+        <w:t>leakage</w:t>
+      </w:r>
+      <w:proofErr w:type="spellEnd"/>
+      <w:r>
+        <w:rPr>
+          <w:rFonts w:ascii="Times New Roman" w:hAnsi="Times New Roman" w:cs="Times New Roman"/>
+          <w:lang w:val="es-DO"/>
+        </w:rPr>
+        <w:t>):</w:t>
+      </w:r>
+    </w:p>
+    <w:p>
+      <w:pPr>
+        <w:tabs>
+          <w:tab w:val="left" w:pos="5364"/>
+        </w:tabs>
+        <w:jc w:val="both"/>
+        <w:rPr>
+          <w:rFonts w:ascii="Times New Roman" w:hAnsi="Times New Roman" w:cs="Times New Roman"/>
+          <w:lang w:val="es-DO"/>
+        </w:rPr>
+      </w:pPr>
+    </w:p>
+    <w:tbl>
+      <w:tblPr>
+        <w:tblW w:w="9349" w:type="dxa"/>
+        <w:tblBorders>
+          <w:top w:val="single" w:sz="4" w:space="0" w:color="auto"/>
+          <w:left w:val="single" w:sz="4" w:space="0" w:color="auto"/>
+          <w:bottom w:val="single" w:sz="4" w:space="0" w:color="auto"/>
+          <w:right w:val="single" w:sz="4" w:space="0" w:color="auto"/>
+          <w:insideH w:val="single" w:sz="4" w:space="0" w:color="auto"/>
+          <w:insideV w:val="single" w:sz="4" w:space="0" w:color="auto"/>
+        </w:tblBorders>
+        <w:tblCellMar>
+          <w:left w:w="70" w:type="dxa"/>
+          <w:right w:w="70" w:type="dxa"/>
+        </w:tblCellMar>
+        <w:tblLook w:val="04A0" w:firstRow="1" w:lastRow="0" w:firstColumn="1" w:lastColumn="0" w:noHBand="0" w:noVBand="1"/>
+      </w:tblPr>
+      <w:tblGrid>
+        <w:gridCol w:w="2547"/>
+        <w:gridCol w:w="1530"/>
+        <w:gridCol w:w="1352"/>
+        <w:gridCol w:w="1853"/>
+        <w:gridCol w:w="1033"/>
+        <w:gridCol w:w="1034"/>
+      </w:tblGrid>
+      <w:tr>
+        <w:trPr>
+          <w:trHeight w:val="1107"/>
+        </w:trPr>
+        <w:tc>
+          <w:tcPr>
+            <w:tcW w:w="2547" w:type="dxa"/>
+            <w:vAlign w:val="center"/>
+            <w:hideMark/>
+          </w:tcPr>
+          <w:p>
+            <w:pPr>
+              <w:spacing w:after="0" w:line="240" w:lineRule="auto"/>
+              <w:ind w:firstLineChars="100" w:firstLine="221"/>
+              <w:rPr>
+                <w:rFonts w:ascii="Arial" w:eastAsia="Times New Roman" w:hAnsi="Arial" w:cs="Arial"/>
+                <w:b/>
+                <w:bCs/>
+                <w:color w:val="000000"/>
+                <w:kern w:val="0"/>
+                <w:sz w:val="22"/>
+                <w:szCs w:val="22"/>
+                <w:lang w:val="es-DO" w:eastAsia="es-DO"/>
+                <w14:ligatures w14:val="none"/>
+              </w:rPr>
+            </w:pPr>
+            <w:r>
+              <w:rPr>
+                <w:rFonts w:ascii="Arial" w:eastAsia="Times New Roman" w:hAnsi="Arial" w:cs="Arial"/>
+                <w:b/>
+                <w:bCs/>
+                <w:color w:val="000000"/>
+                <w:kern w:val="0"/>
+                <w:sz w:val="22"/>
+                <w:szCs w:val="22"/>
+                <w:lang w:val="es-DO" w:eastAsia="es-DO"/>
+                <w14:ligatures w14:val="none"/>
+              </w:rPr>
+              <w:t>Modelo / Configuración</w:t>
+            </w:r>
+          </w:p>
+        </w:tc>
+        <w:tc>
+          <w:tcPr>
+            <w:tcW w:w="1530" w:type="dxa"/>
+            <w:vAlign w:val="center"/>
+            <w:hideMark/>
+          </w:tcPr>
+          <w:p>
+            <w:pPr>
+              <w:spacing w:after="0" w:line="240" w:lineRule="auto"/>
+              <w:ind w:firstLineChars="100" w:firstLine="221"/>
+              <w:rPr>
+                <w:rFonts w:ascii="Arial" w:eastAsia="Times New Roman" w:hAnsi="Arial" w:cs="Arial"/>
+                <w:b/>
+                <w:bCs/>
+                <w:color w:val="000000"/>
+                <w:kern w:val="0"/>
+                <w:sz w:val="22"/>
+                <w:szCs w:val="22"/>
+                <w:lang w:val="es-DO" w:eastAsia="es-DO"/>
+                <w14:ligatures w14:val="none"/>
+              </w:rPr>
+            </w:pPr>
+            <w:r>
+              <w:rPr>
+                <w:rFonts w:ascii="Arial" w:eastAsia="Times New Roman" w:hAnsi="Arial" w:cs="Arial"/>
+                <w:b/>
+                <w:bCs/>
+                <w:color w:val="000000"/>
+                <w:kern w:val="0"/>
+                <w:sz w:val="22"/>
+                <w:szCs w:val="22"/>
+                <w:lang w:val="es-DO" w:eastAsia="es-DO"/>
+                <w14:ligatures w14:val="none"/>
+              </w:rPr>
+              <w:t>Exactitud (Accuracy)</w:t>
+            </w:r>
+          </w:p>
+        </w:tc>
+        <w:tc>
+          <w:tcPr>
+            <w:tcW w:w="1352" w:type="dxa"/>
+            <w:vAlign w:val="center"/>
+            <w:hideMark/>
+          </w:tcPr>
+          <w:p>
+            <w:pPr>
+              <w:spacing w:after="0" w:line="240" w:lineRule="auto"/>
+              <w:ind w:firstLineChars="100" w:firstLine="221"/>
+              <w:rPr>
+                <w:rFonts w:ascii="Arial" w:eastAsia="Times New Roman" w:hAnsi="Arial" w:cs="Arial"/>
+                <w:b/>
+                <w:bCs/>
+                <w:color w:val="000000"/>
+                <w:kern w:val="0"/>
+                <w:sz w:val="22"/>
+                <w:szCs w:val="22"/>
+                <w:lang w:val="es-DO" w:eastAsia="es-DO"/>
+                <w14:ligatures w14:val="none"/>
+              </w:rPr>
+            </w:pPr>
+            <w:r>
+              <w:rPr>
+                <w:rFonts w:ascii="Arial" w:eastAsia="Times New Roman" w:hAnsi="Arial" w:cs="Arial"/>
+                <w:b/>
+                <w:bCs/>
+                <w:color w:val="000000"/>
+                <w:kern w:val="0"/>
+                <w:sz w:val="22"/>
+                <w:szCs w:val="22"/>
+                <w:lang w:val="es-DO" w:eastAsia="es-DO"/>
+                <w14:ligatures w14:val="none"/>
+              </w:rPr>
+              <w:t>Precisión Macro</w:t>
+            </w:r>
+          </w:p>
+        </w:tc>
+        <w:tc>
+          <w:tcPr>
+            <w:tcW w:w="1853" w:type="dxa"/>
+            <w:vAlign w:val="center"/>
+            <w:hideMark/>
+          </w:tcPr>
+          <w:p>
+            <w:pPr>
+              <w:spacing w:after="0" w:line="240" w:lineRule="auto"/>
+              <w:ind w:firstLineChars="100" w:firstLine="221"/>
+              <w:rPr>
+                <w:rFonts w:ascii="Arial" w:eastAsia="Times New Roman" w:hAnsi="Arial" w:cs="Arial"/>
+                <w:b/>
+                <w:bCs/>
+                <w:color w:val="000000"/>
+                <w:kern w:val="0"/>
+                <w:sz w:val="22"/>
+                <w:szCs w:val="22"/>
+                <w:lang w:val="es-DO" w:eastAsia="es-DO"/>
+                <w14:ligatures w14:val="none"/>
+              </w:rPr>
+            </w:pPr>
+            <w:r>
+              <w:rPr>
+                <w:rFonts w:ascii="Arial" w:eastAsia="Times New Roman" w:hAnsi="Arial" w:cs="Arial"/>
+                <w:b/>
+                <w:bCs/>
+                <w:color w:val="000000"/>
+                <w:kern w:val="0"/>
+                <w:sz w:val="22"/>
+                <w:szCs w:val="22"/>
+                <w:lang w:val="es-DO" w:eastAsia="es-DO"/>
+                <w14:ligatures w14:val="none"/>
+              </w:rPr>
+              <w:t>Exhaustividad (</w:t>
+            </w:r>
+            <w:proofErr w:type="spellStart"/>
+            <w:r>
+              <w:rPr>
+                <w:rFonts w:ascii="Arial" w:eastAsia="Times New Roman" w:hAnsi="Arial" w:cs="Arial"/>
+                <w:b/>
+                <w:bCs/>
+                <w:color w:val="000000"/>
+                <w:kern w:val="0"/>
+                <w:sz w:val="22"/>
+                <w:szCs w:val="22"/>
+                <w:lang w:val="es-DO" w:eastAsia="es-DO"/>
+                <w14:ligatures w14:val="none"/>
+              </w:rPr>
+              <w:t>Recall</w:t>
+            </w:r>
+            <w:proofErr w:type="spellEnd"/>
+            <w:r>
+              <w:rPr>
+                <w:rFonts w:ascii="Arial" w:eastAsia="Times New Roman" w:hAnsi="Arial" w:cs="Arial"/>
+                <w:b/>
+                <w:bCs/>
+                <w:color w:val="000000"/>
+                <w:kern w:val="0"/>
+                <w:sz w:val="22"/>
+                <w:szCs w:val="22"/>
+                <w:lang w:val="es-DO" w:eastAsia="es-DO"/>
+                <w14:ligatures w14:val="none"/>
+              </w:rPr>
+              <w:t xml:space="preserve"> Macro)</w:t>
+            </w:r>
+          </w:p>
+        </w:tc>
+        <w:tc>
+          <w:tcPr>
+            <w:tcW w:w="1033" w:type="dxa"/>
+            <w:vAlign w:val="center"/>
+            <w:hideMark/>
+          </w:tcPr>
+          <w:p>
+            <w:pPr>
+              <w:spacing w:after="0" w:line="240" w:lineRule="auto"/>
+              <w:ind w:firstLineChars="100" w:firstLine="221"/>
+              <w:rPr>
+                <w:rFonts w:ascii="Arial" w:eastAsia="Times New Roman" w:hAnsi="Arial" w:cs="Arial"/>
+                <w:b/>
+                <w:bCs/>
+                <w:color w:val="000000"/>
+                <w:kern w:val="0"/>
+                <w:sz w:val="22"/>
+                <w:szCs w:val="22"/>
+                <w:lang w:val="es-DO" w:eastAsia="es-DO"/>
+                <w14:ligatures w14:val="none"/>
+              </w:rPr>
+            </w:pPr>
+            <w:r>
+              <w:rPr>
+                <w:rFonts w:ascii="Arial" w:eastAsia="Times New Roman" w:hAnsi="Arial" w:cs="Arial"/>
+                <w:b/>
+                <w:bCs/>
+                <w:color w:val="000000"/>
+                <w:kern w:val="0"/>
+                <w:sz w:val="22"/>
+                <w:szCs w:val="22"/>
+                <w:lang w:val="es-DO" w:eastAsia="es-DO"/>
+                <w14:ligatures w14:val="none"/>
+              </w:rPr>
+              <w:t>F1-Score (Clase 2 - Riesgo)</w:t>
+            </w:r>
+          </w:p>
+        </w:tc>
+        <w:tc>
+          <w:tcPr>
+            <w:tcW w:w="1034" w:type="dxa"/>
+            <w:vAlign w:val="center"/>
+            <w:hideMark/>
+          </w:tcPr>
+          <w:p>
+            <w:pPr>
+              <w:spacing w:after="0" w:line="240" w:lineRule="auto"/>
+              <w:ind w:firstLineChars="100" w:firstLine="221"/>
+              <w:rPr>
+                <w:rFonts w:ascii="Arial" w:eastAsia="Times New Roman" w:hAnsi="Arial" w:cs="Arial"/>
+                <w:b/>
+                <w:bCs/>
+                <w:color w:val="000000"/>
+                <w:kern w:val="0"/>
+                <w:sz w:val="22"/>
+                <w:szCs w:val="22"/>
+                <w:lang w:val="es-DO" w:eastAsia="es-DO"/>
+                <w14:ligatures w14:val="none"/>
+              </w:rPr>
+            </w:pPr>
+            <w:r>
+              <w:rPr>
+                <w:rFonts w:ascii="Arial" w:eastAsia="Times New Roman" w:hAnsi="Arial" w:cs="Arial"/>
+                <w:b/>
+                <w:bCs/>
+                <w:color w:val="000000"/>
+                <w:kern w:val="0"/>
+                <w:sz w:val="22"/>
+                <w:szCs w:val="22"/>
+                <w:lang w:val="es-DO" w:eastAsia="es-DO"/>
+                <w14:ligatures w14:val="none"/>
+              </w:rPr>
+              <w:t>F1-Score Macro</w:t>
+            </w:r>
+          </w:p>
+        </w:tc>
+      </w:tr>
+      <w:tr>
+        <w:trPr>
+          <w:trHeight w:val="566"/>
+        </w:trPr>
+        <w:tc>
+          <w:tcPr>
+            <w:tcW w:w="2547" w:type="dxa"/>
+            <w:vAlign w:val="center"/>
+            <w:hideMark/>
+          </w:tcPr>
+          <w:p>
+            <w:pPr>
+              <w:spacing w:after="0" w:line="240" w:lineRule="auto"/>
+              <w:ind w:firstLineChars="100" w:firstLine="220"/>
+              <w:jc w:val="center"/>
+              <w:rPr>
+                <w:rFonts w:ascii="Arial" w:eastAsia="Times New Roman" w:hAnsi="Arial" w:cs="Arial"/>
+                <w:color w:val="000000"/>
+                <w:kern w:val="0"/>
+                <w:sz w:val="22"/>
+                <w:szCs w:val="22"/>
+                <w:lang w:val="es-DO" w:eastAsia="es-DO"/>
+                <w14:ligatures w14:val="none"/>
+              </w:rPr>
+            </w:pPr>
+            <w:proofErr w:type="spellStart"/>
+            <w:r>
+              <w:rPr>
+                <w:rFonts w:ascii="Arial" w:eastAsia="Times New Roman" w:hAnsi="Arial" w:cs="Arial"/>
+                <w:color w:val="000000"/>
+                <w:kern w:val="0"/>
+                <w:sz w:val="22"/>
+                <w:szCs w:val="22"/>
+                <w:lang w:val="es-DO" w:eastAsia="es-DO"/>
+                <w14:ligatures w14:val="none"/>
+              </w:rPr>
+              <w:t>Dummy</w:t>
+            </w:r>
+            <w:proofErr w:type="spellEnd"/>
+            <w:r>
+              <w:rPr>
+                <w:rFonts w:ascii="Arial" w:eastAsia="Times New Roman" w:hAnsi="Arial" w:cs="Arial"/>
+                <w:color w:val="000000"/>
+                <w:kern w:val="0"/>
+                <w:sz w:val="22"/>
+                <w:szCs w:val="22"/>
+                <w:lang w:val="es-DO" w:eastAsia="es-DO"/>
+                <w14:ligatures w14:val="none"/>
+              </w:rPr>
+              <w:t xml:space="preserve"> Classifier (</w:t>
+            </w:r>
+            <w:r>
+              <w:rPr>
+                <w:rFonts w:ascii="Arial" w:eastAsia="Times New Roman" w:hAnsi="Arial" w:cs="Arial"/>
+                <w:i/>
+                <w:iCs/>
+                <w:color w:val="000000"/>
+                <w:kern w:val="0"/>
+                <w:sz w:val="22"/>
+                <w:szCs w:val="22"/>
+                <w:lang w:val="es-DO" w:eastAsia="es-DO"/>
+                <w14:ligatures w14:val="none"/>
+              </w:rPr>
+              <w:t xml:space="preserve">Most </w:t>
+            </w:r>
+            <w:proofErr w:type="spellStart"/>
+            <w:r>
+              <w:rPr>
+                <w:rFonts w:ascii="Arial" w:eastAsia="Times New Roman" w:hAnsi="Arial" w:cs="Arial"/>
+                <w:i/>
+                <w:iCs/>
+                <w:color w:val="000000"/>
+                <w:kern w:val="0"/>
+                <w:sz w:val="22"/>
+                <w:szCs w:val="22"/>
+                <w:lang w:val="es-DO" w:eastAsia="es-DO"/>
+                <w14:ligatures w14:val="none"/>
+              </w:rPr>
+              <w:t>Frequent</w:t>
+            </w:r>
+            <w:proofErr w:type="spellEnd"/>
+            <w:r>
+              <w:rPr>
+                <w:rFonts w:ascii="Arial" w:eastAsia="Times New Roman" w:hAnsi="Arial" w:cs="Arial"/>
+                <w:color w:val="000000"/>
+                <w:kern w:val="0"/>
+                <w:sz w:val="22"/>
+                <w:szCs w:val="22"/>
+                <w:lang w:val="es-DO" w:eastAsia="es-DO"/>
+                <w14:ligatures w14:val="none"/>
+              </w:rPr>
+              <w:t>)</w:t>
+            </w:r>
+          </w:p>
+        </w:tc>
+        <w:tc>
+          <w:tcPr>
+            <w:tcW w:w="1530" w:type="dxa"/>
+            <w:vAlign w:val="center"/>
+            <w:hideMark/>
+          </w:tcPr>
+          <w:p>
+            <w:pPr>
+              <w:spacing w:after="0" w:line="240" w:lineRule="auto"/>
+              <w:ind w:firstLineChars="100" w:firstLine="220"/>
+              <w:rPr>
+                <w:rFonts w:ascii="Arial" w:eastAsia="Times New Roman" w:hAnsi="Arial" w:cs="Arial"/>
+                <w:color w:val="000000"/>
+                <w:kern w:val="0"/>
+                <w:sz w:val="22"/>
+                <w:szCs w:val="22"/>
+                <w:lang w:val="es-DO" w:eastAsia="es-DO"/>
+                <w14:ligatures w14:val="none"/>
+              </w:rPr>
+            </w:pPr>
+            <w:r>
+              <w:rPr>
+                <w:rFonts w:ascii="Arial" w:eastAsia="Times New Roman" w:hAnsi="Arial" w:cs="Arial"/>
+                <w:color w:val="000000"/>
+                <w:kern w:val="0"/>
+                <w:sz w:val="22"/>
+                <w:szCs w:val="22"/>
+                <w:lang w:val="es-DO" w:eastAsia="es-DO"/>
+                <w14:ligatures w14:val="none"/>
+              </w:rPr>
+              <w:t>0.7</w:t>
+            </w:r>
+          </w:p>
+        </w:tc>
+        <w:tc>
+          <w:tcPr>
+            <w:tcW w:w="1352" w:type="dxa"/>
+            <w:vAlign w:val="center"/>
+            <w:hideMark/>
+          </w:tcPr>
+          <w:p>
+            <w:pPr>
+              <w:spacing w:after="0" w:line="240" w:lineRule="auto"/>
+              <w:ind w:firstLineChars="100" w:firstLine="220"/>
+              <w:rPr>
+                <w:rFonts w:ascii="Arial" w:eastAsia="Times New Roman" w:hAnsi="Arial" w:cs="Arial"/>
+                <w:color w:val="000000"/>
+                <w:kern w:val="0"/>
+                <w:sz w:val="22"/>
+                <w:szCs w:val="22"/>
+                <w:lang w:val="es-DO" w:eastAsia="es-DO"/>
+                <w14:ligatures w14:val="none"/>
+              </w:rPr>
+            </w:pPr>
+            <w:r>
+              <w:rPr>
+                <w:rFonts w:ascii="Arial" w:eastAsia="Times New Roman" w:hAnsi="Arial" w:cs="Arial"/>
+                <w:color w:val="000000"/>
+                <w:kern w:val="0"/>
+                <w:sz w:val="22"/>
+                <w:szCs w:val="22"/>
+                <w:lang w:val="es-DO" w:eastAsia="es-DO"/>
+                <w14:ligatures w14:val="none"/>
+              </w:rPr>
+              <w:t>0.35</w:t>
+            </w:r>
+          </w:p>
+        </w:tc>
+        <w:tc>
+          <w:tcPr>
+            <w:tcW w:w="1853" w:type="dxa"/>
+            <w:vAlign w:val="center"/>
+            <w:hideMark/>
+          </w:tcPr>
+          <w:p>
+            <w:pPr>
+              <w:spacing w:after="0" w:line="240" w:lineRule="auto"/>
+              <w:ind w:firstLineChars="100" w:firstLine="220"/>
+              <w:rPr>
+                <w:rFonts w:ascii="Arial" w:eastAsia="Times New Roman" w:hAnsi="Arial" w:cs="Arial"/>
+                <w:color w:val="000000"/>
+                <w:kern w:val="0"/>
+                <w:sz w:val="22"/>
+                <w:szCs w:val="22"/>
+                <w:lang w:val="es-DO" w:eastAsia="es-DO"/>
+                <w14:ligatures w14:val="none"/>
+              </w:rPr>
+            </w:pPr>
+            <w:r>
+              <w:rPr>
+                <w:rFonts w:ascii="Arial" w:eastAsia="Times New Roman" w:hAnsi="Arial" w:cs="Arial"/>
+                <w:color w:val="000000"/>
+                <w:kern w:val="0"/>
+                <w:sz w:val="22"/>
+                <w:szCs w:val="22"/>
+                <w:lang w:val="es-DO" w:eastAsia="es-DO"/>
+                <w14:ligatures w14:val="none"/>
+              </w:rPr>
+              <w:t>0.5</w:t>
+            </w:r>
+          </w:p>
+        </w:tc>
+        <w:tc>
+          <w:tcPr>
+            <w:tcW w:w="1033" w:type="dxa"/>
+            <w:vAlign w:val="center"/>
+            <w:hideMark/>
+          </w:tcPr>
+          <w:p>
+            <w:pPr>
+              <w:spacing w:after="0" w:line="240" w:lineRule="auto"/>
+              <w:ind w:firstLineChars="100" w:firstLine="220"/>
+              <w:rPr>
+                <w:rFonts w:ascii="Arial" w:eastAsia="Times New Roman" w:hAnsi="Arial" w:cs="Arial"/>
+                <w:color w:val="000000"/>
+                <w:kern w:val="0"/>
+                <w:sz w:val="22"/>
+                <w:szCs w:val="22"/>
+                <w:lang w:val="es-DO" w:eastAsia="es-DO"/>
+                <w14:ligatures w14:val="none"/>
+              </w:rPr>
+            </w:pPr>
+            <w:r>
+              <w:rPr>
+                <w:rFonts w:ascii="Arial" w:eastAsia="Times New Roman" w:hAnsi="Arial" w:cs="Arial"/>
+                <w:color w:val="000000"/>
+                <w:kern w:val="0"/>
+                <w:sz w:val="22"/>
+                <w:szCs w:val="22"/>
+                <w:lang w:val="es-DO" w:eastAsia="es-DO"/>
+                <w14:ligatures w14:val="none"/>
+              </w:rPr>
+              <w:t>0</w:t>
+            </w:r>
+          </w:p>
+        </w:tc>
+        <w:tc>
+          <w:tcPr>
+            <w:tcW w:w="1034" w:type="dxa"/>
+            <w:vAlign w:val="center"/>
+            <w:hideMark/>
+          </w:tcPr>
+          <w:p>
+            <w:pPr>
+              <w:spacing w:after="0" w:line="240" w:lineRule="auto"/>
+              <w:ind w:firstLineChars="100" w:firstLine="220"/>
+              <w:rPr>
+                <w:rFonts w:ascii="Arial" w:eastAsia="Times New Roman" w:hAnsi="Arial" w:cs="Arial"/>
+                <w:color w:val="000000"/>
+                <w:kern w:val="0"/>
+                <w:sz w:val="22"/>
+                <w:szCs w:val="22"/>
+                <w:lang w:val="es-DO" w:eastAsia="es-DO"/>
+                <w14:ligatures w14:val="none"/>
+              </w:rPr>
+            </w:pPr>
+            <w:r>
+              <w:rPr>
+                <w:rFonts w:ascii="Arial" w:eastAsia="Times New Roman" w:hAnsi="Arial" w:cs="Arial"/>
+                <w:color w:val="000000"/>
+                <w:kern w:val="0"/>
+                <w:sz w:val="22"/>
+                <w:szCs w:val="22"/>
+                <w:lang w:val="es-DO" w:eastAsia="es-DO"/>
+                <w14:ligatures w14:val="none"/>
+              </w:rPr>
+              <w:t>0.4118</w:t>
+            </w:r>
+          </w:p>
+        </w:tc>
+      </w:tr>
+      <w:tr>
+        <w:trPr>
+          <w:trHeight w:val="830"/>
+        </w:trPr>
+        <w:tc>
+          <w:tcPr>
+            <w:tcW w:w="2547" w:type="dxa"/>
+            <w:vAlign w:val="center"/>
+            <w:hideMark/>
+          </w:tcPr>
+          <w:p>
+            <w:pPr>
+              <w:spacing w:after="0" w:line="240" w:lineRule="auto"/>
+              <w:ind w:firstLineChars="100" w:firstLine="220"/>
+              <w:jc w:val="center"/>
+              <w:rPr>
+                <w:rFonts w:ascii="Arial" w:eastAsia="Times New Roman" w:hAnsi="Arial" w:cs="Arial"/>
+                <w:color w:val="000000"/>
+                <w:kern w:val="0"/>
+                <w:sz w:val="22"/>
+                <w:szCs w:val="22"/>
+                <w:lang w:val="en-US" w:eastAsia="es-DO"/>
+                <w14:ligatures w14:val="none"/>
+              </w:rPr>
+            </w:pPr>
+            <w:r>
+              <w:rPr>
+                <w:rFonts w:ascii="Arial" w:eastAsia="Times New Roman" w:hAnsi="Arial" w:cs="Arial"/>
+                <w:color w:val="000000"/>
+                <w:kern w:val="0"/>
+                <w:sz w:val="22"/>
+                <w:szCs w:val="22"/>
+                <w:lang w:val="en-US" w:eastAsia="es-DO"/>
+                <w14:ligatures w14:val="none"/>
+              </w:rPr>
+              <w:t>SVM Base (</w:t>
+            </w:r>
+            <m:oMath>
+              <m:r>
+                <w:rPr>
+                  <w:rFonts w:ascii="Cambria Math" w:eastAsia="Times New Roman" w:hAnsi="Cambria Math" w:cs="Arial"/>
+                  <w:color w:val="000000"/>
+                  <w:kern w:val="0"/>
+                  <w:sz w:val="22"/>
+                  <w:szCs w:val="22"/>
+                  <w:lang w:val="es-DO" w:eastAsia="es-DO"/>
+                  <w14:ligatures w14:val="none"/>
+                </w:rPr>
+                <m:t>C</m:t>
+              </m:r>
+              <m:r>
+                <w:rPr>
+                  <w:rFonts w:ascii="Cambria Math" w:eastAsia="Times New Roman" w:hAnsi="Cambria Math" w:cs="Arial"/>
+                  <w:color w:val="000000"/>
+                  <w:kern w:val="0"/>
+                  <w:sz w:val="22"/>
+                  <w:szCs w:val="22"/>
+                  <w:lang w:val="en-US" w:eastAsia="es-DO"/>
+                  <w14:ligatures w14:val="none"/>
+                </w:rPr>
+                <m:t>=1.0,</m:t>
+              </m:r>
+              <m:r>
+                <w:rPr>
+                  <w:rFonts w:ascii="Cambria Math" w:eastAsia="Times New Roman" w:hAnsi="Cambria Math" w:cs="Arial"/>
+                  <w:color w:val="000000"/>
+                  <w:kern w:val="0"/>
+                  <w:sz w:val="22"/>
+                  <w:szCs w:val="22"/>
+                  <w:lang w:val="es-DO" w:eastAsia="es-DO"/>
+                  <w14:ligatures w14:val="none"/>
+                </w:rPr>
+                <m:t>γ</m:t>
+              </m:r>
+              <m:r>
+                <w:rPr>
+                  <w:rFonts w:ascii="Cambria Math" w:eastAsia="Times New Roman" w:hAnsi="Cambria Math" w:cs="Arial"/>
+                  <w:color w:val="000000"/>
+                  <w:kern w:val="0"/>
+                  <w:sz w:val="22"/>
+                  <w:szCs w:val="22"/>
+                  <w:lang w:val="en-US" w:eastAsia="es-DO"/>
+                  <w14:ligatures w14:val="none"/>
+                </w:rPr>
+                <m:t>=</m:t>
+              </m:r>
+              <m:r>
+                <m:rPr>
+                  <m:nor/>
+                </m:rPr>
+                <w:rPr>
+                  <w:rFonts w:ascii="Arial" w:eastAsia="Times New Roman" w:hAnsi="Arial" w:cs="Arial"/>
+                  <w:color w:val="000000"/>
+                  <w:kern w:val="0"/>
+                  <w:sz w:val="22"/>
+                  <w:szCs w:val="22"/>
+                  <w:lang w:val="en-US" w:eastAsia="es-DO"/>
+                  <w14:ligatures w14:val="none"/>
+                </w:rPr>
+                <m:t>'scale'</m:t>
+              </m:r>
+            </m:oMath>
+            <w:r>
+              <w:rPr>
+                <w:rFonts w:ascii="Arial" w:eastAsia="Times New Roman" w:hAnsi="Arial" w:cs="Arial"/>
+                <w:color w:val="000000"/>
+                <w:kern w:val="0"/>
+                <w:sz w:val="22"/>
+                <w:szCs w:val="22"/>
+                <w:lang w:val="en-US" w:eastAsia="es-DO"/>
+                <w14:ligatures w14:val="none"/>
+              </w:rPr>
+              <w:t>)</w:t>
+            </w:r>
+          </w:p>
+        </w:tc>
+        <w:tc>
+          <w:tcPr>
+            <w:tcW w:w="1530" w:type="dxa"/>
+            <w:vAlign w:val="center"/>
+            <w:hideMark/>
+          </w:tcPr>
+          <w:p>
+            <w:pPr>
+              <w:spacing w:after="0" w:line="240" w:lineRule="auto"/>
+              <w:ind w:firstLineChars="100" w:firstLine="220"/>
+              <w:rPr>
+                <w:rFonts w:ascii="Arial" w:eastAsia="Times New Roman" w:hAnsi="Arial" w:cs="Arial"/>
+                <w:color w:val="000000"/>
+                <w:kern w:val="0"/>
+                <w:sz w:val="22"/>
+                <w:szCs w:val="22"/>
+                <w:lang w:val="es-DO" w:eastAsia="es-DO"/>
+                <w14:ligatures w14:val="none"/>
+              </w:rPr>
+            </w:pPr>
+            <w:r>
+              <w:rPr>
+                <w:rFonts w:ascii="Arial" w:eastAsia="Times New Roman" w:hAnsi="Arial" w:cs="Arial"/>
+                <w:color w:val="000000"/>
+                <w:kern w:val="0"/>
+                <w:sz w:val="22"/>
+                <w:szCs w:val="22"/>
+                <w:lang w:val="es-DO" w:eastAsia="es-DO"/>
+                <w14:ligatures w14:val="none"/>
+              </w:rPr>
+              <w:t>0.79</w:t>
+            </w:r>
+          </w:p>
+        </w:tc>
+        <w:tc>
+          <w:tcPr>
+            <w:tcW w:w="1352" w:type="dxa"/>
+            <w:vAlign w:val="center"/>
+            <w:hideMark/>
+          </w:tcPr>
+          <w:p>
+            <w:pPr>
+              <w:spacing w:after="0" w:line="240" w:lineRule="auto"/>
+              <w:ind w:firstLineChars="100" w:firstLine="220"/>
+              <w:rPr>
+                <w:rFonts w:ascii="Arial" w:eastAsia="Times New Roman" w:hAnsi="Arial" w:cs="Arial"/>
+                <w:color w:val="000000"/>
+                <w:kern w:val="0"/>
+                <w:sz w:val="22"/>
+                <w:szCs w:val="22"/>
+                <w:lang w:val="es-DO" w:eastAsia="es-DO"/>
+                <w14:ligatures w14:val="none"/>
+              </w:rPr>
+            </w:pPr>
+            <w:r>
+              <w:rPr>
+                <w:rFonts w:ascii="Arial" w:eastAsia="Times New Roman" w:hAnsi="Arial" w:cs="Arial"/>
+                <w:color w:val="000000"/>
+                <w:kern w:val="0"/>
+                <w:sz w:val="22"/>
+                <w:szCs w:val="22"/>
+                <w:lang w:val="es-DO" w:eastAsia="es-DO"/>
+                <w14:ligatures w14:val="none"/>
+              </w:rPr>
+              <w:t>0.7656</w:t>
+            </w:r>
+          </w:p>
+        </w:tc>
+        <w:tc>
+          <w:tcPr>
+            <w:tcW w:w="1853" w:type="dxa"/>
+            <w:vAlign w:val="center"/>
+            <w:hideMark/>
+          </w:tcPr>
+          <w:p>
+            <w:pPr>
+              <w:spacing w:after="0" w:line="240" w:lineRule="auto"/>
+              <w:ind w:firstLineChars="100" w:firstLine="220"/>
+              <w:rPr>
+                <w:rFonts w:ascii="Arial" w:eastAsia="Times New Roman" w:hAnsi="Arial" w:cs="Arial"/>
+                <w:color w:val="000000"/>
+                <w:kern w:val="0"/>
+                <w:sz w:val="22"/>
+                <w:szCs w:val="22"/>
+                <w:lang w:val="es-DO" w:eastAsia="es-DO"/>
+                <w14:ligatures w14:val="none"/>
+              </w:rPr>
+            </w:pPr>
+            <w:r>
+              <w:rPr>
+                <w:rFonts w:ascii="Arial" w:eastAsia="Times New Roman" w:hAnsi="Arial" w:cs="Arial"/>
+                <w:color w:val="000000"/>
+                <w:kern w:val="0"/>
+                <w:sz w:val="22"/>
+                <w:szCs w:val="22"/>
+                <w:lang w:val="es-DO" w:eastAsia="es-DO"/>
+                <w14:ligatures w14:val="none"/>
+              </w:rPr>
+              <w:t>0.7024</w:t>
+            </w:r>
+          </w:p>
+        </w:tc>
+        <w:tc>
+          <w:tcPr>
+            <w:tcW w:w="1033" w:type="dxa"/>
+            <w:vAlign w:val="center"/>
+            <w:hideMark/>
+          </w:tcPr>
+          <w:p>
+            <w:pPr>
+              <w:spacing w:after="0" w:line="240" w:lineRule="auto"/>
+              <w:ind w:firstLineChars="100" w:firstLine="220"/>
+              <w:rPr>
+                <w:rFonts w:ascii="Arial" w:eastAsia="Times New Roman" w:hAnsi="Arial" w:cs="Arial"/>
+                <w:color w:val="000000"/>
+                <w:kern w:val="0"/>
+                <w:sz w:val="22"/>
+                <w:szCs w:val="22"/>
+                <w:lang w:val="es-DO" w:eastAsia="es-DO"/>
+                <w14:ligatures w14:val="none"/>
+              </w:rPr>
+            </w:pPr>
+            <w:r>
+              <w:rPr>
+                <w:rFonts w:ascii="Arial" w:eastAsia="Times New Roman" w:hAnsi="Arial" w:cs="Arial"/>
+                <w:color w:val="000000"/>
+                <w:kern w:val="0"/>
+                <w:sz w:val="22"/>
+                <w:szCs w:val="22"/>
+                <w:lang w:val="es-DO" w:eastAsia="es-DO"/>
+                <w14:ligatures w14:val="none"/>
+              </w:rPr>
+              <w:t>0.58</w:t>
+            </w:r>
+          </w:p>
+        </w:tc>
+        <w:tc>
+          <w:tcPr>
+            <w:tcW w:w="1034" w:type="dxa"/>
+            <w:vAlign w:val="center"/>
+            <w:hideMark/>
+          </w:tcPr>
+          <w:p>
+            <w:pPr>
+              <w:spacing w:after="0" w:line="240" w:lineRule="auto"/>
+              <w:ind w:firstLineChars="100" w:firstLine="220"/>
+              <w:rPr>
+                <w:rFonts w:ascii="Arial" w:eastAsia="Times New Roman" w:hAnsi="Arial" w:cs="Arial"/>
+                <w:color w:val="000000"/>
+                <w:kern w:val="0"/>
+                <w:sz w:val="22"/>
+                <w:szCs w:val="22"/>
+                <w:lang w:val="es-DO" w:eastAsia="es-DO"/>
+                <w14:ligatures w14:val="none"/>
+              </w:rPr>
+            </w:pPr>
+            <w:r>
+              <w:rPr>
+                <w:rFonts w:ascii="Arial" w:eastAsia="Times New Roman" w:hAnsi="Arial" w:cs="Arial"/>
+                <w:color w:val="000000"/>
+                <w:kern w:val="0"/>
+                <w:sz w:val="22"/>
+                <w:szCs w:val="22"/>
+                <w:lang w:val="es-DO" w:eastAsia="es-DO"/>
+                <w14:ligatures w14:val="none"/>
+              </w:rPr>
+              <w:t>0.72</w:t>
+            </w:r>
+          </w:p>
+        </w:tc>
+      </w:tr>
+      <w:tr>
+        <w:trPr>
+          <w:trHeight w:val="830"/>
+        </w:trPr>
+        <w:tc>
+          <w:tcPr>
+            <w:tcW w:w="2547" w:type="dxa"/>
+            <w:vAlign w:val="center"/>
+            <w:hideMark/>
+          </w:tcPr>
+          <w:p>
+            <w:pPr>
+              <w:spacing w:after="0" w:line="240" w:lineRule="auto"/>
+              <w:ind w:firstLineChars="100" w:firstLine="220"/>
+              <w:jc w:val="center"/>
+              <w:rPr>
+                <w:rFonts w:ascii="Arial" w:eastAsia="Times New Roman" w:hAnsi="Arial" w:cs="Arial"/>
+                <w:color w:val="000000"/>
+                <w:kern w:val="0"/>
+                <w:sz w:val="22"/>
+                <w:szCs w:val="22"/>
+                <w:lang w:val="es-DO" w:eastAsia="es-DO"/>
+                <w14:ligatures w14:val="none"/>
+              </w:rPr>
+            </w:pPr>
+            <w:r>
+              <w:rPr>
+                <w:rFonts w:ascii="Arial" w:eastAsia="Times New Roman" w:hAnsi="Arial" w:cs="Arial"/>
+                <w:color w:val="000000"/>
+                <w:kern w:val="0"/>
+                <w:sz w:val="22"/>
+                <w:szCs w:val="22"/>
+                <w:lang w:val="es-DO" w:eastAsia="es-DO"/>
+                <w14:ligatures w14:val="none"/>
+              </w:rPr>
+              <w:t>S</w:t>
+            </w:r>
+            <w:r>
+              <w:rPr>
+                <w:rFonts w:ascii="Arial" w:eastAsia="Times New Roman" w:hAnsi="Arial" w:cs="Arial"/>
+                <w:color w:val="000000"/>
+                <w:kern w:val="0"/>
+                <w:sz w:val="22"/>
+                <w:szCs w:val="22"/>
+                <w:lang w:val="es-DO" w:eastAsia="es-DO"/>
+                <w14:ligatures w14:val="none"/>
+              </w:rPr>
+              <w:t>VM Optimizado (</w:t>
+            </w:r>
+            <m:oMath>
+              <m:r>
+                <w:rPr>
+                  <w:rFonts w:ascii="Cambria Math" w:eastAsia="Times New Roman" w:hAnsi="Cambria Math" w:cs="Arial"/>
+                  <w:color w:val="000000"/>
+                  <w:kern w:val="0"/>
+                  <w:sz w:val="22"/>
+                  <w:szCs w:val="22"/>
+                  <w:lang w:val="es-DO" w:eastAsia="es-DO"/>
+                  <w14:ligatures w14:val="none"/>
+                </w:rPr>
+                <m:t>C=10.0,γ=0.1</m:t>
+              </m:r>
+            </m:oMath>
+            <w:r>
+              <w:rPr>
+                <w:rFonts w:ascii="Arial" w:eastAsia="Times New Roman" w:hAnsi="Arial" w:cs="Arial"/>
+                <w:color w:val="000000"/>
+                <w:kern w:val="0"/>
+                <w:sz w:val="22"/>
+                <w:szCs w:val="22"/>
+                <w:lang w:val="es-DO" w:eastAsia="es-DO"/>
+                <w14:ligatures w14:val="none"/>
+              </w:rPr>
+              <w:t>)</w:t>
+            </w:r>
+          </w:p>
+        </w:tc>
+        <w:tc>
+          <w:tcPr>
+            <w:tcW w:w="1530" w:type="dxa"/>
+            <w:vAlign w:val="center"/>
+            <w:hideMark/>
+          </w:tcPr>
+          <w:p>
+            <w:pPr>
+              <w:spacing w:after="0" w:line="240" w:lineRule="auto"/>
+              <w:ind w:firstLineChars="100" w:firstLine="220"/>
+              <w:rPr>
+                <w:rFonts w:ascii="Arial" w:eastAsia="Times New Roman" w:hAnsi="Arial" w:cs="Arial"/>
+                <w:color w:val="000000"/>
+                <w:kern w:val="0"/>
+                <w:sz w:val="22"/>
+                <w:szCs w:val="22"/>
+                <w:lang w:val="es-DO" w:eastAsia="es-DO"/>
+                <w14:ligatures w14:val="none"/>
+              </w:rPr>
+            </w:pPr>
+            <w:r>
+              <w:rPr>
+                <w:rFonts w:ascii="Arial" w:eastAsia="Times New Roman" w:hAnsi="Arial" w:cs="Arial"/>
+                <w:color w:val="000000"/>
+                <w:kern w:val="0"/>
+                <w:sz w:val="22"/>
+                <w:szCs w:val="22"/>
+                <w:lang w:val="es-DO" w:eastAsia="es-DO"/>
+                <w14:ligatures w14:val="none"/>
+              </w:rPr>
+              <w:t>0.745</w:t>
+            </w:r>
+          </w:p>
+        </w:tc>
+        <w:tc>
+          <w:tcPr>
+            <w:tcW w:w="1352" w:type="dxa"/>
+            <w:vAlign w:val="center"/>
+            <w:hideMark/>
+          </w:tcPr>
+          <w:p>
+            <w:pPr>
+              <w:spacing w:after="0" w:line="240" w:lineRule="auto"/>
+              <w:ind w:firstLineChars="100" w:firstLine="220"/>
+              <w:rPr>
+                <w:rFonts w:ascii="Arial" w:eastAsia="Times New Roman" w:hAnsi="Arial" w:cs="Arial"/>
+                <w:color w:val="000000"/>
+                <w:kern w:val="0"/>
+                <w:sz w:val="22"/>
+                <w:szCs w:val="22"/>
+                <w:lang w:val="es-DO" w:eastAsia="es-DO"/>
+                <w14:ligatures w14:val="none"/>
+              </w:rPr>
+            </w:pPr>
+            <w:r>
+              <w:rPr>
+                <w:rFonts w:ascii="Arial" w:eastAsia="Times New Roman" w:hAnsi="Arial" w:cs="Arial"/>
+                <w:color w:val="000000"/>
+                <w:kern w:val="0"/>
+                <w:sz w:val="22"/>
+                <w:szCs w:val="22"/>
+                <w:lang w:val="es-DO" w:eastAsia="es-DO"/>
+                <w14:ligatures w14:val="none"/>
+              </w:rPr>
+              <w:t>0.6938</w:t>
+            </w:r>
+          </w:p>
+        </w:tc>
+        <w:tc>
+          <w:tcPr>
+            <w:tcW w:w="1853" w:type="dxa"/>
+            <w:vAlign w:val="center"/>
+            <w:hideMark/>
+          </w:tcPr>
+          <w:p>
+            <w:pPr>
+              <w:spacing w:after="0" w:line="240" w:lineRule="auto"/>
+              <w:ind w:firstLineChars="100" w:firstLine="220"/>
+              <w:rPr>
+                <w:rFonts w:ascii="Arial" w:eastAsia="Times New Roman" w:hAnsi="Arial" w:cs="Arial"/>
+                <w:color w:val="000000"/>
+                <w:kern w:val="0"/>
+                <w:sz w:val="22"/>
+                <w:szCs w:val="22"/>
+                <w:lang w:val="es-DO" w:eastAsia="es-DO"/>
+                <w14:ligatures w14:val="none"/>
+              </w:rPr>
+            </w:pPr>
+            <w:r>
+              <w:rPr>
+                <w:rFonts w:ascii="Arial" w:eastAsia="Times New Roman" w:hAnsi="Arial" w:cs="Arial"/>
+                <w:color w:val="000000"/>
+                <w:kern w:val="0"/>
+                <w:sz w:val="22"/>
+                <w:szCs w:val="22"/>
+                <w:lang w:val="es-DO" w:eastAsia="es-DO"/>
+                <w14:ligatures w14:val="none"/>
+              </w:rPr>
+              <w:t>0.6798</w:t>
+            </w:r>
+          </w:p>
+        </w:tc>
+        <w:tc>
+          <w:tcPr>
+            <w:tcW w:w="1033" w:type="dxa"/>
+            <w:vAlign w:val="center"/>
+            <w:hideMark/>
+          </w:tcPr>
+          <w:p>
+            <w:pPr>
+              <w:spacing w:after="0" w:line="240" w:lineRule="auto"/>
+              <w:ind w:firstLineChars="100" w:firstLine="220"/>
+              <w:rPr>
+                <w:rFonts w:ascii="Arial" w:eastAsia="Times New Roman" w:hAnsi="Arial" w:cs="Arial"/>
+                <w:color w:val="000000"/>
+                <w:kern w:val="0"/>
+                <w:sz w:val="22"/>
+                <w:szCs w:val="22"/>
+                <w:lang w:val="es-DO" w:eastAsia="es-DO"/>
+                <w14:ligatures w14:val="none"/>
+              </w:rPr>
+            </w:pPr>
+            <w:r>
+              <w:rPr>
+                <w:rFonts w:ascii="Arial" w:eastAsia="Times New Roman" w:hAnsi="Arial" w:cs="Arial"/>
+                <w:color w:val="000000"/>
+                <w:kern w:val="0"/>
+                <w:sz w:val="22"/>
+                <w:szCs w:val="22"/>
+                <w:lang w:val="es-DO" w:eastAsia="es-DO"/>
+                <w14:ligatures w14:val="none"/>
+              </w:rPr>
+              <w:t>0.5487</w:t>
+            </w:r>
+          </w:p>
+        </w:tc>
+        <w:tc>
+          <w:tcPr>
+            <w:tcW w:w="1034" w:type="dxa"/>
+            <w:vAlign w:val="center"/>
+            <w:hideMark/>
+          </w:tcPr>
+          <w:p>
+            <w:pPr>
+              <w:spacing w:after="0" w:line="240" w:lineRule="auto"/>
+              <w:ind w:firstLineChars="100" w:firstLine="220"/>
+              <w:rPr>
+                <w:rFonts w:ascii="Arial" w:eastAsia="Times New Roman" w:hAnsi="Arial" w:cs="Arial"/>
+                <w:color w:val="000000"/>
+                <w:kern w:val="0"/>
+                <w:sz w:val="22"/>
+                <w:szCs w:val="22"/>
+                <w:lang w:val="es-DO" w:eastAsia="es-DO"/>
+                <w14:ligatures w14:val="none"/>
+              </w:rPr>
+            </w:pPr>
+            <w:r>
+              <w:rPr>
+                <w:rFonts w:ascii="Arial" w:eastAsia="Times New Roman" w:hAnsi="Arial" w:cs="Arial"/>
+                <w:color w:val="000000"/>
+                <w:kern w:val="0"/>
+                <w:sz w:val="22"/>
+                <w:szCs w:val="22"/>
+                <w:lang w:val="es-DO" w:eastAsia="es-DO"/>
+                <w14:ligatures w14:val="none"/>
+              </w:rPr>
+              <w:t>0.6855</w:t>
+            </w:r>
+          </w:p>
+        </w:tc>
+      </w:tr>
+      <w:tr>
+        <w:trPr>
+          <w:trHeight w:val="830"/>
+        </w:trPr>
+        <w:tc>
+          <w:tcPr>
+            <w:tcW w:w="2547" w:type="dxa"/>
+            <w:vAlign w:val="center"/>
+            <w:hideMark/>
+          </w:tcPr>
+          <w:p>
+            <w:pPr>
+              <w:spacing w:after="0" w:line="240" w:lineRule="auto"/>
+              <w:ind w:firstLineChars="100" w:firstLine="221"/>
+              <w:rPr>
+                <w:rFonts w:ascii="Arial" w:eastAsia="Times New Roman" w:hAnsi="Arial" w:cs="Arial"/>
+                <w:b/>
+                <w:bCs/>
+                <w:color w:val="000000"/>
+                <w:kern w:val="0"/>
+                <w:sz w:val="22"/>
+                <w:szCs w:val="22"/>
+                <w:lang w:val="es-DO" w:eastAsia="es-DO"/>
+                <w14:ligatures w14:val="none"/>
+              </w:rPr>
+            </w:pPr>
+            <w:r>
+              <w:rPr>
+                <w:rFonts w:ascii="Arial" w:eastAsia="Times New Roman" w:hAnsi="Arial" w:cs="Arial"/>
+                <w:b/>
+                <w:bCs/>
+                <w:color w:val="000000"/>
+                <w:kern w:val="0"/>
+                <w:sz w:val="22"/>
+                <w:szCs w:val="22"/>
+                <w:lang w:val="es-DO" w:eastAsia="es-DO"/>
+                <w14:ligatures w14:val="none"/>
+              </w:rPr>
+              <w:t>SVM Optimizado + Reducción Semántica*</w:t>
+            </w:r>
+          </w:p>
+        </w:tc>
+        <w:tc>
+          <w:tcPr>
+            <w:tcW w:w="1530" w:type="dxa"/>
+            <w:vAlign w:val="center"/>
+            <w:hideMark/>
+          </w:tcPr>
+          <w:p>
+            <w:pPr>
+              <w:spacing w:after="0" w:line="240" w:lineRule="auto"/>
+              <w:ind w:firstLineChars="100" w:firstLine="221"/>
+              <w:rPr>
+                <w:rFonts w:ascii="Arial" w:eastAsia="Times New Roman" w:hAnsi="Arial" w:cs="Arial"/>
+                <w:b/>
+                <w:bCs/>
+                <w:color w:val="000000"/>
+                <w:kern w:val="0"/>
+                <w:sz w:val="22"/>
+                <w:szCs w:val="22"/>
+                <w:lang w:val="es-DO" w:eastAsia="es-DO"/>
+                <w14:ligatures w14:val="none"/>
+              </w:rPr>
+            </w:pPr>
+            <w:r>
+              <w:rPr>
+                <w:rFonts w:ascii="Arial" w:eastAsia="Times New Roman" w:hAnsi="Arial" w:cs="Arial"/>
+                <w:b/>
+                <w:bCs/>
+                <w:color w:val="000000"/>
+                <w:kern w:val="0"/>
+                <w:sz w:val="22"/>
+                <w:szCs w:val="22"/>
+                <w:lang w:val="es-DO" w:eastAsia="es-DO"/>
+                <w14:ligatures w14:val="none"/>
+              </w:rPr>
+              <w:t>0.775</w:t>
+            </w:r>
+          </w:p>
+        </w:tc>
+        <w:tc>
+          <w:tcPr>
+            <w:tcW w:w="1352" w:type="dxa"/>
+            <w:vAlign w:val="center"/>
+            <w:hideMark/>
+          </w:tcPr>
+          <w:p>
+            <w:pPr>
+              <w:spacing w:after="0" w:line="240" w:lineRule="auto"/>
+              <w:ind w:firstLineChars="100" w:firstLine="221"/>
+              <w:rPr>
+                <w:rFonts w:ascii="Arial" w:eastAsia="Times New Roman" w:hAnsi="Arial" w:cs="Arial"/>
+                <w:b/>
+                <w:bCs/>
+                <w:color w:val="000000"/>
+                <w:kern w:val="0"/>
+                <w:sz w:val="22"/>
+                <w:szCs w:val="22"/>
+                <w:lang w:val="es-DO" w:eastAsia="es-DO"/>
+                <w14:ligatures w14:val="none"/>
+              </w:rPr>
+            </w:pPr>
+            <w:r>
+              <w:rPr>
+                <w:rFonts w:ascii="Arial" w:eastAsia="Times New Roman" w:hAnsi="Arial" w:cs="Arial"/>
+                <w:b/>
+                <w:bCs/>
+                <w:color w:val="000000"/>
+                <w:kern w:val="0"/>
+                <w:sz w:val="22"/>
+                <w:szCs w:val="22"/>
+                <w:lang w:val="es-DO" w:eastAsia="es-DO"/>
+                <w14:ligatures w14:val="none"/>
+              </w:rPr>
+              <w:t>0.7336</w:t>
+            </w:r>
+          </w:p>
+        </w:tc>
+        <w:tc>
+          <w:tcPr>
+            <w:tcW w:w="1853" w:type="dxa"/>
+            <w:vAlign w:val="center"/>
+            <w:hideMark/>
+          </w:tcPr>
+          <w:p>
+            <w:pPr>
+              <w:spacing w:after="0" w:line="240" w:lineRule="auto"/>
+              <w:ind w:firstLineChars="100" w:firstLine="221"/>
+              <w:rPr>
+                <w:rFonts w:ascii="Arial" w:eastAsia="Times New Roman" w:hAnsi="Arial" w:cs="Arial"/>
+                <w:b/>
+                <w:bCs/>
+                <w:color w:val="000000"/>
+                <w:kern w:val="0"/>
+                <w:sz w:val="22"/>
+                <w:szCs w:val="22"/>
+                <w:lang w:val="es-DO" w:eastAsia="es-DO"/>
+                <w14:ligatures w14:val="none"/>
+              </w:rPr>
+            </w:pPr>
+            <w:r>
+              <w:rPr>
+                <w:rFonts w:ascii="Arial" w:eastAsia="Times New Roman" w:hAnsi="Arial" w:cs="Arial"/>
+                <w:b/>
+                <w:bCs/>
+                <w:color w:val="000000"/>
+                <w:kern w:val="0"/>
+                <w:sz w:val="22"/>
+                <w:szCs w:val="22"/>
+                <w:lang w:val="es-DO" w:eastAsia="es-DO"/>
+                <w14:ligatures w14:val="none"/>
+              </w:rPr>
+              <w:t>0.744</w:t>
+            </w:r>
+          </w:p>
+        </w:tc>
+        <w:tc>
+          <w:tcPr>
+            <w:tcW w:w="1033" w:type="dxa"/>
+            <w:vAlign w:val="center"/>
+            <w:hideMark/>
+          </w:tcPr>
+          <w:p>
+            <w:pPr>
+              <w:spacing w:after="0" w:line="240" w:lineRule="auto"/>
+              <w:ind w:firstLineChars="100" w:firstLine="221"/>
+              <w:rPr>
+                <w:rFonts w:ascii="Arial" w:eastAsia="Times New Roman" w:hAnsi="Arial" w:cs="Arial"/>
+                <w:b/>
+                <w:bCs/>
+                <w:color w:val="000000"/>
+                <w:kern w:val="0"/>
+                <w:sz w:val="22"/>
+                <w:szCs w:val="22"/>
+                <w:lang w:val="es-DO" w:eastAsia="es-DO"/>
+                <w14:ligatures w14:val="none"/>
+              </w:rPr>
+            </w:pPr>
+            <w:r>
+              <w:rPr>
+                <w:rFonts w:ascii="Arial" w:eastAsia="Times New Roman" w:hAnsi="Arial" w:cs="Arial"/>
+                <w:b/>
+                <w:bCs/>
+                <w:color w:val="000000"/>
+                <w:kern w:val="0"/>
+                <w:sz w:val="22"/>
+                <w:szCs w:val="22"/>
+                <w:lang w:val="es-DO" w:eastAsia="es-DO"/>
+                <w14:ligatures w14:val="none"/>
+              </w:rPr>
+              <w:t>0.64</w:t>
+            </w:r>
+          </w:p>
+        </w:tc>
+        <w:tc>
+          <w:tcPr>
+            <w:tcW w:w="1034" w:type="dxa"/>
+            <w:vAlign w:val="center"/>
+            <w:hideMark/>
+          </w:tcPr>
+          <w:p>
+            <w:pPr>
+              <w:spacing w:after="0" w:line="240" w:lineRule="auto"/>
+              <w:ind w:firstLineChars="100" w:firstLine="221"/>
+              <w:rPr>
+                <w:rFonts w:ascii="Arial" w:eastAsia="Times New Roman" w:hAnsi="Arial" w:cs="Arial"/>
+                <w:b/>
+                <w:bCs/>
+                <w:color w:val="000000"/>
+                <w:kern w:val="0"/>
+                <w:sz w:val="22"/>
+                <w:szCs w:val="22"/>
+                <w:lang w:val="es-DO" w:eastAsia="es-DO"/>
+                <w14:ligatures w14:val="none"/>
+              </w:rPr>
+            </w:pPr>
+            <w:r>
+              <w:rPr>
+                <w:rFonts w:ascii="Arial" w:eastAsia="Times New Roman" w:hAnsi="Arial" w:cs="Arial"/>
+                <w:b/>
+                <w:bCs/>
+                <w:color w:val="000000"/>
+                <w:kern w:val="0"/>
+                <w:sz w:val="22"/>
+                <w:szCs w:val="22"/>
+                <w:lang w:val="es-DO" w:eastAsia="es-DO"/>
+                <w14:ligatures w14:val="none"/>
+              </w:rPr>
+              <w:t>0.7382</w:t>
+            </w:r>
+          </w:p>
+        </w:tc>
+      </w:tr>
+    </w:tbl>
+    <w:p>
+      <w:pPr>
+        <w:tabs>
+          <w:tab w:val="left" w:pos="5364"/>
+        </w:tabs>
+        <w:jc w:val="both"/>
         <w:rPr>
           <w:rFonts w:ascii="Times New Roman" w:hAnsi="Times New Roman" w:cs="Times New Roman"/>
           <w:b/>
           <w:bCs/>
           <w:lang w:val="es-DO"/>
         </w:rPr>
-        <w:t xml:space="preserve">: </w:t>
-      </w:r>
-      <w:hyperlink r:id="rId18" w:history="1">
-        <w:r>
+      </w:pPr>
+    </w:p>
+    <w:p>
+      <w:pPr>
+        <w:tabs>
+          <w:tab w:val="left" w:pos="5364"/>
+        </w:tabs>
+        <w:jc w:val="both"/>
+        <w:rPr>
+          <w:rFonts w:ascii="Times New Roman" w:hAnsi="Times New Roman" w:cs="Times New Roman"/>
+          <w:lang w:val="es-DO"/>
+        </w:rPr>
+      </w:pPr>
+      <w:r>
+        <w:rPr>
+          <w:rFonts w:ascii="Times New Roman" w:hAnsi="Times New Roman" w:cs="Times New Roman"/>
+          <w:lang w:val="es-DO"/>
+        </w:rPr>
+        <w:t xml:space="preserve">*Modelo seleccionado: optimizado mediante </w:t>
+      </w:r>
+      <w:proofErr w:type="spellStart"/>
+      <w:r>
+        <w:rPr>
+          <w:rFonts w:ascii="Times New Roman" w:hAnsi="Times New Roman" w:cs="Times New Roman"/>
+          <w:lang w:val="es-DO"/>
+        </w:rPr>
+        <w:t>GridSearchCV</w:t>
+      </w:r>
+      <w:proofErr w:type="spellEnd"/>
+      <w:r>
+        <w:rPr>
+          <w:rFonts w:ascii="Times New Roman" w:hAnsi="Times New Roman" w:cs="Times New Roman"/>
+          <w:lang w:val="es-DO"/>
+        </w:rPr>
+        <w:t xml:space="preserve"> (</w:t>
+      </w:r>
+      <m:oMath>
+        <m:r>
           <w:rPr>
-            <w:rStyle w:val="Hipervnculo"/>
-            <w:rFonts w:ascii="Times New Roman" w:hAnsi="Times New Roman" w:cs="Times New Roman"/>
-            <w:b/>
-            <w:bCs/>
+            <w:rFonts w:ascii="Cambria Math" w:hAnsi="Cambria Math" w:cs="Times New Roman"/>
             <w:lang w:val="es-DO"/>
           </w:rPr>
-          <w:t>https://github.com/Rickymjms/INFO8239_U01_FJ1656.git</w:t>
-        </w:r>
-      </w:hyperlink>
+          <m:t>C=10.0,γ=</m:t>
+        </m:r>
+        <m:r>
+          <m:rPr>
+            <m:nor/>
+          </m:rPr>
+          <w:rPr>
+            <w:rFonts w:ascii="Times New Roman" w:hAnsi="Times New Roman" w:cs="Times New Roman"/>
+            <w:lang w:val="es-DO"/>
+          </w:rPr>
+          <m:t>'scale'</m:t>
+        </m:r>
+      </m:oMath>
+      <w:r>
+        <w:rPr>
+          <w:rFonts w:ascii="Times New Roman" w:hAnsi="Times New Roman" w:cs="Times New Roman"/>
+          <w:lang w:val="es-DO"/>
+        </w:rPr>
+        <w:t xml:space="preserve">), excluyendo las variables de bajo aporte </w:t>
+      </w:r>
+      <w:proofErr w:type="spellStart"/>
+      <w:r>
+        <w:rPr>
+          <w:rFonts w:ascii="Times New Roman" w:hAnsi="Times New Roman" w:cs="Times New Roman"/>
+          <w:lang w:val="es-DO"/>
+        </w:rPr>
+        <w:t>foreign_worker</w:t>
+      </w:r>
+      <w:proofErr w:type="spellEnd"/>
+      <w:r>
+        <w:rPr>
+          <w:rFonts w:ascii="Times New Roman" w:hAnsi="Times New Roman" w:cs="Times New Roman"/>
+          <w:lang w:val="es-DO"/>
+        </w:rPr>
+        <w:t xml:space="preserve"> y </w:t>
+      </w:r>
+      <w:proofErr w:type="spellStart"/>
+      <w:r>
+        <w:rPr>
+          <w:rFonts w:ascii="Times New Roman" w:hAnsi="Times New Roman" w:cs="Times New Roman"/>
+          <w:lang w:val="es-DO"/>
+        </w:rPr>
+        <w:t>own_telephone</w:t>
+      </w:r>
+      <w:proofErr w:type="spellEnd"/>
+      <w:r>
+        <w:rPr>
+          <w:rFonts w:ascii="Times New Roman" w:hAnsi="Times New Roman" w:cs="Times New Roman"/>
+          <w:lang w:val="es-DO"/>
+        </w:rPr>
+        <w:t>.</w:t>
+      </w:r>
+    </w:p>
+    <w:p>
+      <w:pPr>
+        <w:tabs>
+          <w:tab w:val="left" w:pos="5364"/>
+        </w:tabs>
+        <w:jc w:val="both"/>
+        <w:rPr>
+          <w:rFonts w:ascii="Times New Roman" w:hAnsi="Times New Roman" w:cs="Times New Roman"/>
+          <w:b/>
+          <w:bCs/>
+          <w:lang w:val="es-DO"/>
+        </w:rPr>
+      </w:pPr>
+    </w:p>
+    <w:p>
+      <w:pPr>
+        <w:tabs>
+          <w:tab w:val="left" w:pos="5364"/>
+        </w:tabs>
+        <w:jc w:val="both"/>
+        <w:rPr>
+          <w:rFonts w:ascii="Times New Roman" w:hAnsi="Times New Roman" w:cs="Times New Roman"/>
+          <w:b/>
+          <w:bCs/>
+          <w:lang w:val="es-DO"/>
+        </w:rPr>
+      </w:pPr>
+      <w:r>
+        <w:rPr>
+          <w:rFonts w:ascii="Times New Roman" w:hAnsi="Times New Roman" w:cs="Times New Roman"/>
+          <w:b/>
+          <w:bCs/>
+          <w:lang w:val="es-DO"/>
+        </w:rPr>
+        <w:t>4. Figuras y Análisis Comparativo</w:t>
+      </w:r>
+    </w:p>
+    <w:p>
+      <w:pPr>
+        <w:numPr>
+          <w:ilvl w:val="0"/>
+          <w:numId w:val="6"/>
+        </w:numPr>
+        <w:tabs>
+          <w:tab w:val="left" w:pos="5364"/>
+        </w:tabs>
+        <w:jc w:val="both"/>
+        <w:rPr>
+          <w:rFonts w:ascii="Times New Roman" w:hAnsi="Times New Roman" w:cs="Times New Roman"/>
+          <w:b/>
+          <w:bCs/>
+          <w:lang w:val="es-DO"/>
+        </w:rPr>
+      </w:pPr>
+      <w:r>
+        <w:rPr>
+          <w:rFonts w:ascii="Times New Roman" w:hAnsi="Times New Roman" w:cs="Times New Roman"/>
+          <w:b/>
+          <w:bCs/>
+          <w:lang w:val="es-DO"/>
+        </w:rPr>
+        <w:t>Figura 1: Comparativa de Rendimiento Global (F1-Macro en Conjunto de Prueba)</w:t>
+      </w:r>
+    </w:p>
+    <w:p>
+      <w:pPr>
+        <w:numPr>
+          <w:ilvl w:val="1"/>
+          <w:numId w:val="6"/>
+        </w:numPr>
+        <w:tabs>
+          <w:tab w:val="left" w:pos="5364"/>
+        </w:tabs>
+        <w:jc w:val="both"/>
+        <w:rPr>
+          <w:rFonts w:ascii="Times New Roman" w:hAnsi="Times New Roman" w:cs="Times New Roman"/>
+          <w:lang w:val="es-DO"/>
+        </w:rPr>
+      </w:pPr>
+      <w:proofErr w:type="spellStart"/>
+      <w:r>
+        <w:rPr>
+          <w:rFonts w:ascii="Times New Roman" w:hAnsi="Times New Roman" w:cs="Times New Roman"/>
+          <w:i/>
+          <w:iCs/>
+          <w:lang w:val="es-DO"/>
+        </w:rPr>
+        <w:t>Dummy</w:t>
+      </w:r>
+      <w:proofErr w:type="spellEnd"/>
+      <w:r>
+        <w:rPr>
+          <w:rFonts w:ascii="Times New Roman" w:hAnsi="Times New Roman" w:cs="Times New Roman"/>
+          <w:i/>
+          <w:iCs/>
+          <w:lang w:val="es-DO"/>
+        </w:rPr>
+        <w:t xml:space="preserve"> Classifier:</w:t>
+      </w:r>
+      <w:r>
+        <w:rPr>
+          <w:rFonts w:ascii="Times New Roman" w:hAnsi="Times New Roman" w:cs="Times New Roman"/>
+          <w:lang w:val="es-DO"/>
+        </w:rPr>
+        <w:t xml:space="preserve"> 0.4118</w:t>
+      </w:r>
+    </w:p>
+    <w:p>
+      <w:pPr>
+        <w:numPr>
+          <w:ilvl w:val="1"/>
+          <w:numId w:val="6"/>
+        </w:numPr>
+        <w:tabs>
+          <w:tab w:val="left" w:pos="5364"/>
+        </w:tabs>
+        <w:jc w:val="both"/>
+        <w:rPr>
+          <w:rFonts w:ascii="Times New Roman" w:hAnsi="Times New Roman" w:cs="Times New Roman"/>
+          <w:lang w:val="es-DO"/>
+        </w:rPr>
+      </w:pPr>
+      <w:r>
+        <w:rPr>
+          <w:rFonts w:ascii="Times New Roman" w:hAnsi="Times New Roman" w:cs="Times New Roman"/>
+          <w:i/>
+          <w:iCs/>
+          <w:lang w:val="es-DO"/>
+        </w:rPr>
+        <w:lastRenderedPageBreak/>
+        <w:t>SVM Base:</w:t>
+      </w:r>
+      <w:r>
+        <w:rPr>
+          <w:rFonts w:ascii="Times New Roman" w:hAnsi="Times New Roman" w:cs="Times New Roman"/>
+          <w:lang w:val="es-DO"/>
+        </w:rPr>
+        <w:t xml:space="preserve"> 0.7200</w:t>
+      </w:r>
+    </w:p>
+    <w:p>
+      <w:pPr>
+        <w:numPr>
+          <w:ilvl w:val="1"/>
+          <w:numId w:val="6"/>
+        </w:numPr>
+        <w:tabs>
+          <w:tab w:val="left" w:pos="5364"/>
+        </w:tabs>
+        <w:jc w:val="both"/>
+        <w:rPr>
+          <w:rFonts w:ascii="Times New Roman" w:hAnsi="Times New Roman" w:cs="Times New Roman"/>
+          <w:lang w:val="es-DO"/>
+        </w:rPr>
+      </w:pPr>
+      <w:r>
+        <w:rPr>
+          <w:rFonts w:ascii="Times New Roman" w:hAnsi="Times New Roman" w:cs="Times New Roman"/>
+          <w:i/>
+          <w:iCs/>
+          <w:lang w:val="es-DO"/>
+        </w:rPr>
+        <w:t>SVM Optimizado (</w:t>
+      </w:r>
+      <w:proofErr w:type="spellStart"/>
+      <w:r>
+        <w:rPr>
+          <w:rFonts w:ascii="Times New Roman" w:hAnsi="Times New Roman" w:cs="Times New Roman"/>
+          <w:i/>
+          <w:iCs/>
+          <w:lang w:val="es-DO"/>
+        </w:rPr>
+        <w:t>GridSearch</w:t>
+      </w:r>
+      <w:proofErr w:type="spellEnd"/>
+      <w:r>
+        <w:rPr>
+          <w:rFonts w:ascii="Times New Roman" w:hAnsi="Times New Roman" w:cs="Times New Roman"/>
+          <w:i/>
+          <w:iCs/>
+          <w:lang w:val="es-DO"/>
+        </w:rPr>
+        <w:t>):</w:t>
+      </w:r>
+      <w:r>
+        <w:rPr>
+          <w:rFonts w:ascii="Times New Roman" w:hAnsi="Times New Roman" w:cs="Times New Roman"/>
+          <w:lang w:val="es-DO"/>
+        </w:rPr>
+        <w:t xml:space="preserve"> 0.6855</w:t>
+      </w:r>
+    </w:p>
+    <w:p>
+      <w:pPr>
+        <w:numPr>
+          <w:ilvl w:val="1"/>
+          <w:numId w:val="6"/>
+        </w:numPr>
+        <w:tabs>
+          <w:tab w:val="left" w:pos="5364"/>
+        </w:tabs>
+        <w:jc w:val="both"/>
+        <w:rPr>
+          <w:rFonts w:ascii="Times New Roman" w:hAnsi="Times New Roman" w:cs="Times New Roman"/>
+          <w:lang w:val="es-DO"/>
+        </w:rPr>
+      </w:pPr>
+      <w:r>
+        <w:rPr>
+          <w:rFonts w:ascii="Times New Roman" w:hAnsi="Times New Roman" w:cs="Times New Roman"/>
+          <w:i/>
+          <w:iCs/>
+          <w:lang w:val="es-DO"/>
+        </w:rPr>
+        <w:t>SVM con Reducción Semántica:</w:t>
+      </w:r>
+      <w:r>
+        <w:rPr>
+          <w:rFonts w:ascii="Times New Roman" w:hAnsi="Times New Roman" w:cs="Times New Roman"/>
+          <w:lang w:val="es-DO"/>
+        </w:rPr>
+        <w:t xml:space="preserve"> 0.7382 </w:t>
+      </w:r>
+      <w:r>
+        <w:rPr>
+          <w:rFonts w:ascii="Times New Roman" w:hAnsi="Times New Roman" w:cs="Times New Roman"/>
+          <w:i/>
+          <w:iCs/>
+          <w:lang w:val="es-DO"/>
+        </w:rPr>
+        <w:t xml:space="preserve">(Muestra cómo el filtrado de variables ruidosas y la calibración de </w:t>
+      </w:r>
+      <w:proofErr w:type="spellStart"/>
+      <w:r>
+        <w:rPr>
+          <w:rFonts w:ascii="Times New Roman" w:hAnsi="Times New Roman" w:cs="Times New Roman"/>
+          <w:i/>
+          <w:iCs/>
+          <w:lang w:val="es-DO"/>
+        </w:rPr>
+        <w:t>hiperparámetros</w:t>
+      </w:r>
+      <w:proofErr w:type="spellEnd"/>
+      <w:r>
+        <w:rPr>
+          <w:rFonts w:ascii="Times New Roman" w:hAnsi="Times New Roman" w:cs="Times New Roman"/>
+          <w:i/>
+          <w:iCs/>
+          <w:lang w:val="es-DO"/>
+        </w:rPr>
+        <w:t xml:space="preserve"> elevan el desempeño global del clasificador SVM).</w:t>
+      </w:r>
+    </w:p>
+    <w:p>
+      <w:pPr>
+        <w:numPr>
+          <w:ilvl w:val="0"/>
+          <w:numId w:val="6"/>
+        </w:numPr>
+        <w:tabs>
+          <w:tab w:val="left" w:pos="5364"/>
+        </w:tabs>
+        <w:jc w:val="both"/>
+        <w:rPr>
+          <w:rFonts w:ascii="Times New Roman" w:hAnsi="Times New Roman" w:cs="Times New Roman"/>
+          <w:b/>
+          <w:bCs/>
+          <w:lang w:val="es-DO"/>
+        </w:rPr>
+      </w:pPr>
+      <w:r>
+        <w:rPr>
+          <w:rFonts w:ascii="Times New Roman" w:hAnsi="Times New Roman" w:cs="Times New Roman"/>
+          <w:b/>
+          <w:bCs/>
+          <w:lang w:val="es-DO"/>
+        </w:rPr>
+        <w:t>Figura 2: Evolución de la Detección de Riesgo Crítico (</w:t>
+      </w:r>
+      <w:proofErr w:type="spellStart"/>
+      <w:r>
+        <w:rPr>
+          <w:rFonts w:ascii="Times New Roman" w:hAnsi="Times New Roman" w:cs="Times New Roman"/>
+          <w:b/>
+          <w:bCs/>
+          <w:lang w:val="es-DO"/>
+        </w:rPr>
+        <w:t>Recall</w:t>
+      </w:r>
+      <w:proofErr w:type="spellEnd"/>
+      <w:r>
+        <w:rPr>
+          <w:rFonts w:ascii="Times New Roman" w:hAnsi="Times New Roman" w:cs="Times New Roman"/>
+          <w:b/>
+          <w:bCs/>
+          <w:lang w:val="es-DO"/>
+        </w:rPr>
+        <w:t xml:space="preserve"> Clase 2 - Impago)</w:t>
+      </w:r>
+    </w:p>
+    <w:p>
+      <w:pPr>
+        <w:numPr>
+          <w:ilvl w:val="1"/>
+          <w:numId w:val="6"/>
+        </w:numPr>
+        <w:tabs>
+          <w:tab w:val="left" w:pos="5364"/>
+        </w:tabs>
+        <w:jc w:val="both"/>
+        <w:rPr>
+          <w:rFonts w:ascii="Times New Roman" w:hAnsi="Times New Roman" w:cs="Times New Roman"/>
+          <w:lang w:val="es-DO"/>
+        </w:rPr>
+      </w:pPr>
+      <w:proofErr w:type="spellStart"/>
+      <w:r>
+        <w:rPr>
+          <w:rFonts w:ascii="Times New Roman" w:hAnsi="Times New Roman" w:cs="Times New Roman"/>
+          <w:i/>
+          <w:iCs/>
+          <w:lang w:val="es-DO"/>
+        </w:rPr>
+        <w:t>Dummy</w:t>
+      </w:r>
+      <w:proofErr w:type="spellEnd"/>
+      <w:r>
+        <w:rPr>
+          <w:rFonts w:ascii="Times New Roman" w:hAnsi="Times New Roman" w:cs="Times New Roman"/>
+          <w:i/>
+          <w:iCs/>
+          <w:lang w:val="es-DO"/>
+        </w:rPr>
+        <w:t xml:space="preserve"> Classifier:</w:t>
+      </w:r>
+      <w:r>
+        <w:rPr>
+          <w:rFonts w:ascii="Times New Roman" w:hAnsi="Times New Roman" w:cs="Times New Roman"/>
+          <w:lang w:val="es-DO"/>
+        </w:rPr>
+        <w:t xml:space="preserve"> 0.00%</w:t>
+      </w:r>
+    </w:p>
+    <w:p>
+      <w:pPr>
+        <w:numPr>
+          <w:ilvl w:val="1"/>
+          <w:numId w:val="6"/>
+        </w:numPr>
+        <w:tabs>
+          <w:tab w:val="left" w:pos="5364"/>
+        </w:tabs>
+        <w:jc w:val="both"/>
+        <w:rPr>
+          <w:rFonts w:ascii="Times New Roman" w:hAnsi="Times New Roman" w:cs="Times New Roman"/>
+          <w:lang w:val="es-DO"/>
+        </w:rPr>
+      </w:pPr>
+      <w:r>
+        <w:rPr>
+          <w:rFonts w:ascii="Times New Roman" w:hAnsi="Times New Roman" w:cs="Times New Roman"/>
+          <w:i/>
+          <w:iCs/>
+          <w:lang w:val="es-DO"/>
+        </w:rPr>
+        <w:t>SVM Base:</w:t>
+      </w:r>
+      <w:r>
+        <w:rPr>
+          <w:rFonts w:ascii="Times New Roman" w:hAnsi="Times New Roman" w:cs="Times New Roman"/>
+          <w:lang w:val="es-DO"/>
+        </w:rPr>
+        <w:t xml:space="preserve"> 48.33% (detecta menos de la mitad de los morosos)</w:t>
+      </w:r>
+    </w:p>
+    <w:p>
+      <w:pPr>
+        <w:numPr>
+          <w:ilvl w:val="1"/>
+          <w:numId w:val="6"/>
+        </w:numPr>
+        <w:tabs>
+          <w:tab w:val="left" w:pos="5364"/>
+        </w:tabs>
+        <w:jc w:val="both"/>
+        <w:rPr>
+          <w:rFonts w:ascii="Times New Roman" w:hAnsi="Times New Roman" w:cs="Times New Roman"/>
+          <w:lang w:val="es-DO"/>
+        </w:rPr>
+      </w:pPr>
+      <w:r>
+        <w:rPr>
+          <w:rFonts w:ascii="Times New Roman" w:hAnsi="Times New Roman" w:cs="Times New Roman"/>
+          <w:i/>
+          <w:iCs/>
+          <w:lang w:val="es-DO"/>
+        </w:rPr>
+        <w:t>SVM Optimizado:</w:t>
+      </w:r>
+      <w:r>
+        <w:rPr>
+          <w:rFonts w:ascii="Times New Roman" w:hAnsi="Times New Roman" w:cs="Times New Roman"/>
+          <w:lang w:val="es-DO"/>
+        </w:rPr>
+        <w:t xml:space="preserve"> 51.67%</w:t>
+      </w:r>
+    </w:p>
+    <w:p>
+      <w:pPr>
+        <w:numPr>
+          <w:ilvl w:val="1"/>
+          <w:numId w:val="6"/>
+        </w:numPr>
+        <w:tabs>
+          <w:tab w:val="left" w:pos="5364"/>
+        </w:tabs>
+        <w:jc w:val="both"/>
+        <w:rPr>
+          <w:rFonts w:ascii="Times New Roman" w:hAnsi="Times New Roman" w:cs="Times New Roman"/>
+          <w:lang w:val="es-DO"/>
+        </w:rPr>
+      </w:pPr>
+      <w:r>
+        <w:rPr>
+          <w:rFonts w:ascii="Times New Roman" w:hAnsi="Times New Roman" w:cs="Times New Roman"/>
+          <w:i/>
+          <w:iCs/>
+          <w:lang w:val="es-DO"/>
+        </w:rPr>
+        <w:t>SVM Optimizado + Reducción:</w:t>
+      </w:r>
+      <w:r>
+        <w:rPr>
+          <w:rFonts w:ascii="Times New Roman" w:hAnsi="Times New Roman" w:cs="Times New Roman"/>
+          <w:lang w:val="es-DO"/>
+        </w:rPr>
+        <w:t xml:space="preserve"> 66.67% </w:t>
+      </w:r>
+      <w:r>
+        <w:rPr>
+          <w:rFonts w:ascii="Times New Roman" w:hAnsi="Times New Roman" w:cs="Times New Roman"/>
+          <w:i/>
+          <w:iCs/>
+          <w:lang w:val="es-DO"/>
+        </w:rPr>
+        <w:t>(Refleja la reducción sustancial de falsos negativos, que representan el mayor riesgo financiero para la cartera crediticia).</w:t>
+      </w:r>
+    </w:p>
+    <w:p>
+      <w:pPr>
+        <w:tabs>
+          <w:tab w:val="left" w:pos="5364"/>
+        </w:tabs>
+        <w:jc w:val="both"/>
+        <w:rPr>
+          <w:rFonts w:ascii="Times New Roman" w:hAnsi="Times New Roman" w:cs="Times New Roman"/>
+          <w:b/>
+          <w:bCs/>
+          <w:lang w:val="es-DO"/>
+        </w:rPr>
+      </w:pPr>
+      <w:r>
+        <w:rPr>
+          <w:rFonts w:ascii="Times New Roman" w:hAnsi="Times New Roman" w:cs="Times New Roman"/>
+          <w:b/>
+          <w:bCs/>
+          <w:lang w:val="es-DO"/>
+        </w:rPr>
+        <w:t>5. Conclusión</w:t>
+      </w:r>
+    </w:p>
+    <w:p>
+      <w:pPr>
+        <w:tabs>
+          <w:tab w:val="left" w:pos="5364"/>
+        </w:tabs>
+        <w:jc w:val="both"/>
+        <w:rPr>
+          <w:rFonts w:ascii="Times New Roman" w:hAnsi="Times New Roman" w:cs="Times New Roman"/>
+          <w:lang w:val="es-DO"/>
+        </w:rPr>
+      </w:pPr>
+      <w:r>
+        <w:rPr>
+          <w:rFonts w:ascii="Times New Roman" w:hAnsi="Times New Roman" w:cs="Times New Roman"/>
+          <w:lang w:val="es-DO"/>
+        </w:rPr>
+        <w:t>El clasificador de vectores de soporte (SVM) demostró una superioridad categórica frente a la línea base (</w:t>
+      </w:r>
+      <w:proofErr w:type="spellStart"/>
+      <w:r>
+        <w:rPr>
+          <w:rFonts w:ascii="Times New Roman" w:hAnsi="Times New Roman" w:cs="Times New Roman"/>
+          <w:lang w:val="es-DO"/>
+        </w:rPr>
+        <w:t>Dummy</w:t>
+      </w:r>
+      <w:proofErr w:type="spellEnd"/>
+      <w:r>
+        <w:rPr>
+          <w:rFonts w:ascii="Times New Roman" w:hAnsi="Times New Roman" w:cs="Times New Roman"/>
+          <w:lang w:val="es-DO"/>
+        </w:rPr>
+        <w:t xml:space="preserve"> Classifier, F1-macro de 0.4118). Si bien la versión base obtuvo una exactitud global aceptable (79.0%), presentó un bajo nivel de captura de solicitantes insolventes (</w:t>
+      </w:r>
+      <w:proofErr w:type="spellStart"/>
+      <w:r>
+        <w:rPr>
+          <w:rFonts w:ascii="Times New Roman" w:hAnsi="Times New Roman" w:cs="Times New Roman"/>
+          <w:lang w:val="es-DO"/>
+        </w:rPr>
+        <w:t>recall</w:t>
+      </w:r>
+      <w:proofErr w:type="spellEnd"/>
+      <w:r>
+        <w:rPr>
+          <w:rFonts w:ascii="Times New Roman" w:hAnsi="Times New Roman" w:cs="Times New Roman"/>
+          <w:lang w:val="es-DO"/>
+        </w:rPr>
+        <w:t xml:space="preserve"> de 48.33% en Clase 2), lo que en un contexto financiero real implicaría la concesión de préstamos incobrables de alto costo operativo.</w:t>
+      </w:r>
+    </w:p>
+    <w:p>
+      <w:pPr>
+        <w:tabs>
+          <w:tab w:val="left" w:pos="5364"/>
+        </w:tabs>
+        <w:jc w:val="both"/>
+        <w:rPr>
+          <w:rFonts w:ascii="Times New Roman" w:hAnsi="Times New Roman" w:cs="Times New Roman"/>
+          <w:lang w:val="es-DO"/>
+        </w:rPr>
+      </w:pPr>
+      <w:r>
+        <w:rPr>
+          <w:rFonts w:ascii="Times New Roman" w:hAnsi="Times New Roman" w:cs="Times New Roman"/>
+          <w:lang w:val="es-DO"/>
+        </w:rPr>
+        <w:t>Mediante la optimización por validación cruzada y la eliminación controlada de predictores irrelevantes (</w:t>
+      </w:r>
+      <w:r>
+        <w:rPr>
+          <w:rFonts w:ascii="Times New Roman" w:hAnsi="Times New Roman" w:cs="Times New Roman"/>
+          <w:i/>
+          <w:iCs/>
+          <w:lang w:val="es-DO"/>
+        </w:rPr>
+        <w:t>Green AI</w:t>
+      </w:r>
+      <w:r>
+        <w:rPr>
+          <w:rFonts w:ascii="Times New Roman" w:hAnsi="Times New Roman" w:cs="Times New Roman"/>
+          <w:lang w:val="es-DO"/>
+        </w:rPr>
+        <w:t xml:space="preserve">), el modelo SVM optimizado con reducción alcanzó el mejor balance general con un F1-macro de 0.7382 y un incremento del </w:t>
+      </w:r>
+      <w:proofErr w:type="spellStart"/>
+      <w:r>
+        <w:rPr>
+          <w:rFonts w:ascii="Times New Roman" w:hAnsi="Times New Roman" w:cs="Times New Roman"/>
+          <w:lang w:val="es-DO"/>
+        </w:rPr>
+        <w:t>recall</w:t>
+      </w:r>
+      <w:proofErr w:type="spellEnd"/>
+      <w:r>
+        <w:rPr>
+          <w:rFonts w:ascii="Times New Roman" w:hAnsi="Times New Roman" w:cs="Times New Roman"/>
+          <w:lang w:val="es-DO"/>
+        </w:rPr>
+        <w:t xml:space="preserve"> de la clase de riesgo hasta el 66.67%. Esto valida el uso de pipelines reproducibles y selección de características como un enfoque viable para soporte a decisiones crediticias.</w:t>
+      </w:r>
+    </w:p>
+    <w:p>
+      <w:pPr>
+        <w:spacing w:after="0" w:line="240" w:lineRule="auto"/>
+        <w:jc w:val="center"/>
+        <w:rPr>
+          <w:rFonts w:ascii="Times New Roman" w:hAnsi="Times New Roman" w:cs="Times New Roman"/>
+        </w:rPr>
+      </w:pPr>
+    </w:p>
+    <w:p>
+      <w:pPr>
+        <w:tabs>
+          <w:tab w:val="left" w:pos="5364"/>
+        </w:tabs>
+        <w:jc w:val="both"/>
+        <w:rPr>
+          <w:rFonts w:ascii="Times New Roman" w:hAnsi="Times New Roman" w:cs="Times New Roman"/>
+          <w:b/>
+          <w:bCs/>
+          <w:lang w:val="es-DO"/>
+        </w:rPr>
+      </w:pPr>
+      <w:r>
+        <w:rPr>
+          <w:rFonts w:ascii="Times New Roman" w:hAnsi="Times New Roman" w:cs="Times New Roman"/>
+          <w:b/>
+          <w:bCs/>
+          <w:lang w:val="es-DO"/>
+        </w:rPr>
+        <w:t>6. Declaración de Uso Ético y Asistencia de Inteligencia Artificial (IA)</w:t>
+      </w:r>
+    </w:p>
+    <w:p>
+      <w:pPr>
+        <w:tabs>
+          <w:tab w:val="left" w:pos="5364"/>
+        </w:tabs>
+        <w:jc w:val="both"/>
+        <w:rPr>
+          <w:rFonts w:ascii="Times New Roman" w:hAnsi="Times New Roman" w:cs="Times New Roman"/>
+          <w:lang w:val="es-DO"/>
+        </w:rPr>
+      </w:pPr>
+      <w:r>
+        <w:rPr>
+          <w:rFonts w:ascii="Times New Roman" w:hAnsi="Times New Roman" w:cs="Times New Roman"/>
+          <w:lang w:val="es-DO"/>
+        </w:rPr>
+        <w:t>En concordancia con los principios de integridad científica, rigor metodológico y transparencia académica, se declara el uso asistido de herramientas de inteligencia artificial generativa durante el desarrollo y documentación del proyecto en las siguientes áreas específicas:</w:t>
+      </w:r>
+    </w:p>
+    <w:p>
+      <w:pPr>
+        <w:numPr>
+          <w:ilvl w:val="0"/>
+          <w:numId w:val="7"/>
+        </w:numPr>
+        <w:tabs>
+          <w:tab w:val="left" w:pos="5364"/>
+        </w:tabs>
+        <w:jc w:val="both"/>
+        <w:rPr>
+          <w:rFonts w:ascii="Times New Roman" w:hAnsi="Times New Roman" w:cs="Times New Roman"/>
+          <w:b/>
+          <w:bCs/>
+          <w:lang w:val="es-DO"/>
+        </w:rPr>
+      </w:pPr>
+      <w:r>
+        <w:rPr>
+          <w:rFonts w:ascii="Times New Roman" w:hAnsi="Times New Roman" w:cs="Times New Roman"/>
+          <w:b/>
+          <w:bCs/>
+          <w:lang w:val="es-DO"/>
+        </w:rPr>
+        <w:t>Google Gemini (versión avanzada de Google):</w:t>
+      </w:r>
+    </w:p>
+    <w:p>
+      <w:pPr>
+        <w:numPr>
+          <w:ilvl w:val="1"/>
+          <w:numId w:val="7"/>
+        </w:numPr>
+        <w:tabs>
+          <w:tab w:val="left" w:pos="5364"/>
+        </w:tabs>
+        <w:jc w:val="both"/>
+        <w:rPr>
+          <w:rFonts w:ascii="Times New Roman" w:hAnsi="Times New Roman" w:cs="Times New Roman"/>
+          <w:lang w:val="es-DO"/>
+        </w:rPr>
+      </w:pPr>
+      <w:r>
+        <w:rPr>
+          <w:rFonts w:ascii="Times New Roman" w:hAnsi="Times New Roman" w:cs="Times New Roman"/>
+          <w:lang w:val="es-DO"/>
+        </w:rPr>
+        <w:t>Asistencia técnica en programación: Soporte en la identificación y corrección de errores de sintaxis y ejecución (</w:t>
+      </w:r>
+      <w:proofErr w:type="spellStart"/>
+      <w:r>
+        <w:rPr>
+          <w:rFonts w:ascii="Times New Roman" w:hAnsi="Times New Roman" w:cs="Times New Roman"/>
+          <w:i/>
+          <w:iCs/>
+          <w:lang w:val="es-DO"/>
+        </w:rPr>
+        <w:t>debugging</w:t>
+      </w:r>
+      <w:proofErr w:type="spellEnd"/>
+      <w:r>
+        <w:rPr>
+          <w:rFonts w:ascii="Times New Roman" w:hAnsi="Times New Roman" w:cs="Times New Roman"/>
+          <w:lang w:val="es-DO"/>
+        </w:rPr>
+        <w:t>), refactorización de scripts y optimización de llamadas de librerías (</w:t>
+      </w:r>
+      <w:proofErr w:type="spellStart"/>
+      <w:r>
+        <w:rPr>
+          <w:rFonts w:ascii="Times New Roman" w:hAnsi="Times New Roman" w:cs="Times New Roman"/>
+          <w:lang w:val="es-DO"/>
+        </w:rPr>
+        <w:t>scikit-learn</w:t>
+      </w:r>
+      <w:proofErr w:type="spellEnd"/>
+      <w:r>
+        <w:rPr>
+          <w:rFonts w:ascii="Times New Roman" w:hAnsi="Times New Roman" w:cs="Times New Roman"/>
+          <w:lang w:val="es-DO"/>
+        </w:rPr>
+        <w:t>, pandas).</w:t>
+      </w:r>
+    </w:p>
+    <w:p>
+      <w:pPr>
+        <w:numPr>
+          <w:ilvl w:val="1"/>
+          <w:numId w:val="7"/>
+        </w:numPr>
+        <w:tabs>
+          <w:tab w:val="left" w:pos="5364"/>
+        </w:tabs>
+        <w:jc w:val="both"/>
+        <w:rPr>
+          <w:rFonts w:ascii="Times New Roman" w:hAnsi="Times New Roman" w:cs="Times New Roman"/>
+          <w:lang w:val="es-DO"/>
+        </w:rPr>
+      </w:pPr>
+      <w:r>
+        <w:rPr>
+          <w:rFonts w:ascii="Times New Roman" w:hAnsi="Times New Roman" w:cs="Times New Roman"/>
+          <w:lang w:val="es-DO"/>
+        </w:rPr>
+        <w:t xml:space="preserve">Revisión y validación de código: Evaluación de la lógica de los flujos de trabajo para asegurar el cumplimiento de buenas prácticas de aprendizaje automático, </w:t>
+      </w:r>
+      <w:r>
+        <w:rPr>
+          <w:rFonts w:ascii="Times New Roman" w:hAnsi="Times New Roman" w:cs="Times New Roman"/>
+          <w:lang w:val="es-DO"/>
+        </w:rPr>
+        <w:lastRenderedPageBreak/>
+        <w:t>garantizando la ausencia de fuga de datos (</w:t>
+      </w:r>
+      <w:r>
+        <w:rPr>
+          <w:rFonts w:ascii="Times New Roman" w:hAnsi="Times New Roman" w:cs="Times New Roman"/>
+          <w:i/>
+          <w:iCs/>
+          <w:lang w:val="es-DO"/>
+        </w:rPr>
+        <w:t xml:space="preserve">data </w:t>
+      </w:r>
+      <w:proofErr w:type="spellStart"/>
+      <w:r>
+        <w:rPr>
+          <w:rFonts w:ascii="Times New Roman" w:hAnsi="Times New Roman" w:cs="Times New Roman"/>
+          <w:i/>
+          <w:iCs/>
+          <w:lang w:val="es-DO"/>
+        </w:rPr>
+        <w:t>leakage</w:t>
+      </w:r>
+      <w:proofErr w:type="spellEnd"/>
+      <w:r>
+        <w:rPr>
+          <w:rFonts w:ascii="Times New Roman" w:hAnsi="Times New Roman" w:cs="Times New Roman"/>
+          <w:lang w:val="es-DO"/>
+        </w:rPr>
+        <w:t xml:space="preserve">) dentro de los objetos Pipeline y </w:t>
+      </w:r>
+      <w:proofErr w:type="spellStart"/>
+      <w:r>
+        <w:rPr>
+          <w:rFonts w:ascii="Times New Roman" w:hAnsi="Times New Roman" w:cs="Times New Roman"/>
+          <w:lang w:val="es-DO"/>
+        </w:rPr>
+        <w:t>ColumnTransformer</w:t>
+      </w:r>
+      <w:proofErr w:type="spellEnd"/>
+      <w:r>
+        <w:rPr>
+          <w:rFonts w:ascii="Times New Roman" w:hAnsi="Times New Roman" w:cs="Times New Roman"/>
+          <w:lang w:val="es-DO"/>
+        </w:rPr>
+        <w:t>.</w:t>
+      </w:r>
+    </w:p>
+    <w:p>
+      <w:pPr>
+        <w:numPr>
+          <w:ilvl w:val="1"/>
+          <w:numId w:val="7"/>
+        </w:numPr>
+        <w:tabs>
+          <w:tab w:val="left" w:pos="5364"/>
+        </w:tabs>
+        <w:jc w:val="both"/>
+        <w:rPr>
+          <w:rFonts w:ascii="Times New Roman" w:hAnsi="Times New Roman" w:cs="Times New Roman"/>
+          <w:lang w:val="es-DO"/>
+        </w:rPr>
+      </w:pPr>
+      <w:r>
+        <w:rPr>
+          <w:rFonts w:ascii="Times New Roman" w:hAnsi="Times New Roman" w:cs="Times New Roman"/>
+          <w:lang w:val="es-DO"/>
+        </w:rPr>
+        <w:t>Síntesis y redacción: Apoyo en la formulación ejecutiva, estructuración y formateo del presente informe de entrega y sus tablas comparativas.</w:t>
+      </w:r>
+    </w:p>
+    <w:p>
+      <w:pPr>
+        <w:numPr>
+          <w:ilvl w:val="0"/>
+          <w:numId w:val="7"/>
+        </w:numPr>
+        <w:tabs>
+          <w:tab w:val="left" w:pos="5364"/>
+        </w:tabs>
+        <w:jc w:val="both"/>
+        <w:rPr>
+          <w:rFonts w:ascii="Times New Roman" w:hAnsi="Times New Roman" w:cs="Times New Roman"/>
+          <w:b/>
+          <w:bCs/>
+          <w:lang w:val="es-DO"/>
+        </w:rPr>
+      </w:pPr>
+      <w:r>
+        <w:rPr>
+          <w:rFonts w:ascii="Times New Roman" w:hAnsi="Times New Roman" w:cs="Times New Roman"/>
+          <w:b/>
+          <w:bCs/>
+          <w:lang w:val="es-DO"/>
+        </w:rPr>
+        <w:t>Google NotebookLM:</w:t>
+      </w:r>
+    </w:p>
+    <w:p>
+      <w:pPr>
+        <w:numPr>
+          <w:ilvl w:val="1"/>
+          <w:numId w:val="7"/>
+        </w:numPr>
+        <w:tabs>
+          <w:tab w:val="left" w:pos="5364"/>
+        </w:tabs>
+        <w:jc w:val="both"/>
+        <w:rPr>
+          <w:rFonts w:ascii="Times New Roman" w:hAnsi="Times New Roman" w:cs="Times New Roman"/>
+          <w:lang w:val="es-DO"/>
+        </w:rPr>
+      </w:pPr>
+      <w:r>
+        <w:rPr>
+          <w:rFonts w:ascii="Times New Roman" w:hAnsi="Times New Roman" w:cs="Times New Roman"/>
+          <w:lang w:val="es-DO"/>
+        </w:rPr>
+        <w:t>Gestión de conocimiento y consulta conceptual: Organización, consulta analítica y contraste conceptual sobre la documentación técnica de los algoritmos implementados (clasificador base y SVM), notas metodológicas del laboratorio y directrices del experimento.</w:t>
+      </w:r>
+    </w:p>
+    <w:p>
+      <w:pPr>
+        <w:tabs>
+          <w:tab w:val="left" w:pos="5364"/>
+        </w:tabs>
+        <w:jc w:val="both"/>
+        <w:rPr>
+          <w:rFonts w:ascii="Times New Roman" w:hAnsi="Times New Roman" w:cs="Times New Roman"/>
+          <w:b/>
+          <w:bCs/>
+          <w:lang w:val="es-DO"/>
+        </w:rPr>
+      </w:pPr>
+      <w:r>
+        <w:rPr>
+          <w:rFonts w:ascii="Times New Roman" w:hAnsi="Times New Roman" w:cs="Times New Roman"/>
+          <w:b/>
+          <w:bCs/>
+          <w:lang w:val="es-DO"/>
+        </w:rPr>
+        <w:t>Responsabilidad y autoría académica:</w:t>
+      </w:r>
+    </w:p>
+    <w:p>
+      <w:pPr>
+        <w:tabs>
+          <w:tab w:val="left" w:pos="5364"/>
+        </w:tabs>
+        <w:jc w:val="both"/>
+        <w:rPr>
+          <w:rFonts w:ascii="Times New Roman" w:hAnsi="Times New Roman" w:cs="Times New Roman"/>
+          <w:lang w:val="es-DO"/>
+        </w:rPr>
+      </w:pPr>
+      <w:r>
+        <w:rPr>
+          <w:rFonts w:ascii="Times New Roman" w:hAnsi="Times New Roman" w:cs="Times New Roman"/>
+          <w:lang w:val="es-DO"/>
+        </w:rPr>
+        <w:t xml:space="preserve">El uso de estas herramientas operó exclusivamente como un recurso de asistencia y soporte instrumental. La formulación del experimento, la toma de decisiones sobre la partición estratificada de datos, la selección de </w:t>
+      </w:r>
+      <w:proofErr w:type="spellStart"/>
+      <w:r>
+        <w:rPr>
+          <w:rFonts w:ascii="Times New Roman" w:hAnsi="Times New Roman" w:cs="Times New Roman"/>
+          <w:lang w:val="es-DO"/>
+        </w:rPr>
+        <w:t>hiperparámetros</w:t>
+      </w:r>
+      <w:proofErr w:type="spellEnd"/>
+      <w:r>
+        <w:rPr>
+          <w:rFonts w:ascii="Times New Roman" w:hAnsi="Times New Roman" w:cs="Times New Roman"/>
+          <w:lang w:val="es-DO"/>
+        </w:rPr>
+        <w:t xml:space="preserve"> en </w:t>
+      </w:r>
+      <w:proofErr w:type="spellStart"/>
+      <w:r>
+        <w:rPr>
+          <w:rFonts w:ascii="Times New Roman" w:hAnsi="Times New Roman" w:cs="Times New Roman"/>
+          <w:lang w:val="es-DO"/>
+        </w:rPr>
+        <w:t>GridSearchCV</w:t>
+      </w:r>
+      <w:proofErr w:type="spellEnd"/>
+      <w:r>
+        <w:rPr>
+          <w:rFonts w:ascii="Times New Roman" w:hAnsi="Times New Roman" w:cs="Times New Roman"/>
+          <w:lang w:val="es-DO"/>
+        </w:rPr>
+        <w:t>, el criterio de reducción dimensional y la interpretación crítica de las métricas de rendimiento fueron concebidos, ejecutados y verificados bajo la autoría y juicio analítico del estudiante.</w:t>
+      </w:r>
+    </w:p>
+    <w:p>
+      <w:pPr>
+        <w:tabs>
+          <w:tab w:val="left" w:pos="5364"/>
+        </w:tabs>
+        <w:jc w:val="both"/>
+        <w:rPr>
+          <w:rFonts w:ascii="Times New Roman" w:hAnsi="Times New Roman" w:cs="Times New Roman"/>
+          <w:b/>
+          <w:bCs/>
+          <w:lang w:val="es-DO"/>
+        </w:rPr>
+      </w:pPr>
+    </w:p>
+    <w:p>
+      <w:pPr>
+        <w:tabs>
+          <w:tab w:val="left" w:pos="5364"/>
+        </w:tabs>
+        <w:jc w:val="both"/>
+        <w:rPr>
+          <w:rFonts w:ascii="Times New Roman" w:hAnsi="Times New Roman" w:cs="Times New Roman"/>
+          <w:b/>
+          <w:bCs/>
+          <w:lang w:val="es-DO"/>
+        </w:rPr>
+      </w:pPr>
+    </w:p>
+    <w:p>
+      <w:pPr>
+        <w:tabs>
+          <w:tab w:val="left" w:pos="5364"/>
+        </w:tabs>
+        <w:jc w:val="both"/>
+        <w:rPr>
+          <w:rFonts w:ascii="Times New Roman" w:hAnsi="Times New Roman" w:cs="Times New Roman"/>
+          <w:b/>
+          <w:bCs/>
+          <w:lang w:val="es-DO"/>
+        </w:rPr>
+      </w:pPr>
     </w:p>
     <w:p>
       <w:pPr>
@@ -2991,7 +5883,7 @@
                     <pic:cNvPicPr/>
                   </pic:nvPicPr>
                   <pic:blipFill>
-                    <a:blip r:embed="rId19"/>
+                    <a:blip r:embed="rId21"/>
                     <a:stretch>
                       <a:fillRect/>
                     </a:stretch>
@@ -3049,7 +5941,7 @@
                     <pic:cNvPicPr/>
                   </pic:nvPicPr>
                   <pic:blipFill>
-                    <a:blip r:embed="rId20"/>
+                    <a:blip r:embed="rId22"/>
                     <a:stretch>
                       <a:fillRect/>
                     </a:stretch>
@@ -3122,7 +6014,7 @@
                     <pic:cNvPicPr/>
                   </pic:nvPicPr>
                   <pic:blipFill>
-                    <a:blip r:embed="rId21"/>
+                    <a:blip r:embed="rId23"/>
                     <a:stretch>
                       <a:fillRect/>
                     </a:stretch>
@@ -3194,7 +6086,7 @@
                     <pic:cNvPicPr/>
                   </pic:nvPicPr>
                   <pic:blipFill>
-                    <a:blip r:embed="rId22"/>
+                    <a:blip r:embed="rId24"/>
                     <a:stretch>
                       <a:fillRect/>
                     </a:stretch>
@@ -3253,7 +6145,7 @@
                     <pic:cNvPicPr/>
                   </pic:nvPicPr>
                   <pic:blipFill>
-                    <a:blip r:embed="rId23"/>
+                    <a:blip r:embed="rId25"/>
                     <a:stretch>
                       <a:fillRect/>
                     </a:stretch>
@@ -3311,7 +6203,7 @@
                     <pic:cNvPicPr/>
                   </pic:nvPicPr>
                   <pic:blipFill>
-                    <a:blip r:embed="rId24"/>
+                    <a:blip r:embed="rId26"/>
                     <a:stretch>
                       <a:fillRect/>
                     </a:stretch>
@@ -3370,7 +6262,7 @@
                     <pic:cNvPicPr/>
                   </pic:nvPicPr>
                   <pic:blipFill>
-                    <a:blip r:embed="rId25"/>
+                    <a:blip r:embed="rId27"/>
                     <a:stretch>
                       <a:fillRect/>
                     </a:stretch>
@@ -3428,7 +6320,7 @@
                     <pic:cNvPicPr/>
                   </pic:nvPicPr>
                   <pic:blipFill>
-                    <a:blip r:embed="rId26"/>
+                    <a:blip r:embed="rId28"/>
                     <a:stretch>
                       <a:fillRect/>
                     </a:stretch>
@@ -3513,7 +6405,7 @@
                     <pic:cNvPicPr/>
                   </pic:nvPicPr>
                   <pic:blipFill>
-                    <a:blip r:embed="rId27"/>
+                    <a:blip r:embed="rId29"/>
                     <a:stretch>
                       <a:fillRect/>
                     </a:stretch>
@@ -3573,7 +6465,7 @@
                     <pic:cNvPicPr/>
                   </pic:nvPicPr>
                   <pic:blipFill>
-                    <a:blip r:embed="rId28"/>
+                    <a:blip r:embed="rId30"/>
                     <a:stretch>
                       <a:fillRect/>
                     </a:stretch>
@@ -3604,7 +6496,7 @@
       </w:pPr>
     </w:p>
     <w:sectPr>
-      <w:headerReference w:type="first" r:id="rId29"/>
+      <w:headerReference w:type="first" r:id="rId31"/>
       <w:pgSz w:w="12240" w:h="15840" w:code="1"/>
       <w:pgMar w:top="1440" w:right="1440" w:bottom="1440" w:left="1440" w:header="709" w:footer="709" w:gutter="0"/>
       <w:pgNumType w:start="0"/>
@@ -3736,6 +6628,155 @@
 <file path=word/numbering.xml><?xml version="1.0" encoding="utf-8"?>
 <w:numbering xmlns:wpc="http://schemas.microsoft.com/office/word/2010/wordprocessingCanvas" xmlns:cx="http://schemas.microsoft.com/office/drawing/2014/chartex" xmlns:cx1="http://schemas.microsoft.com/office/drawing/2015/9/8/chartex" xmlns:cx2="http://schemas.microsoft.com/office/drawing/2015/10/21/chartex" xmlns:cx3="http://schemas.microsoft.com/office/drawing/2016/5/9/chartex" xmlns:cx4="http://schemas.microsoft.com/office/drawing/2016/5/10/chartex" xmlns:cx5="http://schemas.microsoft.com/office/drawing/2016/5/11/chartex" xmlns:cx6="http://schemas.microsoft.com/office/drawing/2016/5/12/chartex" xmlns:cx7="http://schemas.microsoft.com/office/drawing/2016/5/13/chartex" xmlns:cx8="http://schemas.microsoft.com/office/drawing/2016/5/14/chartex" xmlns:mc="http://schemas.openxmlformats.org/markup-compatibility/2006" xmlns:aink="http://schemas.microsoft.com/office/drawing/2016/ink" xmlns:am3d="http://schemas.microsoft.com/office/drawing/2017/model3d" xmlns:o="urn:schemas-microsoft-com:office:office" xmlns:oel="http://schemas.microsoft.com/office/2019/extlst" xmlns:r="http://schemas.openxmlformats.org/officeDocument/2006/relationships" xmlns:m="http://schemas.openxmlformats.org/officeDocument/2006/math" xmlns:v="urn:schemas-microsoft-com:vml" xmlns:wp14="http://schemas.microsoft.com/office/word/2010/wordprocessingDrawing" xmlns:wp="http://schemas.openxmlformats.org/drawingml/2006/wordprocessingDrawing" xmlns:w10="urn:schemas-microsoft-com:office:word" xmlns:w="http://schemas.openxmlformats.org/wordprocessingml/2006/main" xmlns:w14="http://schemas.microsoft.com/office/word/2010/wordml" xmlns:w15="http://schemas.microsoft.com/office/word/2012/wordml" xmlns:w16cex="http://schemas.microsoft.com/office/word/2018/wordml/cex" xmlns:w16cid="http://schemas.microsoft.com/office/word/2016/wordml/cid" xmlns:w16="http://schemas.microsoft.com/office/word/2018/wordml" xmlns:w16du="http://schemas.microsoft.com/office/word/2023/wordml/word16du" xmlns:w16sdtdh="http://schemas.microsoft.com/office/word/2020/wordml/sdtdatahash" xmlns:w16sdtfl="http://schemas.microsoft.com/office/word/2024/wordml/sdtformatlock" xmlns:w16se="http://schemas.microsoft.com/office/word/2015/wordml/symex" xmlns:wpg="http://schemas.microsoft.com/office/word/2010/wordprocessingGroup" xmlns:wpi="http://schemas.microsoft.com/office/word/2010/wordprocessingInk" xmlns:wne="http://schemas.microsoft.com/office/word/2006/wordml" xmlns:wps="http://schemas.microsoft.com/office/word/2010/wordprocessingShape" mc:Ignorable="w14 w15 w16se w16cid w16 w16cex w16sdtdh w16sdtfl w16du wp14">
   <w:abstractNum w:abstractNumId="0" w15:restartNumberingAfterBreak="0">
+    <w:nsid w:val="0531601A"/>
+    <w:multiLevelType w:val="multilevel"/>
+    <w:tmpl w:val="31CA6942"/>
+    <w:lvl w:ilvl="0">
+      <w:start w:val="1"/>
+      <w:numFmt w:val="bullet"/>
+      <w:lvlText w:val=""/>
+      <w:lvlJc w:val="left"/>
+      <w:pPr>
+        <w:tabs>
+          <w:tab w:val="num" w:pos="720"/>
+        </w:tabs>
+        <w:ind w:left="720" w:hanging="360"/>
+      </w:pPr>
+      <w:rPr>
+        <w:rFonts w:ascii="Symbol" w:hAnsi="Symbol" w:hint="default"/>
+        <w:sz w:val="20"/>
+      </w:rPr>
+    </w:lvl>
+    <w:lvl w:ilvl="1" w:tentative="1">
+      <w:start w:val="1"/>
+      <w:numFmt w:val="bullet"/>
+      <w:lvlText w:val="o"/>
+      <w:lvlJc w:val="left"/>
+      <w:pPr>
+        <w:tabs>
+          <w:tab w:val="num" w:pos="1440"/>
+        </w:tabs>
+        <w:ind w:left="1440" w:hanging="360"/>
+      </w:pPr>
+      <w:rPr>
+        <w:rFonts w:ascii="Courier New" w:hAnsi="Courier New" w:hint="default"/>
+        <w:sz w:val="20"/>
+      </w:rPr>
+    </w:lvl>
+    <w:lvl w:ilvl="2" w:tentative="1">
+      <w:start w:val="1"/>
+      <w:numFmt w:val="bullet"/>
+      <w:lvlText w:val=""/>
+      <w:lvlJc w:val="left"/>
+      <w:pPr>
+        <w:tabs>
+          <w:tab w:val="num" w:pos="2160"/>
+        </w:tabs>
+        <w:ind w:left="2160" w:hanging="360"/>
+      </w:pPr>
+      <w:rPr>
+        <w:rFonts w:ascii="Wingdings" w:hAnsi="Wingdings" w:hint="default"/>
+        <w:sz w:val="20"/>
+      </w:rPr>
+    </w:lvl>
+    <w:lvl w:ilvl="3" w:tentative="1">
+      <w:start w:val="1"/>
+      <w:numFmt w:val="bullet"/>
+      <w:lvlText w:val=""/>
+      <w:lvlJc w:val="left"/>
+      <w:pPr>
+        <w:tabs>
+          <w:tab w:val="num" w:pos="2880"/>
+        </w:tabs>
+        <w:ind w:left="2880" w:hanging="360"/>
+      </w:pPr>
+      <w:rPr>
+        <w:rFonts w:ascii="Wingdings" w:hAnsi="Wingdings" w:hint="default"/>
+        <w:sz w:val="20"/>
+      </w:rPr>
+    </w:lvl>
+    <w:lvl w:ilvl="4" w:tentative="1">
+      <w:start w:val="1"/>
+      <w:numFmt w:val="bullet"/>
+      <w:lvlText w:val=""/>
+      <w:lvlJc w:val="left"/>
+      <w:pPr>
+        <w:tabs>
+          <w:tab w:val="num" w:pos="3600"/>
+        </w:tabs>
+        <w:ind w:left="3600" w:hanging="360"/>
+      </w:pPr>
+      <w:rPr>
+        <w:rFonts w:ascii="Wingdings" w:hAnsi="Wingdings" w:hint="default"/>
+        <w:sz w:val="20"/>
+      </w:rPr>
+    </w:lvl>
+    <w:lvl w:ilvl="5" w:tentative="1">
+      <w:start w:val="1"/>
+      <w:numFmt w:val="bullet"/>
+      <w:lvlText w:val=""/>
+      <w:lvlJc w:val="left"/>
+      <w:pPr>
+        <w:tabs>
+          <w:tab w:val="num" w:pos="4320"/>
+        </w:tabs>
+        <w:ind w:left="4320" w:hanging="360"/>
+      </w:pPr>
+      <w:rPr>
+        <w:rFonts w:ascii="Wingdings" w:hAnsi="Wingdings" w:hint="default"/>
+        <w:sz w:val="20"/>
+      </w:rPr>
+    </w:lvl>
+    <w:lvl w:ilvl="6" w:tentative="1">
+      <w:start w:val="1"/>
+      <w:numFmt w:val="bullet"/>
+      <w:lvlText w:val=""/>
+      <w:lvlJc w:val="left"/>
+      <w:pPr>
+        <w:tabs>
+          <w:tab w:val="num" w:pos="5040"/>
+        </w:tabs>
+        <w:ind w:left="5040" w:hanging="360"/>
+      </w:pPr>
+      <w:rPr>
+        <w:rFonts w:ascii="Wingdings" w:hAnsi="Wingdings" w:hint="default"/>
+        <w:sz w:val="20"/>
+      </w:rPr>
+    </w:lvl>
+    <w:lvl w:ilvl="7" w:tentative="1">
+      <w:start w:val="1"/>
+      <w:numFmt w:val="bullet"/>
+      <w:lvlText w:val=""/>
+      <w:lvlJc w:val="left"/>
+      <w:pPr>
+        <w:tabs>
+          <w:tab w:val="num" w:pos="5760"/>
+        </w:tabs>
+        <w:ind w:left="5760" w:hanging="360"/>
+      </w:pPr>
+      <w:rPr>
+        <w:rFonts w:ascii="Wingdings" w:hAnsi="Wingdings" w:hint="default"/>
+        <w:sz w:val="20"/>
+      </w:rPr>
+    </w:lvl>
+    <w:lvl w:ilvl="8" w:tentative="1">
+      <w:start w:val="1"/>
+      <w:numFmt w:val="bullet"/>
+      <w:lvlText w:val=""/>
+      <w:lvlJc w:val="left"/>
+      <w:pPr>
+        <w:tabs>
+          <w:tab w:val="num" w:pos="6480"/>
+        </w:tabs>
+        <w:ind w:left="6480" w:hanging="360"/>
+      </w:pPr>
+      <w:rPr>
+        <w:rFonts w:ascii="Wingdings" w:hAnsi="Wingdings" w:hint="default"/>
+        <w:sz w:val="20"/>
+      </w:rPr>
+    </w:lvl>
+  </w:abstractNum>
+  <w:abstractNum w:abstractNumId="1" w15:restartNumberingAfterBreak="0">
     <w:nsid w:val="0D5A5C1A"/>
     <w:multiLevelType w:val="multilevel"/>
     <w:tmpl w:val="515807C8"/>
@@ -3884,7 +6925,7 @@
       </w:rPr>
     </w:lvl>
   </w:abstractNum>
-  <w:abstractNum w:abstractNumId="1" w15:restartNumberingAfterBreak="0">
+  <w:abstractNum w:abstractNumId="2" w15:restartNumberingAfterBreak="0">
     <w:nsid w:val="19482510"/>
     <w:multiLevelType w:val="multilevel"/>
     <w:tmpl w:val="0BB446F4"/>
@@ -4033,7 +7074,156 @@
       </w:rPr>
     </w:lvl>
   </w:abstractNum>
-  <w:abstractNum w:abstractNumId="2" w15:restartNumberingAfterBreak="0">
+  <w:abstractNum w:abstractNumId="3" w15:restartNumberingAfterBreak="0">
+    <w:nsid w:val="2AA94A86"/>
+    <w:multiLevelType w:val="multilevel"/>
+    <w:tmpl w:val="6C92810C"/>
+    <w:lvl w:ilvl="0">
+      <w:start w:val="1"/>
+      <w:numFmt w:val="bullet"/>
+      <w:lvlText w:val=""/>
+      <w:lvlJc w:val="left"/>
+      <w:pPr>
+        <w:tabs>
+          <w:tab w:val="num" w:pos="720"/>
+        </w:tabs>
+        <w:ind w:left="720" w:hanging="360"/>
+      </w:pPr>
+      <w:rPr>
+        <w:rFonts w:ascii="Symbol" w:hAnsi="Symbol" w:hint="default"/>
+        <w:sz w:val="20"/>
+      </w:rPr>
+    </w:lvl>
+    <w:lvl w:ilvl="1">
+      <w:start w:val="1"/>
+      <w:numFmt w:val="bullet"/>
+      <w:lvlText w:val="o"/>
+      <w:lvlJc w:val="left"/>
+      <w:pPr>
+        <w:tabs>
+          <w:tab w:val="num" w:pos="1440"/>
+        </w:tabs>
+        <w:ind w:left="1440" w:hanging="360"/>
+      </w:pPr>
+      <w:rPr>
+        <w:rFonts w:ascii="Courier New" w:hAnsi="Courier New" w:hint="default"/>
+        <w:sz w:val="20"/>
+      </w:rPr>
+    </w:lvl>
+    <w:lvl w:ilvl="2" w:tentative="1">
+      <w:start w:val="1"/>
+      <w:numFmt w:val="bullet"/>
+      <w:lvlText w:val=""/>
+      <w:lvlJc w:val="left"/>
+      <w:pPr>
+        <w:tabs>
+          <w:tab w:val="num" w:pos="2160"/>
+        </w:tabs>
+        <w:ind w:left="2160" w:hanging="360"/>
+      </w:pPr>
+      <w:rPr>
+        <w:rFonts w:ascii="Wingdings" w:hAnsi="Wingdings" w:hint="default"/>
+        <w:sz w:val="20"/>
+      </w:rPr>
+    </w:lvl>
+    <w:lvl w:ilvl="3" w:tentative="1">
+      <w:start w:val="1"/>
+      <w:numFmt w:val="bullet"/>
+      <w:lvlText w:val=""/>
+      <w:lvlJc w:val="left"/>
+      <w:pPr>
+        <w:tabs>
+          <w:tab w:val="num" w:pos="2880"/>
+        </w:tabs>
+        <w:ind w:left="2880" w:hanging="360"/>
+      </w:pPr>
+      <w:rPr>
+        <w:rFonts w:ascii="Wingdings" w:hAnsi="Wingdings" w:hint="default"/>
+        <w:sz w:val="20"/>
+      </w:rPr>
+    </w:lvl>
+    <w:lvl w:ilvl="4" w:tentative="1">
+      <w:start w:val="1"/>
+      <w:numFmt w:val="bullet"/>
+      <w:lvlText w:val=""/>
+      <w:lvlJc w:val="left"/>
+      <w:pPr>
+        <w:tabs>
+          <w:tab w:val="num" w:pos="3600"/>
+        </w:tabs>
+        <w:ind w:left="3600" w:hanging="360"/>
+      </w:pPr>
+      <w:rPr>
+        <w:rFonts w:ascii="Wingdings" w:hAnsi="Wingdings" w:hint="default"/>
+        <w:sz w:val="20"/>
+      </w:rPr>
+    </w:lvl>
+    <w:lvl w:ilvl="5" w:tentative="1">
+      <w:start w:val="1"/>
+      <w:numFmt w:val="bullet"/>
+      <w:lvlText w:val=""/>
+      <w:lvlJc w:val="left"/>
+      <w:pPr>
+        <w:tabs>
+          <w:tab w:val="num" w:pos="4320"/>
+        </w:tabs>
+        <w:ind w:left="4320" w:hanging="360"/>
+      </w:pPr>
+      <w:rPr>
+        <w:rFonts w:ascii="Wingdings" w:hAnsi="Wingdings" w:hint="default"/>
+        <w:sz w:val="20"/>
+      </w:rPr>
+    </w:lvl>
+    <w:lvl w:ilvl="6" w:tentative="1">
+      <w:start w:val="1"/>
+      <w:numFmt w:val="bullet"/>
+      <w:lvlText w:val=""/>
+      <w:lvlJc w:val="left"/>
+      <w:pPr>
+        <w:tabs>
+          <w:tab w:val="num" w:pos="5040"/>
+        </w:tabs>
+        <w:ind w:left="5040" w:hanging="360"/>
+      </w:pPr>
+      <w:rPr>
+        <w:rFonts w:ascii="Wingdings" w:hAnsi="Wingdings" w:hint="default"/>
+        <w:sz w:val="20"/>
+      </w:rPr>
+    </w:lvl>
+    <w:lvl w:ilvl="7" w:tentative="1">
+      <w:start w:val="1"/>
+      <w:numFmt w:val="bullet"/>
+      <w:lvlText w:val=""/>
+      <w:lvlJc w:val="left"/>
+      <w:pPr>
+        <w:tabs>
+          <w:tab w:val="num" w:pos="5760"/>
+        </w:tabs>
+        <w:ind w:left="5760" w:hanging="360"/>
+      </w:pPr>
+      <w:rPr>
+        <w:rFonts w:ascii="Wingdings" w:hAnsi="Wingdings" w:hint="default"/>
+        <w:sz w:val="20"/>
+      </w:rPr>
+    </w:lvl>
+    <w:lvl w:ilvl="8" w:tentative="1">
+      <w:start w:val="1"/>
+      <w:numFmt w:val="bullet"/>
+      <w:lvlText w:val=""/>
+      <w:lvlJc w:val="left"/>
+      <w:pPr>
+        <w:tabs>
+          <w:tab w:val="num" w:pos="6480"/>
+        </w:tabs>
+        <w:ind w:left="6480" w:hanging="360"/>
+      </w:pPr>
+      <w:rPr>
+        <w:rFonts w:ascii="Wingdings" w:hAnsi="Wingdings" w:hint="default"/>
+        <w:sz w:val="20"/>
+      </w:rPr>
+    </w:lvl>
+  </w:abstractNum>
+  <w:abstractNum w:abstractNumId="4" w15:restartNumberingAfterBreak="0">
     <w:nsid w:val="349E478D"/>
     <w:multiLevelType w:val="multilevel"/>
     <w:tmpl w:val="743CA8A8"/>
@@ -4163,7 +7353,7 @@
       </w:rPr>
     </w:lvl>
   </w:abstractNum>
-  <w:abstractNum w:abstractNumId="3" w15:restartNumberingAfterBreak="0">
+  <w:abstractNum w:abstractNumId="5" w15:restartNumberingAfterBreak="0">
     <w:nsid w:val="5C432E82"/>
     <w:multiLevelType w:val="multilevel"/>
     <w:tmpl w:val="0452FA4E"/>
@@ -4299,17 +7489,175 @@
       </w:rPr>
     </w:lvl>
   </w:abstractNum>
+  <w:abstractNum w:abstractNumId="6" w15:restartNumberingAfterBreak="0">
+    <w:nsid w:val="763D4D94"/>
+    <w:multiLevelType w:val="multilevel"/>
+    <w:tmpl w:val="EDE4F2AE"/>
+    <w:lvl w:ilvl="0">
+      <w:start w:val="1"/>
+      <w:numFmt w:val="bullet"/>
+      <w:lvlText w:val=""/>
+      <w:lvlJc w:val="left"/>
+      <w:pPr>
+        <w:tabs>
+          <w:tab w:val="num" w:pos="720"/>
+        </w:tabs>
+        <w:ind w:left="720" w:hanging="360"/>
+      </w:pPr>
+      <w:rPr>
+        <w:rFonts w:ascii="Symbol" w:hAnsi="Symbol" w:hint="default"/>
+        <w:sz w:val="20"/>
+      </w:rPr>
+    </w:lvl>
+    <w:lvl w:ilvl="1">
+      <w:start w:val="1"/>
+      <w:numFmt w:val="bullet"/>
+      <w:lvlText w:val="o"/>
+      <w:lvlJc w:val="left"/>
+      <w:pPr>
+        <w:tabs>
+          <w:tab w:val="num" w:pos="1440"/>
+        </w:tabs>
+        <w:ind w:left="1440" w:hanging="360"/>
+      </w:pPr>
+      <w:rPr>
+        <w:rFonts w:ascii="Courier New" w:hAnsi="Courier New" w:hint="default"/>
+        <w:sz w:val="20"/>
+      </w:rPr>
+    </w:lvl>
+    <w:lvl w:ilvl="2" w:tentative="1">
+      <w:start w:val="1"/>
+      <w:numFmt w:val="bullet"/>
+      <w:lvlText w:val=""/>
+      <w:lvlJc w:val="left"/>
+      <w:pPr>
+        <w:tabs>
+          <w:tab w:val="num" w:pos="2160"/>
+        </w:tabs>
+        <w:ind w:left="2160" w:hanging="360"/>
+      </w:pPr>
+      <w:rPr>
+        <w:rFonts w:ascii="Wingdings" w:hAnsi="Wingdings" w:hint="default"/>
+        <w:sz w:val="20"/>
+      </w:rPr>
+    </w:lvl>
+    <w:lvl w:ilvl="3" w:tentative="1">
+      <w:start w:val="1"/>
+      <w:numFmt w:val="bullet"/>
+      <w:lvlText w:val=""/>
+      <w:lvlJc w:val="left"/>
+      <w:pPr>
+        <w:tabs>
+          <w:tab w:val="num" w:pos="2880"/>
+        </w:tabs>
+        <w:ind w:left="2880" w:hanging="360"/>
+      </w:pPr>
+      <w:rPr>
+        <w:rFonts w:ascii="Wingdings" w:hAnsi="Wingdings" w:hint="default"/>
+        <w:sz w:val="20"/>
+      </w:rPr>
+    </w:lvl>
+    <w:lvl w:ilvl="4" w:tentative="1">
+      <w:start w:val="1"/>
+      <w:numFmt w:val="bullet"/>
+      <w:lvlText w:val=""/>
+      <w:lvlJc w:val="left"/>
+      <w:pPr>
+        <w:tabs>
+          <w:tab w:val="num" w:pos="3600"/>
+        </w:tabs>
+        <w:ind w:left="3600" w:hanging="360"/>
+      </w:pPr>
+      <w:rPr>
+        <w:rFonts w:ascii="Wingdings" w:hAnsi="Wingdings" w:hint="default"/>
+        <w:sz w:val="20"/>
+      </w:rPr>
+    </w:lvl>
+    <w:lvl w:ilvl="5" w:tentative="1">
+      <w:start w:val="1"/>
+      <w:numFmt w:val="bullet"/>
+      <w:lvlText w:val=""/>
+      <w:lvlJc w:val="left"/>
+      <w:pPr>
+        <w:tabs>
+          <w:tab w:val="num" w:pos="4320"/>
+        </w:tabs>
+        <w:ind w:left="4320" w:hanging="360"/>
+      </w:pPr>
+      <w:rPr>
+        <w:rFonts w:ascii="Wingdings" w:hAnsi="Wingdings" w:hint="default"/>
+        <w:sz w:val="20"/>
+      </w:rPr>
+    </w:lvl>
+    <w:lvl w:ilvl="6" w:tentative="1">
+      <w:start w:val="1"/>
+      <w:numFmt w:val="bullet"/>
+      <w:lvlText w:val=""/>
+      <w:lvlJc w:val="left"/>
+      <w:pPr>
+        <w:tabs>
+          <w:tab w:val="num" w:pos="5040"/>
+        </w:tabs>
+        <w:ind w:left="5040" w:hanging="360"/>
+      </w:pPr>
+      <w:rPr>
+        <w:rFonts w:ascii="Wingdings" w:hAnsi="Wingdings" w:hint="default"/>
+        <w:sz w:val="20"/>
+      </w:rPr>
+    </w:lvl>
+    <w:lvl w:ilvl="7" w:tentative="1">
+      <w:start w:val="1"/>
+      <w:numFmt w:val="bullet"/>
+      <w:lvlText w:val=""/>
+      <w:lvlJc w:val="left"/>
+      <w:pPr>
+        <w:tabs>
+          <w:tab w:val="num" w:pos="5760"/>
+        </w:tabs>
+        <w:ind w:left="5760" w:hanging="360"/>
+      </w:pPr>
+      <w:rPr>
+        <w:rFonts w:ascii="Wingdings" w:hAnsi="Wingdings" w:hint="default"/>
+        <w:sz w:val="20"/>
+      </w:rPr>
+    </w:lvl>
+    <w:lvl w:ilvl="8" w:tentative="1">
+      <w:start w:val="1"/>
+      <w:numFmt w:val="bullet"/>
+      <w:lvlText w:val=""/>
+      <w:lvlJc w:val="left"/>
+      <w:pPr>
+        <w:tabs>
+          <w:tab w:val="num" w:pos="6480"/>
+        </w:tabs>
+        <w:ind w:left="6480" w:hanging="360"/>
+      </w:pPr>
+      <w:rPr>
+        <w:rFonts w:ascii="Wingdings" w:hAnsi="Wingdings" w:hint="default"/>
+        <w:sz w:val="20"/>
+      </w:rPr>
+    </w:lvl>
+  </w:abstractNum>
   <w:num w:numId="1" w16cid:durableId="101652956">
+    <w:abstractNumId w:val="5"/>
+  </w:num>
+  <w:num w:numId="2" w16cid:durableId="1787457803">
+    <w:abstractNumId w:val="4"/>
+  </w:num>
+  <w:num w:numId="3" w16cid:durableId="1779719838">
+    <w:abstractNumId w:val="1"/>
+  </w:num>
+  <w:num w:numId="4" w16cid:durableId="1259371647">
+    <w:abstractNumId w:val="2"/>
+  </w:num>
+  <w:num w:numId="5" w16cid:durableId="1385104282">
+    <w:abstractNumId w:val="0"/>
+  </w:num>
+  <w:num w:numId="6" w16cid:durableId="509564944">
     <w:abstractNumId w:val="3"/>
   </w:num>
-  <w:num w:numId="2" w16cid:durableId="1787457803">
-    <w:abstractNumId w:val="2"/>
-  </w:num>
-  <w:num w:numId="3" w16cid:durableId="1779719838">
-    <w:abstractNumId w:val="0"/>
-  </w:num>
-  <w:num w:numId="4" w16cid:durableId="1259371647">
-    <w:abstractNumId w:val="1"/>
+  <w:num w:numId="7" w16cid:durableId="1160343432">
+    <w:abstractNumId w:val="6"/>
   </w:num>
   <w:numIdMacAtCleanup w:val="2"/>
 </w:numbering>
@@ -4924,7 +8272,6 @@
   <w:style w:type="character" w:default="1" w:styleId="Fuentedeprrafopredeter">
     <w:name w:val="Default Paragraph Font"/>
     <w:uiPriority w:val="1"/>
-    <w:semiHidden/>
     <w:unhideWhenUsed/>
   </w:style>
   <w:style w:type="table" w:default="1" w:styleId="Tablanormal">
@@ -5605,6 +8952,20 @@
     <w:pitch w:val="variable"/>
     <w:sig w:usb0="20000287" w:usb1="00000003" w:usb2="00000000" w:usb3="00000000" w:csb0="0000019F" w:csb1="00000000"/>
   </w:font>
+  <w:font w:name="Cambria Math">
+    <w:panose1 w:val="02040503050406030204"/>
+    <w:charset w:val="00"/>
+    <w:family w:val="roman"/>
+    <w:pitch w:val="variable"/>
+    <w:sig w:usb0="E00006FF" w:usb1="420024FF" w:usb2="02000000" w:usb3="00000000" w:csb0="0000019F" w:csb1="00000000"/>
+  </w:font>
+  <w:font w:name="Arial">
+    <w:panose1 w:val="020B0604020202020204"/>
+    <w:charset w:val="00"/>
+    <w:family w:val="swiss"/>
+    <w:pitch w:val="variable"/>
+    <w:sig w:usb0="E0002EFF" w:usb1="C000785B" w:usb2="00000009" w:usb3="00000000" w:csb0="000001FF" w:csb1="00000000"/>
+  </w:font>
 </w:fonts>
 </file>
 
@@ -5632,8 +8993,10 @@
     <w:rsid w:val="0017688F"/>
     <w:rsid w:val="001D6187"/>
     <w:rsid w:val="001D6B70"/>
+    <w:rsid w:val="001E14F3"/>
     <w:rsid w:val="00204CD8"/>
     <w:rsid w:val="002071F7"/>
+    <w:rsid w:val="00242EDE"/>
     <w:rsid w:val="002B058C"/>
     <w:rsid w:val="002B452E"/>
     <w:rsid w:val="002E5D55"/>
@@ -6667,26 +10030,6 @@
 </file>
 
 <file path=customXml/item3.xml><?xml version="1.0" encoding="utf-8"?>
-<p:properties xmlns:p="http://schemas.microsoft.com/office/2006/metadata/properties" xmlns:xsi="http://www.w3.org/2001/XMLSchema-instance" xmlns:pc="http://schemas.microsoft.com/office/infopath/2007/PartnerControls">
-  <documentManagement>
-    <TaxCatchAll xmlns="6bb79d28-80c9-4192-b874-25d85d9db259" xsi:nil="true"/>
-    <lcf76f155ced4ddcb4097134ff3c332f xmlns="5d10a710-9273-40be-99b8-c91e98a6b38c">
-      <Terms xmlns="http://schemas.microsoft.com/office/infopath/2007/PartnerControls"/>
-    </lcf76f155ced4ddcb4097134ff3c332f>
-  </documentManagement>
-</p:properties>
-</file>
-
-<file path=customXml/item4.xml><?xml version="1.0" encoding="utf-8"?>
-<?mso-contentType ?>
-<FormTemplates xmlns="http://schemas.microsoft.com/sharepoint/v3/contenttype/forms">
-  <Display>DocumentLibraryForm</Display>
-  <Edit>DocumentLibraryForm</Edit>
-  <New>DocumentLibraryForm</New>
-</FormTemplates>
-</file>
-
-<file path=customXml/item5.xml><?xml version="1.0" encoding="utf-8"?>
 <b:Sources xmlns:b="http://schemas.openxmlformats.org/officeDocument/2006/bibliography" xmlns="http://schemas.openxmlformats.org/officeDocument/2006/bibliography" SelectedStyle="\APASixthEditionOfficeOnline.xsl" StyleName="APA" Version="6">
   <b:Source>
     <b:Tag>Gar11</b:Tag>
@@ -6710,6 +10053,26 @@
     <b:RefOrder>1</b:RefOrder>
   </b:Source>
 </b:Sources>
+</file>
+
+<file path=customXml/item4.xml><?xml version="1.0" encoding="utf-8"?>
+<?mso-contentType ?>
+<FormTemplates xmlns="http://schemas.microsoft.com/sharepoint/v3/contenttype/forms">
+  <Display>DocumentLibraryForm</Display>
+  <Edit>DocumentLibraryForm</Edit>
+  <New>DocumentLibraryForm</New>
+</FormTemplates>
+</file>
+
+<file path=customXml/item5.xml><?xml version="1.0" encoding="utf-8"?>
+<p:properties xmlns:p="http://schemas.microsoft.com/office/2006/metadata/properties" xmlns:xsi="http://www.w3.org/2001/XMLSchema-instance" xmlns:pc="http://schemas.microsoft.com/office/infopath/2007/PartnerControls">
+  <documentManagement>
+    <TaxCatchAll xmlns="6bb79d28-80c9-4192-b874-25d85d9db259" xsi:nil="true"/>
+    <lcf76f155ced4ddcb4097134ff3c332f xmlns="5d10a710-9273-40be-99b8-c91e98a6b38c">
+      <Terms xmlns="http://schemas.microsoft.com/office/infopath/2007/PartnerControls"/>
+    </lcf76f155ced4ddcb4097134ff3c332f>
+  </documentManagement>
+</p:properties>
 </file>
 
 <file path=customXml/itemProps1.xml><?xml version="1.0" encoding="utf-8"?>
@@ -6740,12 +10103,9 @@
 </file>
 
 <file path=customXml/itemProps3.xml><?xml version="1.0" encoding="utf-8"?>
-<ds:datastoreItem xmlns:ds="http://schemas.openxmlformats.org/officeDocument/2006/customXml" ds:itemID="{AB8F5AAA-29E2-4D7C-B8A0-61ECB9B4C4C2}">
+<ds:datastoreItem xmlns:ds="http://schemas.openxmlformats.org/officeDocument/2006/customXml" ds:itemID="{FDA3A5A7-2A64-4348-81DC-C2276460CCE6}">
   <ds:schemaRefs>
-    <ds:schemaRef ds:uri="http://schemas.microsoft.com/office/2006/metadata/properties"/>
-    <ds:schemaRef ds:uri="http://schemas.microsoft.com/office/infopath/2007/PartnerControls"/>
-    <ds:schemaRef ds:uri="6bb79d28-80c9-4192-b874-25d85d9db259"/>
-    <ds:schemaRef ds:uri="5d10a710-9273-40be-99b8-c91e98a6b38c"/>
+    <ds:schemaRef ds:uri="http://schemas.openxmlformats.org/officeDocument/2006/bibliography"/>
   </ds:schemaRefs>
 </ds:datastoreItem>
 </file>
@@ -6759,9 +10119,12 @@
 </file>
 
 <file path=customXml/itemProps5.xml><?xml version="1.0" encoding="utf-8"?>
-<ds:datastoreItem xmlns:ds="http://schemas.openxmlformats.org/officeDocument/2006/customXml" ds:itemID="{FDA3A5A7-2A64-4348-81DC-C2276460CCE6}">
+<ds:datastoreItem xmlns:ds="http://schemas.openxmlformats.org/officeDocument/2006/customXml" ds:itemID="{AB8F5AAA-29E2-4D7C-B8A0-61ECB9B4C4C2}">
   <ds:schemaRefs>
-    <ds:schemaRef ds:uri="http://schemas.openxmlformats.org/officeDocument/2006/bibliography"/>
+    <ds:schemaRef ds:uri="http://schemas.microsoft.com/office/2006/metadata/properties"/>
+    <ds:schemaRef ds:uri="http://schemas.microsoft.com/office/infopath/2007/PartnerControls"/>
+    <ds:schemaRef ds:uri="6bb79d28-80c9-4192-b874-25d85d9db259"/>
+    <ds:schemaRef ds:uri="5d10a710-9273-40be-99b8-c91e98a6b38c"/>
   </ds:schemaRefs>
 </ds:datastoreItem>
 </file>
</xml_diff>